<commit_message>
Subjects, Enrollments és ScheduleEntries táblák dokumentálva
</commit_message>
<xml_diff>
--- a/FeladatRadar_Reszletes_Funkcio_Leiras.docx
+++ b/FeladatRadar_Reszletes_Funkcio_Leiras.docx
@@ -10,7 +10,7 @@
           <w:rFonts w:cstheme="minorHAnsi"/>
         </w:rPr>
       </w:pPr>
-      <w:bookmarkStart w:id="0" w:name="_Toc223686757"/>
+      <w:bookmarkStart w:id="0" w:name="_Toc223805760"/>
       <w:r>
         <w:rPr>
           <w:rFonts w:cstheme="minorHAnsi"/>
@@ -86,7 +86,7 @@
             </w:rPr>
             <w:fldChar w:fldCharType="separate"/>
           </w:r>
-          <w:hyperlink w:anchor="_Toc223686757" w:history="1">
+          <w:hyperlink w:anchor="_Toc223805760" w:history="1">
             <w:r>
               <w:rPr>
                 <w:rStyle w:val="Hyperlink"/>
@@ -114,7 +114,7 @@
                 <w:noProof/>
                 <w:webHidden/>
               </w:rPr>
-              <w:instrText xml:space="preserve"> PAGEREF _Toc223686757 \h </w:instrText>
+              <w:instrText xml:space="preserve"> PAGEREF _Toc223805760 \h </w:instrText>
             </w:r>
             <w:r>
               <w:rPr>
@@ -157,7 +157,7 @@
               <w:lang w:val="en-US"/>
             </w:rPr>
           </w:pPr>
-          <w:hyperlink w:anchor="_Toc223686758" w:history="1">
+          <w:hyperlink w:anchor="_Toc223805761" w:history="1">
             <w:r>
               <w:rPr>
                 <w:rStyle w:val="Hyperlink"/>
@@ -185,7 +185,7 @@
                 <w:noProof/>
                 <w:webHidden/>
               </w:rPr>
-              <w:instrText xml:space="preserve"> PAGEREF _Toc223686758 \h </w:instrText>
+              <w:instrText xml:space="preserve"> PAGEREF _Toc223805761 \h </w:instrText>
             </w:r>
             <w:r>
               <w:rPr>
@@ -228,7 +228,7 @@
               <w:lang w:val="en-US"/>
             </w:rPr>
           </w:pPr>
-          <w:hyperlink w:anchor="_Toc223686759" w:history="1">
+          <w:hyperlink w:anchor="_Toc223805762" w:history="1">
             <w:r>
               <w:rPr>
                 <w:rStyle w:val="Hyperlink"/>
@@ -255,7 +255,7 @@
                 <w:noProof/>
                 <w:webHidden/>
               </w:rPr>
-              <w:instrText xml:space="preserve"> PAGEREF _Toc223686759 \h </w:instrText>
+              <w:instrText xml:space="preserve"> PAGEREF _Toc223805762 \h </w:instrText>
             </w:r>
             <w:r>
               <w:rPr>
@@ -298,7 +298,7 @@
               <w:lang w:val="en-US"/>
             </w:rPr>
           </w:pPr>
-          <w:hyperlink w:anchor="_Toc223686760" w:history="1">
+          <w:hyperlink w:anchor="_Toc223805763" w:history="1">
             <w:r>
               <w:rPr>
                 <w:rStyle w:val="Hyperlink"/>
@@ -325,7 +325,7 @@
                 <w:noProof/>
                 <w:webHidden/>
               </w:rPr>
-              <w:instrText xml:space="preserve"> PAGEREF _Toc223686760 \h </w:instrText>
+              <w:instrText xml:space="preserve"> PAGEREF _Toc223805763 \h </w:instrText>
             </w:r>
             <w:r>
               <w:rPr>
@@ -368,7 +368,7 @@
               <w:lang w:val="en-US"/>
             </w:rPr>
           </w:pPr>
-          <w:hyperlink w:anchor="_Toc223686761" w:history="1">
+          <w:hyperlink w:anchor="_Toc223805764" w:history="1">
             <w:r>
               <w:rPr>
                 <w:rStyle w:val="Hyperlink"/>
@@ -395,7 +395,7 @@
                 <w:noProof/>
                 <w:webHidden/>
               </w:rPr>
-              <w:instrText xml:space="preserve"> PAGEREF _Toc223686761 \h </w:instrText>
+              <w:instrText xml:space="preserve"> PAGEREF _Toc223805764 \h </w:instrText>
             </w:r>
             <w:r>
               <w:rPr>
@@ -438,7 +438,7 @@
               <w:lang w:val="en-US"/>
             </w:rPr>
           </w:pPr>
-          <w:hyperlink w:anchor="_Toc223686762" w:history="1">
+          <w:hyperlink w:anchor="_Toc223805765" w:history="1">
             <w:r>
               <w:rPr>
                 <w:rStyle w:val="Hyperlink"/>
@@ -465,7 +465,7 @@
                 <w:noProof/>
                 <w:webHidden/>
               </w:rPr>
-              <w:instrText xml:space="preserve"> PAGEREF _Toc223686762 \h </w:instrText>
+              <w:instrText xml:space="preserve"> PAGEREF _Toc223805765 \h </w:instrText>
             </w:r>
             <w:r>
               <w:rPr>
@@ -508,7 +508,7 @@
               <w:lang w:val="en-US"/>
             </w:rPr>
           </w:pPr>
-          <w:hyperlink w:anchor="_Toc223686763" w:history="1">
+          <w:hyperlink w:anchor="_Toc223805766" w:history="1">
             <w:r>
               <w:rPr>
                 <w:rStyle w:val="Hyperlink"/>
@@ -535,7 +535,7 @@
                 <w:noProof/>
                 <w:webHidden/>
               </w:rPr>
-              <w:instrText xml:space="preserve"> PAGEREF _Toc223686763 \h </w:instrText>
+              <w:instrText xml:space="preserve"> PAGEREF _Toc223805766 \h </w:instrText>
             </w:r>
             <w:r>
               <w:rPr>
@@ -578,7 +578,7 @@
               <w:lang w:val="en-US"/>
             </w:rPr>
           </w:pPr>
-          <w:hyperlink w:anchor="_Toc223686764" w:history="1">
+          <w:hyperlink w:anchor="_Toc223805767" w:history="1">
             <w:r>
               <w:rPr>
                 <w:rStyle w:val="Hyperlink"/>
@@ -605,7 +605,7 @@
                 <w:noProof/>
                 <w:webHidden/>
               </w:rPr>
-              <w:instrText xml:space="preserve"> PAGEREF _Toc223686764 \h </w:instrText>
+              <w:instrText xml:space="preserve"> PAGEREF _Toc223805767 \h </w:instrText>
             </w:r>
             <w:r>
               <w:rPr>
@@ -648,7 +648,7 @@
               <w:lang w:val="en-US"/>
             </w:rPr>
           </w:pPr>
-          <w:hyperlink w:anchor="_Toc223686765" w:history="1">
+          <w:hyperlink w:anchor="_Toc223805768" w:history="1">
             <w:r>
               <w:rPr>
                 <w:rStyle w:val="Hyperlink"/>
@@ -675,7 +675,7 @@
                 <w:noProof/>
                 <w:webHidden/>
               </w:rPr>
-              <w:instrText xml:space="preserve"> PAGEREF _Toc223686765 \h </w:instrText>
+              <w:instrText xml:space="preserve"> PAGEREF _Toc223805768 \h </w:instrText>
             </w:r>
             <w:r>
               <w:rPr>
@@ -718,7 +718,7 @@
               <w:lang w:val="en-US"/>
             </w:rPr>
           </w:pPr>
-          <w:hyperlink w:anchor="_Toc223686766" w:history="1">
+          <w:hyperlink w:anchor="_Toc223805769" w:history="1">
             <w:r>
               <w:rPr>
                 <w:rStyle w:val="Hyperlink"/>
@@ -745,7 +745,7 @@
                 <w:noProof/>
                 <w:webHidden/>
               </w:rPr>
-              <w:instrText xml:space="preserve"> PAGEREF _Toc223686766 \h </w:instrText>
+              <w:instrText xml:space="preserve"> PAGEREF _Toc223805769 \h </w:instrText>
             </w:r>
             <w:r>
               <w:rPr>
@@ -788,7 +788,7 @@
               <w:lang w:val="en-US"/>
             </w:rPr>
           </w:pPr>
-          <w:hyperlink w:anchor="_Toc223686767" w:history="1">
+          <w:hyperlink w:anchor="_Toc223805770" w:history="1">
             <w:r>
               <w:rPr>
                 <w:rStyle w:val="Hyperlink"/>
@@ -815,7 +815,7 @@
                 <w:noProof/>
                 <w:webHidden/>
               </w:rPr>
-              <w:instrText xml:space="preserve"> PAGEREF _Toc223686767 \h </w:instrText>
+              <w:instrText xml:space="preserve"> PAGEREF _Toc223805770 \h </w:instrText>
             </w:r>
             <w:r>
               <w:rPr>
@@ -858,7 +858,7 @@
               <w:lang w:val="en-US"/>
             </w:rPr>
           </w:pPr>
-          <w:hyperlink w:anchor="_Toc223686768" w:history="1">
+          <w:hyperlink w:anchor="_Toc223805771" w:history="1">
             <w:r>
               <w:rPr>
                 <w:rStyle w:val="Hyperlink"/>
@@ -887,7 +887,7 @@
                 <w:noProof/>
                 <w:webHidden/>
               </w:rPr>
-              <w:instrText xml:space="preserve"> PAGEREF _Toc223686768 \h </w:instrText>
+              <w:instrText xml:space="preserve"> PAGEREF _Toc223805771 \h </w:instrText>
             </w:r>
             <w:r>
               <w:rPr>
@@ -930,7 +930,7 @@
               <w:lang w:val="en-US"/>
             </w:rPr>
           </w:pPr>
-          <w:hyperlink w:anchor="_Toc223686769" w:history="1">
+          <w:hyperlink w:anchor="_Toc223805772" w:history="1">
             <w:r>
               <w:rPr>
                 <w:rStyle w:val="Hyperlink"/>
@@ -957,7 +957,7 @@
                 <w:noProof/>
                 <w:webHidden/>
               </w:rPr>
-              <w:instrText xml:space="preserve"> PAGEREF _Toc223686769 \h </w:instrText>
+              <w:instrText xml:space="preserve"> PAGEREF _Toc223805772 \h </w:instrText>
             </w:r>
             <w:r>
               <w:rPr>
@@ -1000,7 +1000,7 @@
               <w:lang w:val="en-US"/>
             </w:rPr>
           </w:pPr>
-          <w:hyperlink w:anchor="_Toc223686770" w:history="1">
+          <w:hyperlink w:anchor="_Toc223805773" w:history="1">
             <w:r>
               <w:rPr>
                 <w:rStyle w:val="Hyperlink"/>
@@ -1027,7 +1027,7 @@
                 <w:noProof/>
                 <w:webHidden/>
               </w:rPr>
-              <w:instrText xml:space="preserve"> PAGEREF _Toc223686770 \h </w:instrText>
+              <w:instrText xml:space="preserve"> PAGEREF _Toc223805773 \h </w:instrText>
             </w:r>
             <w:r>
               <w:rPr>
@@ -1070,7 +1070,7 @@
               <w:lang w:val="en-US"/>
             </w:rPr>
           </w:pPr>
-          <w:hyperlink w:anchor="_Toc223686771" w:history="1">
+          <w:hyperlink w:anchor="_Toc223805774" w:history="1">
             <w:r>
               <w:rPr>
                 <w:rStyle w:val="Hyperlink"/>
@@ -1097,7 +1097,7 @@
                 <w:noProof/>
                 <w:webHidden/>
               </w:rPr>
-              <w:instrText xml:space="preserve"> PAGEREF _Toc223686771 \h </w:instrText>
+              <w:instrText xml:space="preserve"> PAGEREF _Toc223805774 \h </w:instrText>
             </w:r>
             <w:r>
               <w:rPr>
@@ -1140,7 +1140,7 @@
               <w:lang w:val="en-US"/>
             </w:rPr>
           </w:pPr>
-          <w:hyperlink w:anchor="_Toc223686772" w:history="1">
+          <w:hyperlink w:anchor="_Toc223805775" w:history="1">
             <w:r>
               <w:rPr>
                 <w:rStyle w:val="Hyperlink"/>
@@ -1167,7 +1167,7 @@
                 <w:noProof/>
                 <w:webHidden/>
               </w:rPr>
-              <w:instrText xml:space="preserve"> PAGEREF _Toc223686772 \h </w:instrText>
+              <w:instrText xml:space="preserve"> PAGEREF _Toc223805775 \h </w:instrText>
             </w:r>
             <w:r>
               <w:rPr>
@@ -1188,6 +1188,358 @@
                 <w:webHidden/>
               </w:rPr>
               <w:t>5</w:t>
+            </w:r>
+            <w:r>
+              <w:rPr>
+                <w:noProof/>
+                <w:webHidden/>
+              </w:rPr>
+              <w:fldChar w:fldCharType="end"/>
+            </w:r>
+          </w:hyperlink>
+        </w:p>
+        <w:p>
+          <w:pPr>
+            <w:pStyle w:val="TOC2"/>
+            <w:tabs>
+              <w:tab w:val="right" w:leader="dot" w:pos="9062"/>
+            </w:tabs>
+            <w:rPr>
+              <w:rFonts w:eastAsiaTheme="minorEastAsia"/>
+              <w:noProof/>
+              <w:lang w:val="en-US"/>
+            </w:rPr>
+          </w:pPr>
+          <w:hyperlink w:anchor="_Toc223805776" w:history="1">
+            <w:r>
+              <w:rPr>
+                <w:rStyle w:val="Hyperlink"/>
+                <w:rFonts w:eastAsia="Arial"/>
+                <w:noProof/>
+              </w:rPr>
+              <w:t>2.5 Adatbázis</w:t>
+            </w:r>
+            <w:r>
+              <w:rPr>
+                <w:noProof/>
+                <w:webHidden/>
+              </w:rPr>
+              <w:tab/>
+            </w:r>
+            <w:r>
+              <w:rPr>
+                <w:noProof/>
+                <w:webHidden/>
+              </w:rPr>
+              <w:fldChar w:fldCharType="begin"/>
+            </w:r>
+            <w:r>
+              <w:rPr>
+                <w:noProof/>
+                <w:webHidden/>
+              </w:rPr>
+              <w:instrText xml:space="preserve"> PAGEREF _Toc223805776 \h </w:instrText>
+            </w:r>
+            <w:r>
+              <w:rPr>
+                <w:noProof/>
+                <w:webHidden/>
+              </w:rPr>
+            </w:r>
+            <w:r>
+              <w:rPr>
+                <w:noProof/>
+                <w:webHidden/>
+              </w:rPr>
+              <w:fldChar w:fldCharType="separate"/>
+            </w:r>
+            <w:r>
+              <w:rPr>
+                <w:noProof/>
+                <w:webHidden/>
+              </w:rPr>
+              <w:t>5</w:t>
+            </w:r>
+            <w:r>
+              <w:rPr>
+                <w:noProof/>
+                <w:webHidden/>
+              </w:rPr>
+              <w:fldChar w:fldCharType="end"/>
+            </w:r>
+          </w:hyperlink>
+        </w:p>
+        <w:p>
+          <w:pPr>
+            <w:pStyle w:val="TOC3"/>
+            <w:tabs>
+              <w:tab w:val="right" w:leader="dot" w:pos="9062"/>
+            </w:tabs>
+            <w:rPr>
+              <w:rFonts w:eastAsiaTheme="minorEastAsia"/>
+              <w:noProof/>
+              <w:lang w:val="en-US"/>
+            </w:rPr>
+          </w:pPr>
+          <w:hyperlink w:anchor="_Toc223805777" w:history="1">
+            <w:r>
+              <w:rPr>
+                <w:rStyle w:val="Hyperlink"/>
+                <w:rFonts w:eastAsia="Arial"/>
+                <w:noProof/>
+              </w:rPr>
+              <w:t>2.5.1 Users tábla (Felhasználók)</w:t>
+            </w:r>
+            <w:r>
+              <w:rPr>
+                <w:noProof/>
+                <w:webHidden/>
+              </w:rPr>
+              <w:tab/>
+            </w:r>
+            <w:r>
+              <w:rPr>
+                <w:noProof/>
+                <w:webHidden/>
+              </w:rPr>
+              <w:fldChar w:fldCharType="begin"/>
+            </w:r>
+            <w:r>
+              <w:rPr>
+                <w:noProof/>
+                <w:webHidden/>
+              </w:rPr>
+              <w:instrText xml:space="preserve"> PAGEREF _Toc223805777 \h </w:instrText>
+            </w:r>
+            <w:r>
+              <w:rPr>
+                <w:noProof/>
+                <w:webHidden/>
+              </w:rPr>
+            </w:r>
+            <w:r>
+              <w:rPr>
+                <w:noProof/>
+                <w:webHidden/>
+              </w:rPr>
+              <w:fldChar w:fldCharType="separate"/>
+            </w:r>
+            <w:r>
+              <w:rPr>
+                <w:noProof/>
+                <w:webHidden/>
+              </w:rPr>
+              <w:t>6</w:t>
+            </w:r>
+            <w:r>
+              <w:rPr>
+                <w:noProof/>
+                <w:webHidden/>
+              </w:rPr>
+              <w:fldChar w:fldCharType="end"/>
+            </w:r>
+          </w:hyperlink>
+        </w:p>
+        <w:p>
+          <w:pPr>
+            <w:pStyle w:val="TOC3"/>
+            <w:tabs>
+              <w:tab w:val="right" w:leader="dot" w:pos="9062"/>
+            </w:tabs>
+            <w:rPr>
+              <w:rFonts w:eastAsiaTheme="minorEastAsia"/>
+              <w:noProof/>
+              <w:lang w:val="en-US"/>
+            </w:rPr>
+          </w:pPr>
+          <w:hyperlink w:anchor="_Toc223805778" w:history="1">
+            <w:r>
+              <w:rPr>
+                <w:rStyle w:val="Hyperlink"/>
+                <w:noProof/>
+              </w:rPr>
+              <w:t>2.5.2 Enrollments tábla (Beiratkozások)</w:t>
+            </w:r>
+            <w:r>
+              <w:rPr>
+                <w:noProof/>
+                <w:webHidden/>
+              </w:rPr>
+              <w:tab/>
+            </w:r>
+            <w:r>
+              <w:rPr>
+                <w:noProof/>
+                <w:webHidden/>
+              </w:rPr>
+              <w:fldChar w:fldCharType="begin"/>
+            </w:r>
+            <w:r>
+              <w:rPr>
+                <w:noProof/>
+                <w:webHidden/>
+              </w:rPr>
+              <w:instrText xml:space="preserve"> PAGEREF _Toc223805778 \h </w:instrText>
+            </w:r>
+            <w:r>
+              <w:rPr>
+                <w:noProof/>
+                <w:webHidden/>
+              </w:rPr>
+            </w:r>
+            <w:r>
+              <w:rPr>
+                <w:noProof/>
+                <w:webHidden/>
+              </w:rPr>
+              <w:fldChar w:fldCharType="separate"/>
+            </w:r>
+            <w:r>
+              <w:rPr>
+                <w:noProof/>
+                <w:webHidden/>
+              </w:rPr>
+              <w:t>6</w:t>
+            </w:r>
+            <w:r>
+              <w:rPr>
+                <w:noProof/>
+                <w:webHidden/>
+              </w:rPr>
+              <w:fldChar w:fldCharType="end"/>
+            </w:r>
+          </w:hyperlink>
+        </w:p>
+        <w:p>
+          <w:pPr>
+            <w:pStyle w:val="TOC3"/>
+            <w:tabs>
+              <w:tab w:val="right" w:leader="dot" w:pos="9062"/>
+            </w:tabs>
+            <w:rPr>
+              <w:rFonts w:eastAsiaTheme="minorEastAsia"/>
+              <w:noProof/>
+              <w:lang w:val="en-US"/>
+            </w:rPr>
+          </w:pPr>
+          <w:hyperlink w:anchor="_Toc223805779" w:history="1">
+            <w:r>
+              <w:rPr>
+                <w:rStyle w:val="Hyperlink"/>
+                <w:noProof/>
+              </w:rPr>
+              <w:t>2.5.3 Subjects tábla (Tantárgyak)</w:t>
+            </w:r>
+            <w:r>
+              <w:rPr>
+                <w:noProof/>
+                <w:webHidden/>
+              </w:rPr>
+              <w:tab/>
+            </w:r>
+            <w:r>
+              <w:rPr>
+                <w:noProof/>
+                <w:webHidden/>
+              </w:rPr>
+              <w:fldChar w:fldCharType="begin"/>
+            </w:r>
+            <w:r>
+              <w:rPr>
+                <w:noProof/>
+                <w:webHidden/>
+              </w:rPr>
+              <w:instrText xml:space="preserve"> PAGEREF _Toc223805779 \h </w:instrText>
+            </w:r>
+            <w:r>
+              <w:rPr>
+                <w:noProof/>
+                <w:webHidden/>
+              </w:rPr>
+            </w:r>
+            <w:r>
+              <w:rPr>
+                <w:noProof/>
+                <w:webHidden/>
+              </w:rPr>
+              <w:fldChar w:fldCharType="separate"/>
+            </w:r>
+            <w:r>
+              <w:rPr>
+                <w:noProof/>
+                <w:webHidden/>
+              </w:rPr>
+              <w:t>7</w:t>
+            </w:r>
+            <w:r>
+              <w:rPr>
+                <w:noProof/>
+                <w:webHidden/>
+              </w:rPr>
+              <w:fldChar w:fldCharType="end"/>
+            </w:r>
+          </w:hyperlink>
+        </w:p>
+        <w:p>
+          <w:pPr>
+            <w:pStyle w:val="TOC3"/>
+            <w:tabs>
+              <w:tab w:val="right" w:leader="dot" w:pos="9062"/>
+            </w:tabs>
+            <w:rPr>
+              <w:rFonts w:eastAsiaTheme="minorEastAsia"/>
+              <w:noProof/>
+              <w:lang w:val="en-US"/>
+            </w:rPr>
+          </w:pPr>
+          <w:hyperlink w:anchor="_Toc223805780" w:history="1">
+            <w:r>
+              <w:rPr>
+                <w:rStyle w:val="Hyperlink"/>
+                <w:noProof/>
+              </w:rPr>
+              <w:t>2.5.4 ScheduleEntries tábla (Órarend)</w:t>
+            </w:r>
+            <w:r>
+              <w:rPr>
+                <w:noProof/>
+                <w:webHidden/>
+              </w:rPr>
+              <w:tab/>
+            </w:r>
+            <w:r>
+              <w:rPr>
+                <w:noProof/>
+                <w:webHidden/>
+              </w:rPr>
+              <w:fldChar w:fldCharType="begin"/>
+            </w:r>
+            <w:r>
+              <w:rPr>
+                <w:noProof/>
+                <w:webHidden/>
+              </w:rPr>
+              <w:instrText xml:space="preserve"> PAGEREF _Toc223805780 \h </w:instrText>
+            </w:r>
+            <w:r>
+              <w:rPr>
+                <w:noProof/>
+                <w:webHidden/>
+              </w:rPr>
+            </w:r>
+            <w:r>
+              <w:rPr>
+                <w:noProof/>
+                <w:webHidden/>
+              </w:rPr>
+              <w:fldChar w:fldCharType="separate"/>
+            </w:r>
+            <w:r>
+              <w:rPr>
+                <w:noProof/>
+                <w:webHidden/>
+              </w:rPr>
+              <w:t>7</w:t>
             </w:r>
             <w:r>
               <w:rPr>
@@ -1238,7 +1590,7 @@
           <w:rFonts w:cstheme="minorHAnsi"/>
         </w:rPr>
       </w:pPr>
-      <w:bookmarkStart w:id="1" w:name="_Toc223686758"/>
+      <w:bookmarkStart w:id="1" w:name="_Toc223805761"/>
       <w:r>
         <w:rPr>
           <w:rFonts w:cstheme="minorHAnsi"/>
@@ -1258,7 +1610,7 @@
           <w:rFonts w:asciiTheme="minorHAnsi" w:hAnsiTheme="minorHAnsi"/>
         </w:rPr>
       </w:pPr>
-      <w:bookmarkStart w:id="2" w:name="_Toc223686759"/>
+      <w:bookmarkStart w:id="2" w:name="_Toc223805762"/>
       <w:r>
         <w:rPr>
           <w:rStyle w:val="Heading2Char"/>
@@ -1314,7 +1666,7 @@
         <w:pStyle w:val="Heading2"/>
         <w:jc w:val="both"/>
       </w:pPr>
-      <w:bookmarkStart w:id="3" w:name="_Toc223686760"/>
+      <w:bookmarkStart w:id="3" w:name="_Toc223805763"/>
       <w:r>
         <w:rPr>
           <w:rStyle w:val="Strong"/>
@@ -1400,7 +1752,7 @@
         <w:pStyle w:val="Heading2"/>
         <w:jc w:val="both"/>
       </w:pPr>
-      <w:bookmarkStart w:id="4" w:name="_Toc223686761"/>
+      <w:bookmarkStart w:id="4" w:name="_Toc223805764"/>
       <w:r>
         <w:rPr>
           <w:rStyle w:val="Strong"/>
@@ -1434,7 +1786,7 @@
           <w:rFonts w:cstheme="minorHAnsi"/>
         </w:rPr>
       </w:pPr>
-      <w:bookmarkStart w:id="5" w:name="_Toc223686762"/>
+      <w:bookmarkStart w:id="5" w:name="_Toc223805765"/>
       <w:r>
         <w:rPr>
           <w:rStyle w:val="Heading2Char"/>
@@ -1465,7 +1817,7 @@
         <w:pStyle w:val="Heading3"/>
         <w:jc w:val="both"/>
       </w:pPr>
-      <w:bookmarkStart w:id="6" w:name="_Toc223686763"/>
+      <w:bookmarkStart w:id="6" w:name="_Toc223805766"/>
       <w:r>
         <w:t>1.4.1 Tarcsányi Csongor Márk feladatai</w:t>
       </w:r>
@@ -1609,7 +1961,7 @@
         <w:pStyle w:val="Heading3"/>
         <w:jc w:val="both"/>
       </w:pPr>
-      <w:bookmarkStart w:id="7" w:name="_Toc223686764"/>
+      <w:bookmarkStart w:id="7" w:name="_Toc223805767"/>
       <w:r>
         <w:t>1.4.2 Lőrincz Antal feladatai</w:t>
       </w:r>
@@ -1684,7 +2036,7 @@
         <w:pStyle w:val="Heading3"/>
         <w:jc w:val="both"/>
       </w:pPr>
-      <w:bookmarkStart w:id="8" w:name="_Toc223686765"/>
+      <w:bookmarkStart w:id="8" w:name="_Toc223805768"/>
       <w:r>
         <w:lastRenderedPageBreak/>
         <w:t>1.4.3 Le Tuan Anh (Róbert) feladatai</w:t>
@@ -1790,7 +2142,7 @@
         <w:pStyle w:val="Heading3"/>
         <w:jc w:val="both"/>
       </w:pPr>
-      <w:bookmarkStart w:id="9" w:name="_Toc223686766"/>
+      <w:bookmarkStart w:id="9" w:name="_Toc223805769"/>
       <w:r>
         <w:t>1.4.4 Közös fejlesztések</w:t>
       </w:r>
@@ -1866,7 +2218,7 @@
         <w:pStyle w:val="Heading2"/>
         <w:jc w:val="both"/>
       </w:pPr>
-      <w:bookmarkStart w:id="10" w:name="_Toc223686767"/>
+      <w:bookmarkStart w:id="10" w:name="_Toc223805770"/>
       <w:r>
         <w:t>1.5 Szükséges adatok a megvalósításhoz</w:t>
       </w:r>
@@ -2005,7 +2357,7 @@
         </w:rPr>
       </w:pPr>
       <w:bookmarkStart w:id="11" w:name="_Toc223536920"/>
-      <w:bookmarkStart w:id="12" w:name="_Toc223686768"/>
+      <w:bookmarkStart w:id="12" w:name="_Toc223805771"/>
       <w:r>
         <w:rPr>
           <w:rFonts w:cstheme="minorHAnsi"/>
@@ -2023,7 +2375,7 @@
         <w:jc w:val="both"/>
       </w:pPr>
       <w:bookmarkStart w:id="13" w:name="_Toc223536921"/>
-      <w:bookmarkStart w:id="14" w:name="_Toc223686769"/>
+      <w:bookmarkStart w:id="14" w:name="_Toc223805772"/>
       <w:r>
         <w:t>2.1 Alkalmazás áttekintés</w:t>
       </w:r>
@@ -2071,7 +2423,7 @@
         <w:jc w:val="both"/>
       </w:pPr>
       <w:bookmarkStart w:id="15" w:name="_Toc223536922"/>
-      <w:bookmarkStart w:id="16" w:name="_Toc223686770"/>
+      <w:bookmarkStart w:id="16" w:name="_Toc223805773"/>
       <w:r>
         <w:t>2.2 Felhasznált szoftverek</w:t>
       </w:r>
@@ -2318,7 +2670,7 @@
         <w:jc w:val="both"/>
       </w:pPr>
       <w:bookmarkStart w:id="17" w:name="_Toc223536923"/>
-      <w:bookmarkStart w:id="18" w:name="_Toc223686771"/>
+      <w:bookmarkStart w:id="18" w:name="_Toc223805774"/>
       <w:r>
         <w:t>2.3 Github</w:t>
       </w:r>
@@ -2349,7 +2701,7 @@
         <w:jc w:val="both"/>
       </w:pPr>
       <w:bookmarkStart w:id="19" w:name="_Toc223536924"/>
-      <w:bookmarkStart w:id="20" w:name="_Toc223686772"/>
+      <w:bookmarkStart w:id="20" w:name="_Toc223805775"/>
       <w:r>
         <w:t>2.4 Fő funkciók</w:t>
       </w:r>
@@ -2517,6 +2869,7 @@
         </w:rPr>
       </w:pPr>
       <w:bookmarkStart w:id="21" w:name="_Toc223536925"/>
+      <w:bookmarkStart w:id="22" w:name="_Toc223805776"/>
       <w:r>
         <w:rPr>
           <w:rFonts w:eastAsia="Arial"/>
@@ -2524,6 +2877,7 @@
         <w:t>2.5 Adatbázis</w:t>
       </w:r>
       <w:bookmarkEnd w:id="21"/>
+      <w:bookmarkEnd w:id="22"/>
     </w:p>
     <w:p>
       <w:pPr>
@@ -2552,7 +2906,8 @@
           <w:rFonts w:eastAsia="Arial"/>
         </w:rPr>
       </w:pPr>
-      <w:bookmarkStart w:id="22" w:name="_Toc223536926"/>
+      <w:bookmarkStart w:id="23" w:name="_Toc223536926"/>
+      <w:bookmarkStart w:id="24" w:name="_Toc223805777"/>
       <w:r>
         <w:rPr>
           <w:rFonts w:eastAsia="Arial"/>
@@ -2560,7 +2915,8 @@
         <w:lastRenderedPageBreak/>
         <w:t>2.5.1 Users tábla (Felhasználók)</w:t>
       </w:r>
-      <w:bookmarkEnd w:id="22"/>
+      <w:bookmarkEnd w:id="23"/>
+      <w:bookmarkEnd w:id="24"/>
     </w:p>
     <w:p>
       <w:pPr>
@@ -3467,6 +3823,1830 @@
           <w:szCs w:val="24"/>
         </w:rPr>
         <w:t>A UserId kapta az elsődleges kulcsot, ez alapján azonosítható legkönnyebben egy felhasználó. Az érték automatikusan növekszik. A Role mező határozza meg, hogy a felhasználó diák vagy tanár. A jelszó BCrypt hashelt formában tárolódik. Az IsActive mező 0 értéke bannolt fiókot jelöl, amellyel nem lehet bejelentkezni.</w:t>
+      </w:r>
+    </w:p>
+    <w:p>
+      <w:pPr>
+        <w:spacing w:before="80" w:after="80"/>
+        <w:jc w:val="both"/>
+        <w:rPr>
+          <w:sz w:val="24"/>
+          <w:szCs w:val="24"/>
+        </w:rPr>
+      </w:pPr>
+    </w:p>
+    <w:p>
+      <w:pPr>
+        <w:pStyle w:val="Heading3"/>
+      </w:pPr>
+      <w:bookmarkStart w:id="25" w:name="_Toc223805778"/>
+      <w:r>
+        <w:t>2.5.2 Enrollments tábla (Beiratkozások)</w:t>
+      </w:r>
+      <w:bookmarkEnd w:id="25"/>
+    </w:p>
+    <w:p>
+      <w:pPr>
+        <w:spacing w:before="80" w:after="80"/>
+        <w:jc w:val="both"/>
+      </w:pPr>
+      <w:r>
+        <w:rPr>
+          <w:sz w:val="24"/>
+          <w:szCs w:val="24"/>
+        </w:rPr>
+        <w:t>Ebben a táblában tároljuk, hogy melyik diák melyik tantárgyra iratkozott be. Az EnrollmentStatus mező mutatja a beiratkozás aktuális állapotát.</w:t>
+      </w:r>
+    </w:p>
+    <w:tbl>
+      <w:tblPr>
+        <w:tblW w:w="9026" w:type="dxa"/>
+        <w:tblBorders>
+          <w:top w:val="single" w:sz="4" w:space="0" w:color="auto"/>
+          <w:left w:val="single" w:sz="4" w:space="0" w:color="auto"/>
+          <w:bottom w:val="single" w:sz="4" w:space="0" w:color="auto"/>
+          <w:right w:val="single" w:sz="4" w:space="0" w:color="auto"/>
+          <w:insideH w:val="single" w:sz="4" w:space="0" w:color="auto"/>
+          <w:insideV w:val="single" w:sz="4" w:space="0" w:color="auto"/>
+        </w:tblBorders>
+        <w:tblLook w:val="04A0" w:firstRow="1" w:lastRow="0" w:firstColumn="1" w:lastColumn="0" w:noHBand="0" w:noVBand="1"/>
+      </w:tblPr>
+      <w:tblGrid>
+        <w:gridCol w:w="3009"/>
+        <w:gridCol w:w="3009"/>
+        <w:gridCol w:w="3008"/>
+      </w:tblGrid>
+      <w:tr>
+        <w:tc>
+          <w:tcPr>
+            <w:tcW w:w="3009" w:type="dxa"/>
+            <w:shd w:val="clear" w:color="auto" w:fill="2563EB"/>
+          </w:tcPr>
+          <w:p>
+            <w:r>
+              <w:rPr>
+                <w:b/>
+                <w:color w:val="FFFFFF"/>
+                <w:sz w:val="20"/>
+                <w:szCs w:val="20"/>
+              </w:rPr>
+              <w:t>Oszlop neve</w:t>
+            </w:r>
+          </w:p>
+        </w:tc>
+        <w:tc>
+          <w:tcPr>
+            <w:tcW w:w="3009" w:type="dxa"/>
+            <w:shd w:val="clear" w:color="auto" w:fill="2563EB"/>
+          </w:tcPr>
+          <w:p>
+            <w:r>
+              <w:rPr>
+                <w:b/>
+                <w:color w:val="FFFFFF"/>
+                <w:sz w:val="20"/>
+                <w:szCs w:val="20"/>
+              </w:rPr>
+              <w:t>Típusa</w:t>
+            </w:r>
+          </w:p>
+        </w:tc>
+        <w:tc>
+          <w:tcPr>
+            <w:tcW w:w="3008" w:type="dxa"/>
+            <w:shd w:val="clear" w:color="auto" w:fill="2563EB"/>
+          </w:tcPr>
+          <w:p>
+            <w:r>
+              <w:rPr>
+                <w:b/>
+                <w:color w:val="FFFFFF"/>
+                <w:sz w:val="20"/>
+                <w:szCs w:val="20"/>
+              </w:rPr>
+              <w:t>Leírás</w:t>
+            </w:r>
+          </w:p>
+        </w:tc>
+      </w:tr>
+      <w:tr>
+        <w:tc>
+          <w:tcPr>
+            <w:tcW w:w="3009" w:type="dxa"/>
+          </w:tcPr>
+          <w:p>
+            <w:r>
+              <w:rPr>
+                <w:sz w:val="20"/>
+                <w:szCs w:val="20"/>
+              </w:rPr>
+              <w:t>EnrollmentID (PK)</w:t>
+            </w:r>
+          </w:p>
+        </w:tc>
+        <w:tc>
+          <w:tcPr>
+            <w:tcW w:w="3009" w:type="dxa"/>
+          </w:tcPr>
+          <w:p>
+            <w:r>
+              <w:rPr>
+                <w:sz w:val="20"/>
+                <w:szCs w:val="20"/>
+              </w:rPr>
+              <w:t>int (auto-increment)</w:t>
+            </w:r>
+          </w:p>
+        </w:tc>
+        <w:tc>
+          <w:tcPr>
+            <w:tcW w:w="3008" w:type="dxa"/>
+          </w:tcPr>
+          <w:p>
+            <w:r>
+              <w:rPr>
+                <w:sz w:val="20"/>
+                <w:szCs w:val="20"/>
+              </w:rPr>
+              <w:t>Elsődleges kulcs</w:t>
+            </w:r>
+          </w:p>
+        </w:tc>
+      </w:tr>
+      <w:tr>
+        <w:tc>
+          <w:tcPr>
+            <w:tcW w:w="3009" w:type="dxa"/>
+          </w:tcPr>
+          <w:p>
+            <w:r>
+              <w:rPr>
+                <w:sz w:val="20"/>
+                <w:szCs w:val="20"/>
+              </w:rPr>
+              <w:t>StudentID (FK)</w:t>
+            </w:r>
+          </w:p>
+        </w:tc>
+        <w:tc>
+          <w:tcPr>
+            <w:tcW w:w="3009" w:type="dxa"/>
+          </w:tcPr>
+          <w:p>
+            <w:r>
+              <w:rPr>
+                <w:sz w:val="20"/>
+                <w:szCs w:val="20"/>
+              </w:rPr>
+              <w:t>int</w:t>
+            </w:r>
+          </w:p>
+        </w:tc>
+        <w:tc>
+          <w:tcPr>
+            <w:tcW w:w="3008" w:type="dxa"/>
+          </w:tcPr>
+          <w:p>
+            <w:r>
+              <w:rPr>
+                <w:sz w:val="20"/>
+                <w:szCs w:val="20"/>
+              </w:rPr>
+              <w:t>Idégen kulcs a Users táblára</w:t>
+            </w:r>
+          </w:p>
+        </w:tc>
+      </w:tr>
+      <w:tr>
+        <w:tc>
+          <w:tcPr>
+            <w:tcW w:w="3009" w:type="dxa"/>
+          </w:tcPr>
+          <w:p>
+            <w:r>
+              <w:rPr>
+                <w:sz w:val="20"/>
+                <w:szCs w:val="20"/>
+              </w:rPr>
+              <w:t>SubjectID (FK)</w:t>
+            </w:r>
+          </w:p>
+        </w:tc>
+        <w:tc>
+          <w:tcPr>
+            <w:tcW w:w="3009" w:type="dxa"/>
+          </w:tcPr>
+          <w:p>
+            <w:r>
+              <w:rPr>
+                <w:sz w:val="20"/>
+                <w:szCs w:val="20"/>
+              </w:rPr>
+              <w:t>int</w:t>
+            </w:r>
+          </w:p>
+        </w:tc>
+        <w:tc>
+          <w:tcPr>
+            <w:tcW w:w="3008" w:type="dxa"/>
+          </w:tcPr>
+          <w:p>
+            <w:r>
+              <w:rPr>
+                <w:sz w:val="20"/>
+                <w:szCs w:val="20"/>
+              </w:rPr>
+              <w:t>Idégen kulcs a Subjects táblára</w:t>
+            </w:r>
+          </w:p>
+        </w:tc>
+      </w:tr>
+      <w:tr>
+        <w:tc>
+          <w:tcPr>
+            <w:tcW w:w="3009" w:type="dxa"/>
+          </w:tcPr>
+          <w:p>
+            <w:r>
+              <w:rPr>
+                <w:sz w:val="20"/>
+                <w:szCs w:val="20"/>
+              </w:rPr>
+              <w:t>EnrolledAt</w:t>
+            </w:r>
+          </w:p>
+        </w:tc>
+        <w:tc>
+          <w:tcPr>
+            <w:tcW w:w="3009" w:type="dxa"/>
+          </w:tcPr>
+          <w:p>
+            <w:r>
+              <w:rPr>
+                <w:sz w:val="20"/>
+                <w:szCs w:val="20"/>
+              </w:rPr>
+              <w:t>datetime</w:t>
+            </w:r>
+          </w:p>
+        </w:tc>
+        <w:tc>
+          <w:tcPr>
+            <w:tcW w:w="3008" w:type="dxa"/>
+          </w:tcPr>
+          <w:p>
+            <w:r>
+              <w:rPr>
+                <w:sz w:val="20"/>
+                <w:szCs w:val="20"/>
+              </w:rPr>
+              <w:t>Beiratkozás időpontja</w:t>
+            </w:r>
+          </w:p>
+        </w:tc>
+      </w:tr>
+      <w:tr>
+        <w:tc>
+          <w:tcPr>
+            <w:tcW w:w="3009" w:type="dxa"/>
+          </w:tcPr>
+          <w:p>
+            <w:r>
+              <w:rPr>
+                <w:sz w:val="20"/>
+                <w:szCs w:val="20"/>
+              </w:rPr>
+              <w:t>EnrollmentStatus</w:t>
+            </w:r>
+          </w:p>
+        </w:tc>
+        <w:tc>
+          <w:tcPr>
+            <w:tcW w:w="3009" w:type="dxa"/>
+          </w:tcPr>
+          <w:p>
+            <w:r>
+              <w:rPr>
+                <w:sz w:val="20"/>
+                <w:szCs w:val="20"/>
+              </w:rPr>
+              <w:t>nvarchar(20)</w:t>
+            </w:r>
+          </w:p>
+        </w:tc>
+        <w:tc>
+          <w:tcPr>
+            <w:tcW w:w="3008" w:type="dxa"/>
+          </w:tcPr>
+          <w:p>
+            <w:r>
+              <w:rPr>
+                <w:sz w:val="20"/>
+                <w:szCs w:val="20"/>
+              </w:rPr>
+              <w:t>Aktív / Leiratkozott</w:t>
+            </w:r>
+          </w:p>
+        </w:tc>
+      </w:tr>
+    </w:tbl>
+    <w:p>
+      <w:pPr>
+        <w:spacing w:before="80" w:after="80"/>
+        <w:jc w:val="both"/>
+      </w:pPr>
+      <w:r>
+        <w:rPr>
+          <w:sz w:val="24"/>
+          <w:szCs w:val="24"/>
+        </w:rPr>
+        <w:t>Az EnrollmentID az elsődleges kulcs. A StudentID és SubjectID idegen kulcsok kötik össze a Users és Subjects táblákkal. Az EnrollmentStatus mező jelzi, hogy a diák jelenleg akt</w:t>
+      </w:r>
+      <w:r>
+        <w:rPr>
+          <w:sz w:val="24"/>
+          <w:szCs w:val="24"/>
+        </w:rPr>
+        <w:t>í</w:t>
+      </w:r>
+      <w:r>
+        <w:rPr>
+          <w:sz w:val="24"/>
+          <w:szCs w:val="24"/>
+        </w:rPr>
+        <w:tab/>
+      </w:r>
+      <w:r>
+        <w:rPr>
+          <w:sz w:val="24"/>
+          <w:szCs w:val="24"/>
+        </w:rPr>
+        <w:t>van beiratkozott-e, vagy lem</w:t>
+      </w:r>
+      <w:r>
+        <w:rPr>
+          <w:sz w:val="24"/>
+          <w:szCs w:val="24"/>
+        </w:rPr>
+        <w:t>o</w:t>
+      </w:r>
+      <w:r>
+        <w:rPr>
+          <w:sz w:val="24"/>
+          <w:szCs w:val="24"/>
+        </w:rPr>
+        <w:t>ndta a tantárgyat.</w:t>
+      </w:r>
+    </w:p>
+    <w:p>
+      <w:pPr>
+        <w:pStyle w:val="Heading3"/>
+      </w:pPr>
+      <w:bookmarkStart w:id="26" w:name="_Toc223805779"/>
+      <w:r>
+        <w:lastRenderedPageBreak/>
+        <w:t>2.5.3 Subjects tábla (Tantárgyak)</w:t>
+      </w:r>
+      <w:bookmarkEnd w:id="26"/>
+    </w:p>
+    <w:p>
+      <w:pPr>
+        <w:spacing w:before="80" w:after="80"/>
+        <w:jc w:val="both"/>
+      </w:pPr>
+      <w:r>
+        <w:rPr>
+          <w:sz w:val="24"/>
+          <w:szCs w:val="24"/>
+        </w:rPr>
+        <w:t>Ebben a táblában tároljuk az összes tantárgyat, amelyeket a diákok felvehetnek. Minden tantárgyhoz tartozik egy tanár, aki felelős az órákért, valamint meghatározott maximális létszám és kreditpont szám.</w:t>
+      </w:r>
+    </w:p>
+    <w:tbl>
+      <w:tblPr>
+        <w:tblW w:w="9026" w:type="dxa"/>
+        <w:tblBorders>
+          <w:top w:val="single" w:sz="4" w:space="0" w:color="auto"/>
+          <w:left w:val="single" w:sz="4" w:space="0" w:color="auto"/>
+          <w:bottom w:val="single" w:sz="4" w:space="0" w:color="auto"/>
+          <w:right w:val="single" w:sz="4" w:space="0" w:color="auto"/>
+          <w:insideH w:val="single" w:sz="4" w:space="0" w:color="auto"/>
+          <w:insideV w:val="single" w:sz="4" w:space="0" w:color="auto"/>
+        </w:tblBorders>
+        <w:tblLook w:val="04A0" w:firstRow="1" w:lastRow="0" w:firstColumn="1" w:lastColumn="0" w:noHBand="0" w:noVBand="1"/>
+      </w:tblPr>
+      <w:tblGrid>
+        <w:gridCol w:w="3009"/>
+        <w:gridCol w:w="3009"/>
+        <w:gridCol w:w="3008"/>
+      </w:tblGrid>
+      <w:tr>
+        <w:tc>
+          <w:tcPr>
+            <w:tcW w:w="3009" w:type="dxa"/>
+            <w:shd w:val="clear" w:color="auto" w:fill="2563EB"/>
+          </w:tcPr>
+          <w:p>
+            <w:pPr>
+              <w:jc w:val="both"/>
+            </w:pPr>
+            <w:r>
+              <w:rPr>
+                <w:b/>
+                <w:color w:val="FFFFFF"/>
+                <w:sz w:val="20"/>
+                <w:szCs w:val="20"/>
+              </w:rPr>
+              <w:t>Oszlop neve</w:t>
+            </w:r>
+          </w:p>
+        </w:tc>
+        <w:tc>
+          <w:tcPr>
+            <w:tcW w:w="3009" w:type="dxa"/>
+            <w:shd w:val="clear" w:color="auto" w:fill="2563EB"/>
+          </w:tcPr>
+          <w:p>
+            <w:pPr>
+              <w:jc w:val="both"/>
+            </w:pPr>
+            <w:r>
+              <w:rPr>
+                <w:b/>
+                <w:color w:val="FFFFFF"/>
+                <w:sz w:val="20"/>
+                <w:szCs w:val="20"/>
+              </w:rPr>
+              <w:t>Típusa</w:t>
+            </w:r>
+          </w:p>
+        </w:tc>
+        <w:tc>
+          <w:tcPr>
+            <w:tcW w:w="3008" w:type="dxa"/>
+            <w:shd w:val="clear" w:color="auto" w:fill="2563EB"/>
+          </w:tcPr>
+          <w:p>
+            <w:pPr>
+              <w:jc w:val="both"/>
+            </w:pPr>
+            <w:r>
+              <w:rPr>
+                <w:b/>
+                <w:color w:val="FFFFFF"/>
+                <w:sz w:val="20"/>
+                <w:szCs w:val="20"/>
+              </w:rPr>
+              <w:t>Leírás</w:t>
+            </w:r>
+          </w:p>
+        </w:tc>
+      </w:tr>
+      <w:tr>
+        <w:tc>
+          <w:tcPr>
+            <w:tcW w:w="3009" w:type="dxa"/>
+          </w:tcPr>
+          <w:p>
+            <w:pPr>
+              <w:jc w:val="both"/>
+            </w:pPr>
+            <w:r>
+              <w:rPr>
+                <w:sz w:val="20"/>
+                <w:szCs w:val="20"/>
+              </w:rPr>
+              <w:t>SubjectID (PK)</w:t>
+            </w:r>
+          </w:p>
+        </w:tc>
+        <w:tc>
+          <w:tcPr>
+            <w:tcW w:w="3009" w:type="dxa"/>
+          </w:tcPr>
+          <w:p>
+            <w:pPr>
+              <w:jc w:val="both"/>
+            </w:pPr>
+            <w:r>
+              <w:rPr>
+                <w:sz w:val="20"/>
+                <w:szCs w:val="20"/>
+              </w:rPr>
+              <w:t>int (auto-increment)</w:t>
+            </w:r>
+          </w:p>
+        </w:tc>
+        <w:tc>
+          <w:tcPr>
+            <w:tcW w:w="3008" w:type="dxa"/>
+          </w:tcPr>
+          <w:p>
+            <w:pPr>
+              <w:jc w:val="both"/>
+            </w:pPr>
+            <w:r>
+              <w:rPr>
+                <w:sz w:val="20"/>
+                <w:szCs w:val="20"/>
+              </w:rPr>
+              <w:t>Elsődleges kulcs</w:t>
+            </w:r>
+          </w:p>
+        </w:tc>
+      </w:tr>
+      <w:tr>
+        <w:tc>
+          <w:tcPr>
+            <w:tcW w:w="3009" w:type="dxa"/>
+          </w:tcPr>
+          <w:p>
+            <w:pPr>
+              <w:jc w:val="both"/>
+            </w:pPr>
+            <w:r>
+              <w:rPr>
+                <w:sz w:val="20"/>
+                <w:szCs w:val="20"/>
+              </w:rPr>
+              <w:t>SubjectCode</w:t>
+            </w:r>
+          </w:p>
+        </w:tc>
+        <w:tc>
+          <w:tcPr>
+            <w:tcW w:w="3009" w:type="dxa"/>
+          </w:tcPr>
+          <w:p>
+            <w:pPr>
+              <w:jc w:val="both"/>
+            </w:pPr>
+            <w:r>
+              <w:rPr>
+                <w:sz w:val="20"/>
+                <w:szCs w:val="20"/>
+              </w:rPr>
+              <w:t>nvarchar(20)</w:t>
+            </w:r>
+          </w:p>
+        </w:tc>
+        <w:tc>
+          <w:tcPr>
+            <w:tcW w:w="3008" w:type="dxa"/>
+          </w:tcPr>
+          <w:p>
+            <w:pPr>
+              <w:jc w:val="both"/>
+            </w:pPr>
+            <w:r>
+              <w:rPr>
+                <w:sz w:val="20"/>
+                <w:szCs w:val="20"/>
+              </w:rPr>
+              <w:t>Tantárgy kódja (pl. MAT101)</w:t>
+            </w:r>
+          </w:p>
+        </w:tc>
+      </w:tr>
+      <w:tr>
+        <w:tc>
+          <w:tcPr>
+            <w:tcW w:w="3009" w:type="dxa"/>
+          </w:tcPr>
+          <w:p>
+            <w:pPr>
+              <w:jc w:val="both"/>
+            </w:pPr>
+            <w:r>
+              <w:rPr>
+                <w:sz w:val="20"/>
+                <w:szCs w:val="20"/>
+              </w:rPr>
+              <w:t>SubjectName</w:t>
+            </w:r>
+          </w:p>
+        </w:tc>
+        <w:tc>
+          <w:tcPr>
+            <w:tcW w:w="3009" w:type="dxa"/>
+          </w:tcPr>
+          <w:p>
+            <w:pPr>
+              <w:jc w:val="both"/>
+            </w:pPr>
+            <w:r>
+              <w:rPr>
+                <w:sz w:val="20"/>
+                <w:szCs w:val="20"/>
+              </w:rPr>
+              <w:t>nvarchar(100)</w:t>
+            </w:r>
+          </w:p>
+        </w:tc>
+        <w:tc>
+          <w:tcPr>
+            <w:tcW w:w="3008" w:type="dxa"/>
+          </w:tcPr>
+          <w:p>
+            <w:pPr>
+              <w:jc w:val="both"/>
+            </w:pPr>
+            <w:r>
+              <w:rPr>
+                <w:sz w:val="20"/>
+                <w:szCs w:val="20"/>
+              </w:rPr>
+              <w:t>Tantárgy neve</w:t>
+            </w:r>
+          </w:p>
+        </w:tc>
+      </w:tr>
+      <w:tr>
+        <w:tc>
+          <w:tcPr>
+            <w:tcW w:w="3009" w:type="dxa"/>
+          </w:tcPr>
+          <w:p>
+            <w:pPr>
+              <w:jc w:val="both"/>
+            </w:pPr>
+            <w:r>
+              <w:rPr>
+                <w:sz w:val="20"/>
+                <w:szCs w:val="20"/>
+              </w:rPr>
+              <w:t>Description</w:t>
+            </w:r>
+          </w:p>
+        </w:tc>
+        <w:tc>
+          <w:tcPr>
+            <w:tcW w:w="3009" w:type="dxa"/>
+          </w:tcPr>
+          <w:p>
+            <w:pPr>
+              <w:jc w:val="both"/>
+            </w:pPr>
+            <w:r>
+              <w:rPr>
+                <w:sz w:val="20"/>
+                <w:szCs w:val="20"/>
+              </w:rPr>
+              <w:t>nvarchar(500)</w:t>
+            </w:r>
+          </w:p>
+        </w:tc>
+        <w:tc>
+          <w:tcPr>
+            <w:tcW w:w="3008" w:type="dxa"/>
+          </w:tcPr>
+          <w:p>
+            <w:pPr>
+              <w:jc w:val="both"/>
+            </w:pPr>
+            <w:r>
+              <w:rPr>
+                <w:sz w:val="20"/>
+                <w:szCs w:val="20"/>
+              </w:rPr>
+              <w:t>Rövid leírás</w:t>
+            </w:r>
+          </w:p>
+        </w:tc>
+      </w:tr>
+      <w:tr>
+        <w:tc>
+          <w:tcPr>
+            <w:tcW w:w="3009" w:type="dxa"/>
+          </w:tcPr>
+          <w:p>
+            <w:pPr>
+              <w:jc w:val="both"/>
+            </w:pPr>
+            <w:r>
+              <w:rPr>
+                <w:sz w:val="20"/>
+                <w:szCs w:val="20"/>
+              </w:rPr>
+              <w:t>Credits</w:t>
+            </w:r>
+          </w:p>
+        </w:tc>
+        <w:tc>
+          <w:tcPr>
+            <w:tcW w:w="3009" w:type="dxa"/>
+          </w:tcPr>
+          <w:p>
+            <w:pPr>
+              <w:jc w:val="both"/>
+            </w:pPr>
+            <w:r>
+              <w:rPr>
+                <w:sz w:val="20"/>
+                <w:szCs w:val="20"/>
+              </w:rPr>
+              <w:t>int</w:t>
+            </w:r>
+          </w:p>
+        </w:tc>
+        <w:tc>
+          <w:tcPr>
+            <w:tcW w:w="3008" w:type="dxa"/>
+          </w:tcPr>
+          <w:p>
+            <w:pPr>
+              <w:jc w:val="both"/>
+            </w:pPr>
+            <w:r>
+              <w:rPr>
+                <w:sz w:val="20"/>
+                <w:szCs w:val="20"/>
+              </w:rPr>
+              <w:t>Kreditpontok száma</w:t>
+            </w:r>
+          </w:p>
+        </w:tc>
+      </w:tr>
+      <w:tr>
+        <w:tc>
+          <w:tcPr>
+            <w:tcW w:w="3009" w:type="dxa"/>
+          </w:tcPr>
+          <w:p>
+            <w:pPr>
+              <w:jc w:val="both"/>
+            </w:pPr>
+            <w:r>
+              <w:rPr>
+                <w:sz w:val="20"/>
+                <w:szCs w:val="20"/>
+              </w:rPr>
+              <w:t>MaxStudents</w:t>
+            </w:r>
+          </w:p>
+        </w:tc>
+        <w:tc>
+          <w:tcPr>
+            <w:tcW w:w="3009" w:type="dxa"/>
+          </w:tcPr>
+          <w:p>
+            <w:pPr>
+              <w:jc w:val="both"/>
+            </w:pPr>
+            <w:r>
+              <w:rPr>
+                <w:sz w:val="20"/>
+                <w:szCs w:val="20"/>
+              </w:rPr>
+              <w:t>int</w:t>
+            </w:r>
+          </w:p>
+        </w:tc>
+        <w:tc>
+          <w:tcPr>
+            <w:tcW w:w="3008" w:type="dxa"/>
+          </w:tcPr>
+          <w:p>
+            <w:pPr>
+              <w:jc w:val="both"/>
+            </w:pPr>
+            <w:r>
+              <w:rPr>
+                <w:sz w:val="20"/>
+                <w:szCs w:val="20"/>
+              </w:rPr>
+              <w:t>Maximális diáklétszám</w:t>
+            </w:r>
+          </w:p>
+        </w:tc>
+      </w:tr>
+      <w:tr>
+        <w:tc>
+          <w:tcPr>
+            <w:tcW w:w="3009" w:type="dxa"/>
+          </w:tcPr>
+          <w:p>
+            <w:pPr>
+              <w:jc w:val="both"/>
+            </w:pPr>
+            <w:r>
+              <w:rPr>
+                <w:sz w:val="20"/>
+                <w:szCs w:val="20"/>
+              </w:rPr>
+              <w:t>TeacherID (FK)</w:t>
+            </w:r>
+          </w:p>
+        </w:tc>
+        <w:tc>
+          <w:tcPr>
+            <w:tcW w:w="3009" w:type="dxa"/>
+          </w:tcPr>
+          <w:p>
+            <w:pPr>
+              <w:jc w:val="both"/>
+            </w:pPr>
+            <w:r>
+              <w:rPr>
+                <w:sz w:val="20"/>
+                <w:szCs w:val="20"/>
+              </w:rPr>
+              <w:t>int</w:t>
+            </w:r>
+          </w:p>
+        </w:tc>
+        <w:tc>
+          <w:tcPr>
+            <w:tcW w:w="3008" w:type="dxa"/>
+          </w:tcPr>
+          <w:p>
+            <w:pPr>
+              <w:jc w:val="both"/>
+            </w:pPr>
+            <w:r>
+              <w:rPr>
+                <w:sz w:val="20"/>
+                <w:szCs w:val="20"/>
+              </w:rPr>
+              <w:t>Idégen kulcs a Users táblára</w:t>
+            </w:r>
+          </w:p>
+        </w:tc>
+      </w:tr>
+      <w:tr>
+        <w:tc>
+          <w:tcPr>
+            <w:tcW w:w="3009" w:type="dxa"/>
+          </w:tcPr>
+          <w:p>
+            <w:pPr>
+              <w:jc w:val="both"/>
+            </w:pPr>
+            <w:r>
+              <w:rPr>
+                <w:sz w:val="20"/>
+                <w:szCs w:val="20"/>
+              </w:rPr>
+              <w:t>Status</w:t>
+            </w:r>
+          </w:p>
+        </w:tc>
+        <w:tc>
+          <w:tcPr>
+            <w:tcW w:w="3009" w:type="dxa"/>
+          </w:tcPr>
+          <w:p>
+            <w:pPr>
+              <w:jc w:val="both"/>
+            </w:pPr>
+            <w:r>
+              <w:rPr>
+                <w:sz w:val="20"/>
+                <w:szCs w:val="20"/>
+              </w:rPr>
+              <w:t>nvarchar(20)</w:t>
+            </w:r>
+          </w:p>
+        </w:tc>
+        <w:tc>
+          <w:tcPr>
+            <w:tcW w:w="3008" w:type="dxa"/>
+          </w:tcPr>
+          <w:p>
+            <w:pPr>
+              <w:jc w:val="both"/>
+            </w:pPr>
+            <w:r>
+              <w:rPr>
+                <w:sz w:val="20"/>
+                <w:szCs w:val="20"/>
+              </w:rPr>
+              <w:t>Active / Inactive</w:t>
+            </w:r>
+          </w:p>
+        </w:tc>
+      </w:tr>
+    </w:tbl>
+    <w:p>
+      <w:pPr>
+        <w:spacing w:before="80" w:after="80"/>
+        <w:jc w:val="both"/>
+        <w:rPr>
+          <w:sz w:val="24"/>
+          <w:szCs w:val="24"/>
+        </w:rPr>
+      </w:pPr>
+      <w:r>
+        <w:rPr>
+          <w:sz w:val="24"/>
+          <w:szCs w:val="24"/>
+        </w:rPr>
+        <w:t>A SubjectID az elsődleges kulcs, amely egyedi azonosítót ad minden tantárgynak. A TeacherID idegen kulcsként kapcsolódik a Users táblához, ezáltal minden tantárgyhoz pontosan egy tanár tartozik. A MaxStudents mező határozza meg, hogy legfeljebb hány diák iratkozhat fel az adott tantárgyra. A Status mező segítségével az adminisztrátor aktiválhatja vagy deaktiválhatja a tantárgyat.</w:t>
+      </w:r>
+    </w:p>
+    <w:p>
+      <w:pPr>
+        <w:spacing w:before="80" w:after="80"/>
+        <w:jc w:val="both"/>
+      </w:pPr>
+    </w:p>
+    <w:p>
+      <w:pPr>
+        <w:pStyle w:val="Heading3"/>
+      </w:pPr>
+      <w:bookmarkStart w:id="27" w:name="_Toc223805780"/>
+      <w:r>
+        <w:t>2.5.4 ScheduleEntries tábla (Órarend)</w:t>
+      </w:r>
+      <w:bookmarkEnd w:id="27"/>
+    </w:p>
+    <w:p>
+      <w:pPr>
+        <w:spacing w:before="80" w:after="80"/>
+        <w:jc w:val="both"/>
+      </w:pPr>
+      <w:r>
+        <w:rPr>
+          <w:sz w:val="24"/>
+          <w:szCs w:val="24"/>
+        </w:rPr>
+        <w:t>Ebben a táblában tároljuk a diákok személyes órarendjeit. Minden bejegyzés egy diák és egy tantárgy közötti kapcsolatot reprezentál, kiegészítve az óra időpontjával, helyszínével és ismétlődési szablyaival.</w:t>
+      </w:r>
+    </w:p>
+    <w:tbl>
+      <w:tblPr>
+        <w:tblW w:w="9026" w:type="dxa"/>
+        <w:tblBorders>
+          <w:top w:val="single" w:sz="4" w:space="0" w:color="auto"/>
+          <w:left w:val="single" w:sz="4" w:space="0" w:color="auto"/>
+          <w:bottom w:val="single" w:sz="4" w:space="0" w:color="auto"/>
+          <w:right w:val="single" w:sz="4" w:space="0" w:color="auto"/>
+          <w:insideH w:val="single" w:sz="4" w:space="0" w:color="auto"/>
+          <w:insideV w:val="single" w:sz="4" w:space="0" w:color="auto"/>
+        </w:tblBorders>
+        <w:tblLook w:val="04A0" w:firstRow="1" w:lastRow="0" w:firstColumn="1" w:lastColumn="0" w:noHBand="0" w:noVBand="1"/>
+      </w:tblPr>
+      <w:tblGrid>
+        <w:gridCol w:w="3009"/>
+        <w:gridCol w:w="3009"/>
+        <w:gridCol w:w="3008"/>
+      </w:tblGrid>
+      <w:tr>
+        <w:tc>
+          <w:tcPr>
+            <w:tcW w:w="3009" w:type="dxa"/>
+            <w:tcBorders>
+              <w:top w:val="single" w:sz="4" w:space="0" w:color="auto"/>
+              <w:left w:val="single" w:sz="4" w:space="0" w:color="auto"/>
+              <w:bottom w:val="single" w:sz="4" w:space="0" w:color="auto"/>
+              <w:right w:val="single" w:sz="4" w:space="0" w:color="auto"/>
+            </w:tcBorders>
+            <w:shd w:val="clear" w:color="auto" w:fill="2563EB"/>
+            <w:hideMark/>
+          </w:tcPr>
+          <w:p>
+            <w:pPr>
+              <w:jc w:val="both"/>
+            </w:pPr>
+            <w:r>
+              <w:rPr>
+                <w:b/>
+                <w:color w:val="FFFFFF"/>
+                <w:sz w:val="20"/>
+                <w:szCs w:val="20"/>
+              </w:rPr>
+              <w:t>Oszlop neve</w:t>
+            </w:r>
+          </w:p>
+        </w:tc>
+        <w:tc>
+          <w:tcPr>
+            <w:tcW w:w="3009" w:type="dxa"/>
+            <w:tcBorders>
+              <w:top w:val="single" w:sz="4" w:space="0" w:color="auto"/>
+              <w:left w:val="single" w:sz="4" w:space="0" w:color="auto"/>
+              <w:bottom w:val="single" w:sz="4" w:space="0" w:color="auto"/>
+              <w:right w:val="single" w:sz="4" w:space="0" w:color="auto"/>
+            </w:tcBorders>
+            <w:shd w:val="clear" w:color="auto" w:fill="2563EB"/>
+            <w:hideMark/>
+          </w:tcPr>
+          <w:p>
+            <w:pPr>
+              <w:jc w:val="both"/>
+            </w:pPr>
+            <w:r>
+              <w:rPr>
+                <w:b/>
+                <w:color w:val="FFFFFF"/>
+                <w:sz w:val="20"/>
+                <w:szCs w:val="20"/>
+              </w:rPr>
+              <w:t>Típusa</w:t>
+            </w:r>
+          </w:p>
+        </w:tc>
+        <w:tc>
+          <w:tcPr>
+            <w:tcW w:w="3008" w:type="dxa"/>
+            <w:tcBorders>
+              <w:top w:val="single" w:sz="4" w:space="0" w:color="auto"/>
+              <w:left w:val="single" w:sz="4" w:space="0" w:color="auto"/>
+              <w:bottom w:val="single" w:sz="4" w:space="0" w:color="auto"/>
+              <w:right w:val="single" w:sz="4" w:space="0" w:color="auto"/>
+            </w:tcBorders>
+            <w:shd w:val="clear" w:color="auto" w:fill="2563EB"/>
+            <w:hideMark/>
+          </w:tcPr>
+          <w:p>
+            <w:pPr>
+              <w:jc w:val="both"/>
+            </w:pPr>
+            <w:r>
+              <w:rPr>
+                <w:b/>
+                <w:color w:val="FFFFFF"/>
+                <w:sz w:val="20"/>
+                <w:szCs w:val="20"/>
+              </w:rPr>
+              <w:t>Leírás</w:t>
+            </w:r>
+          </w:p>
+        </w:tc>
+      </w:tr>
+      <w:tr>
+        <w:tc>
+          <w:tcPr>
+            <w:tcW w:w="3009" w:type="dxa"/>
+            <w:tcBorders>
+              <w:top w:val="single" w:sz="4" w:space="0" w:color="auto"/>
+              <w:left w:val="single" w:sz="4" w:space="0" w:color="auto"/>
+              <w:bottom w:val="single" w:sz="4" w:space="0" w:color="auto"/>
+              <w:right w:val="single" w:sz="4" w:space="0" w:color="auto"/>
+            </w:tcBorders>
+            <w:hideMark/>
+          </w:tcPr>
+          <w:p>
+            <w:pPr>
+              <w:jc w:val="both"/>
+            </w:pPr>
+            <w:r>
+              <w:rPr>
+                <w:sz w:val="20"/>
+                <w:szCs w:val="20"/>
+              </w:rPr>
+              <w:t>EntryID (PK)</w:t>
+            </w:r>
+          </w:p>
+        </w:tc>
+        <w:tc>
+          <w:tcPr>
+            <w:tcW w:w="3009" w:type="dxa"/>
+            <w:tcBorders>
+              <w:top w:val="single" w:sz="4" w:space="0" w:color="auto"/>
+              <w:left w:val="single" w:sz="4" w:space="0" w:color="auto"/>
+              <w:bottom w:val="single" w:sz="4" w:space="0" w:color="auto"/>
+              <w:right w:val="single" w:sz="4" w:space="0" w:color="auto"/>
+            </w:tcBorders>
+            <w:hideMark/>
+          </w:tcPr>
+          <w:p>
+            <w:pPr>
+              <w:jc w:val="both"/>
+            </w:pPr>
+            <w:r>
+              <w:rPr>
+                <w:sz w:val="20"/>
+                <w:szCs w:val="20"/>
+              </w:rPr>
+              <w:t>int (auto-increment)</w:t>
+            </w:r>
+          </w:p>
+        </w:tc>
+        <w:tc>
+          <w:tcPr>
+            <w:tcW w:w="3008" w:type="dxa"/>
+            <w:tcBorders>
+              <w:top w:val="single" w:sz="4" w:space="0" w:color="auto"/>
+              <w:left w:val="single" w:sz="4" w:space="0" w:color="auto"/>
+              <w:bottom w:val="single" w:sz="4" w:space="0" w:color="auto"/>
+              <w:right w:val="single" w:sz="4" w:space="0" w:color="auto"/>
+            </w:tcBorders>
+            <w:hideMark/>
+          </w:tcPr>
+          <w:p>
+            <w:pPr>
+              <w:jc w:val="both"/>
+            </w:pPr>
+            <w:r>
+              <w:rPr>
+                <w:sz w:val="20"/>
+                <w:szCs w:val="20"/>
+              </w:rPr>
+              <w:t>Elsődleges kulcs</w:t>
+            </w:r>
+          </w:p>
+        </w:tc>
+      </w:tr>
+      <w:tr>
+        <w:tc>
+          <w:tcPr>
+            <w:tcW w:w="3009" w:type="dxa"/>
+            <w:tcBorders>
+              <w:top w:val="single" w:sz="4" w:space="0" w:color="auto"/>
+              <w:left w:val="single" w:sz="4" w:space="0" w:color="auto"/>
+              <w:bottom w:val="single" w:sz="4" w:space="0" w:color="auto"/>
+              <w:right w:val="single" w:sz="4" w:space="0" w:color="auto"/>
+            </w:tcBorders>
+            <w:hideMark/>
+          </w:tcPr>
+          <w:p>
+            <w:pPr>
+              <w:jc w:val="both"/>
+            </w:pPr>
+            <w:r>
+              <w:rPr>
+                <w:sz w:val="20"/>
+                <w:szCs w:val="20"/>
+              </w:rPr>
+              <w:t>StudentID (FK)</w:t>
+            </w:r>
+          </w:p>
+        </w:tc>
+        <w:tc>
+          <w:tcPr>
+            <w:tcW w:w="3009" w:type="dxa"/>
+            <w:tcBorders>
+              <w:top w:val="single" w:sz="4" w:space="0" w:color="auto"/>
+              <w:left w:val="single" w:sz="4" w:space="0" w:color="auto"/>
+              <w:bottom w:val="single" w:sz="4" w:space="0" w:color="auto"/>
+              <w:right w:val="single" w:sz="4" w:space="0" w:color="auto"/>
+            </w:tcBorders>
+            <w:hideMark/>
+          </w:tcPr>
+          <w:p>
+            <w:pPr>
+              <w:jc w:val="both"/>
+            </w:pPr>
+            <w:r>
+              <w:rPr>
+                <w:sz w:val="20"/>
+                <w:szCs w:val="20"/>
+              </w:rPr>
+              <w:t>int</w:t>
+            </w:r>
+          </w:p>
+        </w:tc>
+        <w:tc>
+          <w:tcPr>
+            <w:tcW w:w="3008" w:type="dxa"/>
+            <w:tcBorders>
+              <w:top w:val="single" w:sz="4" w:space="0" w:color="auto"/>
+              <w:left w:val="single" w:sz="4" w:space="0" w:color="auto"/>
+              <w:bottom w:val="single" w:sz="4" w:space="0" w:color="auto"/>
+              <w:right w:val="single" w:sz="4" w:space="0" w:color="auto"/>
+            </w:tcBorders>
+            <w:hideMark/>
+          </w:tcPr>
+          <w:p>
+            <w:pPr>
+              <w:jc w:val="both"/>
+            </w:pPr>
+            <w:r>
+              <w:rPr>
+                <w:sz w:val="20"/>
+                <w:szCs w:val="20"/>
+              </w:rPr>
+              <w:t>Idégen kulcs a Users táblára</w:t>
+            </w:r>
+          </w:p>
+        </w:tc>
+      </w:tr>
+      <w:tr>
+        <w:tc>
+          <w:tcPr>
+            <w:tcW w:w="3009" w:type="dxa"/>
+            <w:tcBorders>
+              <w:top w:val="single" w:sz="4" w:space="0" w:color="auto"/>
+              <w:left w:val="single" w:sz="4" w:space="0" w:color="auto"/>
+              <w:bottom w:val="single" w:sz="4" w:space="0" w:color="auto"/>
+              <w:right w:val="single" w:sz="4" w:space="0" w:color="auto"/>
+            </w:tcBorders>
+            <w:hideMark/>
+          </w:tcPr>
+          <w:p>
+            <w:pPr>
+              <w:jc w:val="both"/>
+            </w:pPr>
+            <w:r>
+              <w:rPr>
+                <w:sz w:val="20"/>
+                <w:szCs w:val="20"/>
+              </w:rPr>
+              <w:t>SubjectID (FK)</w:t>
+            </w:r>
+          </w:p>
+        </w:tc>
+        <w:tc>
+          <w:tcPr>
+            <w:tcW w:w="3009" w:type="dxa"/>
+            <w:tcBorders>
+              <w:top w:val="single" w:sz="4" w:space="0" w:color="auto"/>
+              <w:left w:val="single" w:sz="4" w:space="0" w:color="auto"/>
+              <w:bottom w:val="single" w:sz="4" w:space="0" w:color="auto"/>
+              <w:right w:val="single" w:sz="4" w:space="0" w:color="auto"/>
+            </w:tcBorders>
+            <w:hideMark/>
+          </w:tcPr>
+          <w:p>
+            <w:pPr>
+              <w:jc w:val="both"/>
+            </w:pPr>
+            <w:r>
+              <w:rPr>
+                <w:sz w:val="20"/>
+                <w:szCs w:val="20"/>
+              </w:rPr>
+              <w:t>int</w:t>
+            </w:r>
+          </w:p>
+        </w:tc>
+        <w:tc>
+          <w:tcPr>
+            <w:tcW w:w="3008" w:type="dxa"/>
+            <w:tcBorders>
+              <w:top w:val="single" w:sz="4" w:space="0" w:color="auto"/>
+              <w:left w:val="single" w:sz="4" w:space="0" w:color="auto"/>
+              <w:bottom w:val="single" w:sz="4" w:space="0" w:color="auto"/>
+              <w:right w:val="single" w:sz="4" w:space="0" w:color="auto"/>
+            </w:tcBorders>
+            <w:hideMark/>
+          </w:tcPr>
+          <w:p>
+            <w:pPr>
+              <w:jc w:val="both"/>
+            </w:pPr>
+            <w:r>
+              <w:rPr>
+                <w:sz w:val="20"/>
+                <w:szCs w:val="20"/>
+              </w:rPr>
+              <w:t>Idégen kulcs a Subjects táblára</w:t>
+            </w:r>
+          </w:p>
+        </w:tc>
+      </w:tr>
+      <w:tr>
+        <w:tc>
+          <w:tcPr>
+            <w:tcW w:w="3009" w:type="dxa"/>
+            <w:tcBorders>
+              <w:top w:val="single" w:sz="4" w:space="0" w:color="auto"/>
+              <w:left w:val="single" w:sz="4" w:space="0" w:color="auto"/>
+              <w:bottom w:val="single" w:sz="4" w:space="0" w:color="auto"/>
+              <w:right w:val="single" w:sz="4" w:space="0" w:color="auto"/>
+            </w:tcBorders>
+            <w:hideMark/>
+          </w:tcPr>
+          <w:p>
+            <w:pPr>
+              <w:jc w:val="both"/>
+            </w:pPr>
+            <w:r>
+              <w:rPr>
+                <w:sz w:val="20"/>
+                <w:szCs w:val="20"/>
+              </w:rPr>
+              <w:t>DayOfWeek</w:t>
+            </w:r>
+          </w:p>
+        </w:tc>
+        <w:tc>
+          <w:tcPr>
+            <w:tcW w:w="3009" w:type="dxa"/>
+            <w:tcBorders>
+              <w:top w:val="single" w:sz="4" w:space="0" w:color="auto"/>
+              <w:left w:val="single" w:sz="4" w:space="0" w:color="auto"/>
+              <w:bottom w:val="single" w:sz="4" w:space="0" w:color="auto"/>
+              <w:right w:val="single" w:sz="4" w:space="0" w:color="auto"/>
+            </w:tcBorders>
+            <w:hideMark/>
+          </w:tcPr>
+          <w:p>
+            <w:pPr>
+              <w:jc w:val="both"/>
+            </w:pPr>
+            <w:r>
+              <w:rPr>
+                <w:sz w:val="20"/>
+                <w:szCs w:val="20"/>
+              </w:rPr>
+              <w:t>int (1-7)</w:t>
+            </w:r>
+          </w:p>
+        </w:tc>
+        <w:tc>
+          <w:tcPr>
+            <w:tcW w:w="3008" w:type="dxa"/>
+            <w:tcBorders>
+              <w:top w:val="single" w:sz="4" w:space="0" w:color="auto"/>
+              <w:left w:val="single" w:sz="4" w:space="0" w:color="auto"/>
+              <w:bottom w:val="single" w:sz="4" w:space="0" w:color="auto"/>
+              <w:right w:val="single" w:sz="4" w:space="0" w:color="auto"/>
+            </w:tcBorders>
+            <w:hideMark/>
+          </w:tcPr>
+          <w:p>
+            <w:pPr>
+              <w:jc w:val="both"/>
+            </w:pPr>
+            <w:r>
+              <w:rPr>
+                <w:sz w:val="20"/>
+                <w:szCs w:val="20"/>
+              </w:rPr>
+              <w:t>Hét napja (1=Hétfő, 7=Vasárnap)</w:t>
+            </w:r>
+          </w:p>
+        </w:tc>
+      </w:tr>
+      <w:tr>
+        <w:tc>
+          <w:tcPr>
+            <w:tcW w:w="3009" w:type="dxa"/>
+            <w:tcBorders>
+              <w:top w:val="single" w:sz="4" w:space="0" w:color="auto"/>
+              <w:left w:val="single" w:sz="4" w:space="0" w:color="auto"/>
+              <w:bottom w:val="single" w:sz="4" w:space="0" w:color="auto"/>
+              <w:right w:val="single" w:sz="4" w:space="0" w:color="auto"/>
+            </w:tcBorders>
+            <w:hideMark/>
+          </w:tcPr>
+          <w:p>
+            <w:pPr>
+              <w:jc w:val="both"/>
+            </w:pPr>
+            <w:r>
+              <w:rPr>
+                <w:sz w:val="20"/>
+                <w:szCs w:val="20"/>
+              </w:rPr>
+              <w:t>StartTime</w:t>
+            </w:r>
+          </w:p>
+        </w:tc>
+        <w:tc>
+          <w:tcPr>
+            <w:tcW w:w="3009" w:type="dxa"/>
+            <w:tcBorders>
+              <w:top w:val="single" w:sz="4" w:space="0" w:color="auto"/>
+              <w:left w:val="single" w:sz="4" w:space="0" w:color="auto"/>
+              <w:bottom w:val="single" w:sz="4" w:space="0" w:color="auto"/>
+              <w:right w:val="single" w:sz="4" w:space="0" w:color="auto"/>
+            </w:tcBorders>
+            <w:hideMark/>
+          </w:tcPr>
+          <w:p>
+            <w:pPr>
+              <w:jc w:val="both"/>
+            </w:pPr>
+            <w:r>
+              <w:rPr>
+                <w:sz w:val="20"/>
+                <w:szCs w:val="20"/>
+              </w:rPr>
+              <w:t>nvarchar(5)</w:t>
+            </w:r>
+          </w:p>
+        </w:tc>
+        <w:tc>
+          <w:tcPr>
+            <w:tcW w:w="3008" w:type="dxa"/>
+            <w:tcBorders>
+              <w:top w:val="single" w:sz="4" w:space="0" w:color="auto"/>
+              <w:left w:val="single" w:sz="4" w:space="0" w:color="auto"/>
+              <w:bottom w:val="single" w:sz="4" w:space="0" w:color="auto"/>
+              <w:right w:val="single" w:sz="4" w:space="0" w:color="auto"/>
+            </w:tcBorders>
+            <w:hideMark/>
+          </w:tcPr>
+          <w:p>
+            <w:pPr>
+              <w:jc w:val="both"/>
+            </w:pPr>
+            <w:r>
+              <w:rPr>
+                <w:sz w:val="20"/>
+                <w:szCs w:val="20"/>
+              </w:rPr>
+              <w:t>Kezdés időpontja (pl. 08:00)</w:t>
+            </w:r>
+          </w:p>
+        </w:tc>
+      </w:tr>
+      <w:tr>
+        <w:tc>
+          <w:tcPr>
+            <w:tcW w:w="3009" w:type="dxa"/>
+            <w:tcBorders>
+              <w:top w:val="single" w:sz="4" w:space="0" w:color="auto"/>
+              <w:left w:val="single" w:sz="4" w:space="0" w:color="auto"/>
+              <w:bottom w:val="single" w:sz="4" w:space="0" w:color="auto"/>
+              <w:right w:val="single" w:sz="4" w:space="0" w:color="auto"/>
+            </w:tcBorders>
+            <w:hideMark/>
+          </w:tcPr>
+          <w:p>
+            <w:pPr>
+              <w:jc w:val="both"/>
+            </w:pPr>
+            <w:r>
+              <w:rPr>
+                <w:sz w:val="20"/>
+                <w:szCs w:val="20"/>
+              </w:rPr>
+              <w:t>EndTime</w:t>
+            </w:r>
+          </w:p>
+        </w:tc>
+        <w:tc>
+          <w:tcPr>
+            <w:tcW w:w="3009" w:type="dxa"/>
+            <w:tcBorders>
+              <w:top w:val="single" w:sz="4" w:space="0" w:color="auto"/>
+              <w:left w:val="single" w:sz="4" w:space="0" w:color="auto"/>
+              <w:bottom w:val="single" w:sz="4" w:space="0" w:color="auto"/>
+              <w:right w:val="single" w:sz="4" w:space="0" w:color="auto"/>
+            </w:tcBorders>
+            <w:hideMark/>
+          </w:tcPr>
+          <w:p>
+            <w:pPr>
+              <w:jc w:val="both"/>
+            </w:pPr>
+            <w:r>
+              <w:rPr>
+                <w:sz w:val="20"/>
+                <w:szCs w:val="20"/>
+              </w:rPr>
+              <w:t>nvarchar(5)</w:t>
+            </w:r>
+          </w:p>
+        </w:tc>
+        <w:tc>
+          <w:tcPr>
+            <w:tcW w:w="3008" w:type="dxa"/>
+            <w:tcBorders>
+              <w:top w:val="single" w:sz="4" w:space="0" w:color="auto"/>
+              <w:left w:val="single" w:sz="4" w:space="0" w:color="auto"/>
+              <w:bottom w:val="single" w:sz="4" w:space="0" w:color="auto"/>
+              <w:right w:val="single" w:sz="4" w:space="0" w:color="auto"/>
+            </w:tcBorders>
+            <w:hideMark/>
+          </w:tcPr>
+          <w:p>
+            <w:pPr>
+              <w:jc w:val="both"/>
+            </w:pPr>
+            <w:r>
+              <w:rPr>
+                <w:sz w:val="20"/>
+                <w:szCs w:val="20"/>
+              </w:rPr>
+              <w:t>Beféjezés időpontja (pl. 09:30)</w:t>
+            </w:r>
+          </w:p>
+        </w:tc>
+      </w:tr>
+      <w:tr>
+        <w:tc>
+          <w:tcPr>
+            <w:tcW w:w="3009" w:type="dxa"/>
+            <w:tcBorders>
+              <w:top w:val="single" w:sz="4" w:space="0" w:color="auto"/>
+              <w:left w:val="single" w:sz="4" w:space="0" w:color="auto"/>
+              <w:bottom w:val="single" w:sz="4" w:space="0" w:color="auto"/>
+              <w:right w:val="single" w:sz="4" w:space="0" w:color="auto"/>
+            </w:tcBorders>
+            <w:hideMark/>
+          </w:tcPr>
+          <w:p>
+            <w:pPr>
+              <w:jc w:val="both"/>
+            </w:pPr>
+            <w:r>
+              <w:rPr>
+                <w:sz w:val="20"/>
+                <w:szCs w:val="20"/>
+              </w:rPr>
+              <w:t>Location</w:t>
+            </w:r>
+          </w:p>
+        </w:tc>
+        <w:tc>
+          <w:tcPr>
+            <w:tcW w:w="3009" w:type="dxa"/>
+            <w:tcBorders>
+              <w:top w:val="single" w:sz="4" w:space="0" w:color="auto"/>
+              <w:left w:val="single" w:sz="4" w:space="0" w:color="auto"/>
+              <w:bottom w:val="single" w:sz="4" w:space="0" w:color="auto"/>
+              <w:right w:val="single" w:sz="4" w:space="0" w:color="auto"/>
+            </w:tcBorders>
+            <w:hideMark/>
+          </w:tcPr>
+          <w:p>
+            <w:pPr>
+              <w:jc w:val="both"/>
+            </w:pPr>
+            <w:r>
+              <w:rPr>
+                <w:sz w:val="20"/>
+                <w:szCs w:val="20"/>
+              </w:rPr>
+              <w:t>nvarchar(100)</w:t>
+            </w:r>
+          </w:p>
+        </w:tc>
+        <w:tc>
+          <w:tcPr>
+            <w:tcW w:w="3008" w:type="dxa"/>
+            <w:tcBorders>
+              <w:top w:val="single" w:sz="4" w:space="0" w:color="auto"/>
+              <w:left w:val="single" w:sz="4" w:space="0" w:color="auto"/>
+              <w:bottom w:val="single" w:sz="4" w:space="0" w:color="auto"/>
+              <w:right w:val="single" w:sz="4" w:space="0" w:color="auto"/>
+            </w:tcBorders>
+            <w:hideMark/>
+          </w:tcPr>
+          <w:p>
+            <w:pPr>
+              <w:jc w:val="both"/>
+            </w:pPr>
+            <w:r>
+              <w:rPr>
+                <w:sz w:val="20"/>
+                <w:szCs w:val="20"/>
+              </w:rPr>
+              <w:t>Terem száma (pl. A101)</w:t>
+            </w:r>
+          </w:p>
+        </w:tc>
+      </w:tr>
+      <w:tr>
+        <w:tc>
+          <w:tcPr>
+            <w:tcW w:w="3009" w:type="dxa"/>
+            <w:tcBorders>
+              <w:top w:val="single" w:sz="4" w:space="0" w:color="auto"/>
+              <w:left w:val="single" w:sz="4" w:space="0" w:color="auto"/>
+              <w:bottom w:val="single" w:sz="4" w:space="0" w:color="auto"/>
+              <w:right w:val="single" w:sz="4" w:space="0" w:color="auto"/>
+            </w:tcBorders>
+            <w:hideMark/>
+          </w:tcPr>
+          <w:p>
+            <w:pPr>
+              <w:jc w:val="both"/>
+            </w:pPr>
+            <w:r>
+              <w:rPr>
+                <w:sz w:val="20"/>
+                <w:szCs w:val="20"/>
+              </w:rPr>
+              <w:t>RecurrenceType</w:t>
+            </w:r>
+          </w:p>
+        </w:tc>
+        <w:tc>
+          <w:tcPr>
+            <w:tcW w:w="3009" w:type="dxa"/>
+            <w:tcBorders>
+              <w:top w:val="single" w:sz="4" w:space="0" w:color="auto"/>
+              <w:left w:val="single" w:sz="4" w:space="0" w:color="auto"/>
+              <w:bottom w:val="single" w:sz="4" w:space="0" w:color="auto"/>
+              <w:right w:val="single" w:sz="4" w:space="0" w:color="auto"/>
+            </w:tcBorders>
+            <w:hideMark/>
+          </w:tcPr>
+          <w:p>
+            <w:pPr>
+              <w:jc w:val="both"/>
+            </w:pPr>
+            <w:r>
+              <w:rPr>
+                <w:sz w:val="20"/>
+                <w:szCs w:val="20"/>
+              </w:rPr>
+              <w:t>nvarchar(20)</w:t>
+            </w:r>
+          </w:p>
+        </w:tc>
+        <w:tc>
+          <w:tcPr>
+            <w:tcW w:w="3008" w:type="dxa"/>
+            <w:tcBorders>
+              <w:top w:val="single" w:sz="4" w:space="0" w:color="auto"/>
+              <w:left w:val="single" w:sz="4" w:space="0" w:color="auto"/>
+              <w:bottom w:val="single" w:sz="4" w:space="0" w:color="auto"/>
+              <w:right w:val="single" w:sz="4" w:space="0" w:color="auto"/>
+            </w:tcBorders>
+            <w:hideMark/>
+          </w:tcPr>
+          <w:p>
+            <w:pPr>
+              <w:jc w:val="both"/>
+            </w:pPr>
+            <w:r>
+              <w:rPr>
+                <w:sz w:val="20"/>
+                <w:szCs w:val="20"/>
+              </w:rPr>
+              <w:t>Ismétlődés: None/Weekly/Biweekly/Monthly</w:t>
+            </w:r>
+          </w:p>
+        </w:tc>
+      </w:tr>
+      <w:tr>
+        <w:tc>
+          <w:tcPr>
+            <w:tcW w:w="3009" w:type="dxa"/>
+            <w:tcBorders>
+              <w:top w:val="single" w:sz="4" w:space="0" w:color="auto"/>
+              <w:left w:val="single" w:sz="4" w:space="0" w:color="auto"/>
+              <w:bottom w:val="single" w:sz="4" w:space="0" w:color="auto"/>
+              <w:right w:val="single" w:sz="4" w:space="0" w:color="auto"/>
+            </w:tcBorders>
+          </w:tcPr>
+          <w:p>
+            <w:pPr>
+              <w:jc w:val="both"/>
+            </w:pPr>
+            <w:r>
+              <w:rPr>
+                <w:sz w:val="20"/>
+                <w:szCs w:val="20"/>
+              </w:rPr>
+              <w:t>Recurrence</w:t>
+            </w:r>
+            <w:r>
+              <w:rPr>
+                <w:sz w:val="20"/>
+                <w:szCs w:val="20"/>
+              </w:rPr>
+              <w:t>EndDate</w:t>
+            </w:r>
+          </w:p>
+        </w:tc>
+        <w:tc>
+          <w:tcPr>
+            <w:tcW w:w="3009" w:type="dxa"/>
+            <w:tcBorders>
+              <w:top w:val="single" w:sz="4" w:space="0" w:color="auto"/>
+              <w:left w:val="single" w:sz="4" w:space="0" w:color="auto"/>
+              <w:bottom w:val="single" w:sz="4" w:space="0" w:color="auto"/>
+              <w:right w:val="single" w:sz="4" w:space="0" w:color="auto"/>
+            </w:tcBorders>
+          </w:tcPr>
+          <w:p>
+            <w:pPr>
+              <w:jc w:val="both"/>
+            </w:pPr>
+            <w:r>
+              <w:rPr>
+                <w:sz w:val="20"/>
+                <w:szCs w:val="20"/>
+              </w:rPr>
+              <w:t>datetime</w:t>
+            </w:r>
+          </w:p>
+        </w:tc>
+        <w:tc>
+          <w:tcPr>
+            <w:tcW w:w="3008" w:type="dxa"/>
+            <w:tcBorders>
+              <w:top w:val="single" w:sz="4" w:space="0" w:color="auto"/>
+              <w:left w:val="single" w:sz="4" w:space="0" w:color="auto"/>
+              <w:bottom w:val="single" w:sz="4" w:space="0" w:color="auto"/>
+              <w:right w:val="single" w:sz="4" w:space="0" w:color="auto"/>
+            </w:tcBorders>
+          </w:tcPr>
+          <w:p>
+            <w:pPr>
+              <w:jc w:val="both"/>
+            </w:pPr>
+            <w:r>
+              <w:rPr>
+                <w:sz w:val="20"/>
+                <w:szCs w:val="20"/>
+              </w:rPr>
+              <w:t>Ismétlődés:</w:t>
+            </w:r>
+            <w:r>
+              <w:rPr>
+                <w:sz w:val="20"/>
+                <w:szCs w:val="20"/>
+              </w:rPr>
+              <w:t>befejezési dátuma</w:t>
+            </w:r>
+          </w:p>
+        </w:tc>
+      </w:tr>
+      <w:tr>
+        <w:tc>
+          <w:tcPr>
+            <w:tcW w:w="3009" w:type="dxa"/>
+            <w:tcBorders>
+              <w:top w:val="single" w:sz="4" w:space="0" w:color="auto"/>
+              <w:left w:val="single" w:sz="4" w:space="0" w:color="auto"/>
+              <w:bottom w:val="single" w:sz="4" w:space="0" w:color="auto"/>
+              <w:right w:val="single" w:sz="4" w:space="0" w:color="auto"/>
+            </w:tcBorders>
+          </w:tcPr>
+          <w:p>
+            <w:pPr>
+              <w:jc w:val="both"/>
+              <w:rPr>
+                <w:sz w:val="20"/>
+                <w:szCs w:val="20"/>
+              </w:rPr>
+            </w:pPr>
+            <w:r>
+              <w:rPr>
+                <w:sz w:val="20"/>
+                <w:szCs w:val="20"/>
+              </w:rPr>
+              <w:lastRenderedPageBreak/>
+              <w:t>CreatedAt</w:t>
+            </w:r>
+          </w:p>
+        </w:tc>
+        <w:tc>
+          <w:tcPr>
+            <w:tcW w:w="3009" w:type="dxa"/>
+            <w:tcBorders>
+              <w:top w:val="single" w:sz="4" w:space="0" w:color="auto"/>
+              <w:left w:val="single" w:sz="4" w:space="0" w:color="auto"/>
+              <w:bottom w:val="single" w:sz="4" w:space="0" w:color="auto"/>
+              <w:right w:val="single" w:sz="4" w:space="0" w:color="auto"/>
+            </w:tcBorders>
+          </w:tcPr>
+          <w:p>
+            <w:pPr>
+              <w:jc w:val="both"/>
+              <w:rPr>
+                <w:sz w:val="20"/>
+                <w:szCs w:val="20"/>
+              </w:rPr>
+            </w:pPr>
+            <w:r>
+              <w:rPr>
+                <w:sz w:val="20"/>
+                <w:szCs w:val="20"/>
+              </w:rPr>
+              <w:t>datetime</w:t>
+            </w:r>
+          </w:p>
+        </w:tc>
+        <w:tc>
+          <w:tcPr>
+            <w:tcW w:w="3008" w:type="dxa"/>
+            <w:tcBorders>
+              <w:top w:val="single" w:sz="4" w:space="0" w:color="auto"/>
+              <w:left w:val="single" w:sz="4" w:space="0" w:color="auto"/>
+              <w:bottom w:val="single" w:sz="4" w:space="0" w:color="auto"/>
+              <w:right w:val="single" w:sz="4" w:space="0" w:color="auto"/>
+            </w:tcBorders>
+          </w:tcPr>
+          <w:p>
+            <w:pPr>
+              <w:jc w:val="both"/>
+              <w:rPr>
+                <w:sz w:val="20"/>
+                <w:szCs w:val="20"/>
+              </w:rPr>
+            </w:pPr>
+            <w:r>
+              <w:rPr>
+                <w:sz w:val="20"/>
+                <w:szCs w:val="20"/>
+              </w:rPr>
+              <w:t>Létrehozás időpontja</w:t>
+            </w:r>
+          </w:p>
+        </w:tc>
+      </w:tr>
+    </w:tbl>
+    <w:p>
+      <w:pPr>
+        <w:spacing w:before="80" w:after="80"/>
+        <w:jc w:val="both"/>
+      </w:pPr>
+      <w:r>
+        <w:rPr>
+          <w:sz w:val="24"/>
+          <w:szCs w:val="24"/>
+        </w:rPr>
+        <w:t>A ScheduleEntries tábla tárolja a diákok személyes órarendjeit. A DayOfWeek mező 1-től 7-ig terjed, ahol 1 a hétfőt és 7 a vasárnapot jelenti. A StartTime és EndTime mezők "HH:mm" formátumban tárolják az óra kezdését és végét. A RecurrenceType határozza meg az ismétlődés típusát: None (egyszeri), Weekly (heti), Biweekly (kétheatente), Monthly (havonta). A rendszer automatikusan felismeri, ha egy óra éppen folyamatban van, és ezt a dashboardon jelzi a felhasználónak.</w:t>
       </w:r>
     </w:p>
     <w:p>
@@ -7843,7 +10023,11 @@
     <w:rsid w:val="001E0945"/>
     <w:rsid w:val="00207778"/>
     <w:rsid w:val="002838D2"/>
+    <w:rsid w:val="002E6693"/>
+    <w:rsid w:val="003927F4"/>
+    <w:rsid w:val="003D6416"/>
     <w:rsid w:val="004041B5"/>
+    <w:rsid w:val="00461721"/>
     <w:rsid w:val="00722E1A"/>
     <w:rsid w:val="007E7CBF"/>
     <w:rsid w:val="008435C4"/>

</xml_diff>

<commit_message>
Dokumentáció JWT Autentikáció és Jogosultságkezelés.
</commit_message>
<xml_diff>
--- a/FeladatRadar_Reszletes_Funkcio_Leiras.docx
+++ b/FeladatRadar_Reszletes_Funkcio_Leiras.docx
@@ -1,16 +1,16 @@
 
 <file path=word/document.xml><?xml version="1.0" encoding="utf-8"?>
-<w:document xmlns:wpc="http://schemas.microsoft.com/office/word/2010/wordprocessingCanvas" xmlns:cx="http://schemas.microsoft.com/office/drawing/2014/chartex" xmlns:cx1="http://schemas.microsoft.com/office/drawing/2015/9/8/chartex" xmlns:cx2="http://schemas.microsoft.com/office/drawing/2015/10/21/chartex" xmlns:cx3="http://schemas.microsoft.com/office/drawing/2016/5/9/chartex" xmlns:cx4="http://schemas.microsoft.com/office/drawing/2016/5/10/chartex" xmlns:cx5="http://schemas.microsoft.com/office/drawing/2016/5/11/chartex" xmlns:cx6="http://schemas.microsoft.com/office/drawing/2016/5/12/chartex" xmlns:cx7="http://schemas.microsoft.com/office/drawing/2016/5/13/chartex" xmlns:cx8="http://schemas.microsoft.com/office/drawing/2016/5/14/chartex" xmlns:mc="http://schemas.openxmlformats.org/markup-compatibility/2006" xmlns:aink="http://schemas.microsoft.com/office/drawing/2016/ink" xmlns:am3d="http://schemas.microsoft.com/office/drawing/2017/model3d" xmlns:o="urn:schemas-microsoft-com:office:office" xmlns:r="http://schemas.openxmlformats.org/officeDocument/2006/relationships" xmlns:m="http://schemas.openxmlformats.org/officeDocument/2006/math" xmlns:v="urn:schemas-microsoft-com:vml" xmlns:wp14="http://schemas.microsoft.com/office/word/2010/wordprocessingDrawing" xmlns:wp="http://schemas.openxmlformats.org/drawingml/2006/wordprocessingDrawing" xmlns:w10="urn:schemas-microsoft-com:office:word" xmlns:w="http://schemas.openxmlformats.org/wordprocessingml/2006/main" xmlns:w14="http://schemas.microsoft.com/office/word/2010/wordml" xmlns:w15="http://schemas.microsoft.com/office/word/2012/wordml" xmlns:w16cex="http://schemas.microsoft.com/office/word/2018/wordml/cex" xmlns:w16cid="http://schemas.microsoft.com/office/word/2016/wordml/cid" xmlns:w16="http://schemas.microsoft.com/office/word/2018/wordml" xmlns:w16sdtdh="http://schemas.microsoft.com/office/word/2020/wordml/sdtdatahash" xmlns:w16se="http://schemas.microsoft.com/office/word/2015/wordml/symex" xmlns:wpg="http://schemas.microsoft.com/office/word/2010/wordprocessingGroup" xmlns:wpi="http://schemas.microsoft.com/office/word/2010/wordprocessingInk" xmlns:wne="http://schemas.microsoft.com/office/word/2006/wordml" xmlns:wps="http://schemas.microsoft.com/office/word/2010/wordprocessingShape" mc:Ignorable="w14 w15 w16se w16cid w16 w16cex w16sdtdh wp14">
+<w:document xmlns:wpc="http://schemas.microsoft.com/office/word/2010/wordprocessingCanvas" xmlns:cx="http://schemas.microsoft.com/office/drawing/2014/chartex" xmlns:cx1="http://schemas.microsoft.com/office/drawing/2015/9/8/chartex" xmlns:cx2="http://schemas.microsoft.com/office/drawing/2015/10/21/chartex" xmlns:cx3="http://schemas.microsoft.com/office/drawing/2016/5/9/chartex" xmlns:cx4="http://schemas.microsoft.com/office/drawing/2016/5/10/chartex" xmlns:cx5="http://schemas.microsoft.com/office/drawing/2016/5/11/chartex" xmlns:cx6="http://schemas.microsoft.com/office/drawing/2016/5/12/chartex" xmlns:cx7="http://schemas.microsoft.com/office/drawing/2016/5/13/chartex" xmlns:cx8="http://schemas.microsoft.com/office/drawing/2016/5/14/chartex" xmlns:mc="http://schemas.openxmlformats.org/markup-compatibility/2006" xmlns:aink="http://schemas.microsoft.com/office/drawing/2016/ink" xmlns:am3d="http://schemas.microsoft.com/office/drawing/2017/model3d" xmlns:o="urn:schemas-microsoft-com:office:office" xmlns:r="http://schemas.openxmlformats.org/officeDocument/2006/relationships" xmlns:m="http://schemas.openxmlformats.org/officeDocument/2006/math" xmlns:v="urn:schemas-microsoft-com:vml" xmlns:wp14="http://schemas.microsoft.com/office/word/2010/wordprocessingDrawing" xmlns:wp="http://schemas.openxmlformats.org/drawingml/2006/wordprocessingDrawing" xmlns:w10="urn:schemas-microsoft-com:office:word" xmlns:w="http://schemas.openxmlformats.org/wordprocessingml/2006/main" xmlns:w14="http://schemas.microsoft.com/office/word/2010/wordml" xmlns:w15="http://schemas.microsoft.com/office/word/2012/wordml" xmlns:w16cid="http://schemas.microsoft.com/office/word/2016/wordml/cid" xmlns:w16se="http://schemas.microsoft.com/office/word/2015/wordml/symex" xmlns:wpg="http://schemas.microsoft.com/office/word/2010/wordprocessingGroup" xmlns:wpi="http://schemas.microsoft.com/office/word/2010/wordprocessingInk" xmlns:wne="http://schemas.microsoft.com/office/word/2006/wordml" xmlns:wps="http://schemas.microsoft.com/office/word/2010/wordprocessingShape" mc:Ignorable="w14 w15 w16se w16cid wp14">
   <w:body>
     <w:p>
       <w:pPr>
-        <w:pStyle w:val="Heading1"/>
+        <w:pStyle w:val="Cmsor1"/>
         <w:jc w:val="both"/>
         <w:rPr>
           <w:rFonts w:cstheme="minorHAnsi"/>
         </w:rPr>
       </w:pPr>
-      <w:bookmarkStart w:id="0" w:name="_Toc223805760"/>
+      <w:bookmarkStart w:id="0" w:name="_Toc223984708"/>
       <w:r>
         <w:rPr>
           <w:rFonts w:cstheme="minorHAnsi"/>
@@ -43,7 +43,7 @@
       <w:sdtContent>
         <w:p>
           <w:pPr>
-            <w:pStyle w:val="TOCHeading"/>
+            <w:pStyle w:val="Tartalomjegyzkcmsora"/>
             <w:jc w:val="both"/>
             <w:rPr>
               <w:rFonts w:asciiTheme="minorHAnsi" w:hAnsiTheme="minorHAnsi" w:cstheme="minorHAnsi"/>
@@ -58,14 +58,14 @@
         </w:p>
         <w:p>
           <w:pPr>
-            <w:pStyle w:val="TOC1"/>
+            <w:pStyle w:val="TJ1"/>
             <w:tabs>
               <w:tab w:val="right" w:leader="dot" w:pos="9062"/>
             </w:tabs>
             <w:rPr>
               <w:rFonts w:eastAsiaTheme="minorEastAsia"/>
               <w:noProof/>
-              <w:lang w:val="en-US"/>
+              <w:lang w:eastAsia="hu-HU"/>
             </w:rPr>
           </w:pPr>
           <w:r>
@@ -86,10 +86,10 @@
             </w:rPr>
             <w:fldChar w:fldCharType="separate"/>
           </w:r>
-          <w:hyperlink w:anchor="_Toc223805760" w:history="1">
-            <w:r>
-              <w:rPr>
-                <w:rStyle w:val="Hyperlink"/>
+          <w:hyperlink w:anchor="_Toc223984708" w:history="1">
+            <w:r>
+              <w:rPr>
+                <w:rStyle w:val="Hiperhivatkozs"/>
                 <w:rFonts w:cstheme="minorHAnsi"/>
                 <w:noProof/>
               </w:rPr>
@@ -114,7 +114,7 @@
                 <w:noProof/>
                 <w:webHidden/>
               </w:rPr>
-              <w:instrText xml:space="preserve"> PAGEREF _Toc223805760 \h </w:instrText>
+              <w:instrText xml:space="preserve"> PAGEREF _Toc223984708 \h </w:instrText>
             </w:r>
             <w:r>
               <w:rPr>
@@ -147,20 +147,20 @@
         </w:p>
         <w:p>
           <w:pPr>
-            <w:pStyle w:val="TOC1"/>
+            <w:pStyle w:val="TJ1"/>
             <w:tabs>
               <w:tab w:val="right" w:leader="dot" w:pos="9062"/>
             </w:tabs>
             <w:rPr>
               <w:rFonts w:eastAsiaTheme="minorEastAsia"/>
               <w:noProof/>
-              <w:lang w:val="en-US"/>
+              <w:lang w:eastAsia="hu-HU"/>
             </w:rPr>
           </w:pPr>
-          <w:hyperlink w:anchor="_Toc223805761" w:history="1">
-            <w:r>
-              <w:rPr>
-                <w:rStyle w:val="Hyperlink"/>
+          <w:hyperlink w:anchor="_Toc223984709" w:history="1">
+            <w:r>
+              <w:rPr>
+                <w:rStyle w:val="Hiperhivatkozs"/>
                 <w:rFonts w:cstheme="minorHAnsi"/>
                 <w:noProof/>
               </w:rPr>
@@ -185,7 +185,7 @@
                 <w:noProof/>
                 <w:webHidden/>
               </w:rPr>
-              <w:instrText xml:space="preserve"> PAGEREF _Toc223805761 \h </w:instrText>
+              <w:instrText xml:space="preserve"> PAGEREF _Toc223984709 \h </w:instrText>
             </w:r>
             <w:r>
               <w:rPr>
@@ -218,20 +218,20 @@
         </w:p>
         <w:p>
           <w:pPr>
-            <w:pStyle w:val="TOC2"/>
+            <w:pStyle w:val="TJ2"/>
             <w:tabs>
               <w:tab w:val="right" w:leader="dot" w:pos="9062"/>
             </w:tabs>
             <w:rPr>
               <w:rFonts w:eastAsiaTheme="minorEastAsia"/>
               <w:noProof/>
-              <w:lang w:val="en-US"/>
+              <w:lang w:eastAsia="hu-HU"/>
             </w:rPr>
           </w:pPr>
-          <w:hyperlink w:anchor="_Toc223805762" w:history="1">
-            <w:r>
-              <w:rPr>
-                <w:rStyle w:val="Hyperlink"/>
+          <w:hyperlink w:anchor="_Toc223984710" w:history="1">
+            <w:r>
+              <w:rPr>
+                <w:rStyle w:val="Hiperhivatkozs"/>
                 <w:noProof/>
               </w:rPr>
               <w:t>1.1 Projekt célja</w:t>
@@ -255,7 +255,7 @@
                 <w:noProof/>
                 <w:webHidden/>
               </w:rPr>
-              <w:instrText xml:space="preserve"> PAGEREF _Toc223805762 \h </w:instrText>
+              <w:instrText xml:space="preserve"> PAGEREF _Toc223984710 \h </w:instrText>
             </w:r>
             <w:r>
               <w:rPr>
@@ -288,20 +288,20 @@
         </w:p>
         <w:p>
           <w:pPr>
-            <w:pStyle w:val="TOC2"/>
+            <w:pStyle w:val="TJ2"/>
             <w:tabs>
               <w:tab w:val="right" w:leader="dot" w:pos="9062"/>
             </w:tabs>
             <w:rPr>
               <w:rFonts w:eastAsiaTheme="minorEastAsia"/>
               <w:noProof/>
-              <w:lang w:val="en-US"/>
+              <w:lang w:eastAsia="hu-HU"/>
             </w:rPr>
           </w:pPr>
-          <w:hyperlink w:anchor="_Toc223805763" w:history="1">
-            <w:r>
-              <w:rPr>
-                <w:rStyle w:val="Hyperlink"/>
+          <w:hyperlink w:anchor="_Toc223984711" w:history="1">
+            <w:r>
+              <w:rPr>
+                <w:rStyle w:val="Hiperhivatkozs"/>
                 <w:noProof/>
               </w:rPr>
               <w:t>1.2 Témaválasztás indoklása</w:t>
@@ -325,7 +325,7 @@
                 <w:noProof/>
                 <w:webHidden/>
               </w:rPr>
-              <w:instrText xml:space="preserve"> PAGEREF _Toc223805763 \h </w:instrText>
+              <w:instrText xml:space="preserve"> PAGEREF _Toc223984711 \h </w:instrText>
             </w:r>
             <w:r>
               <w:rPr>
@@ -358,20 +358,20 @@
         </w:p>
         <w:p>
           <w:pPr>
-            <w:pStyle w:val="TOC2"/>
+            <w:pStyle w:val="TJ2"/>
             <w:tabs>
               <w:tab w:val="right" w:leader="dot" w:pos="9062"/>
             </w:tabs>
             <w:rPr>
               <w:rFonts w:eastAsiaTheme="minorEastAsia"/>
               <w:noProof/>
-              <w:lang w:val="en-US"/>
+              <w:lang w:eastAsia="hu-HU"/>
             </w:rPr>
           </w:pPr>
-          <w:hyperlink w:anchor="_Toc223805764" w:history="1">
-            <w:r>
-              <w:rPr>
-                <w:rStyle w:val="Hyperlink"/>
+          <w:hyperlink w:anchor="_Toc223984712" w:history="1">
+            <w:r>
+              <w:rPr>
+                <w:rStyle w:val="Hiperhivatkozs"/>
                 <w:noProof/>
               </w:rPr>
               <w:t>1.3 Célközönség</w:t>
@@ -395,7 +395,7 @@
                 <w:noProof/>
                 <w:webHidden/>
               </w:rPr>
-              <w:instrText xml:space="preserve"> PAGEREF _Toc223805764 \h </w:instrText>
+              <w:instrText xml:space="preserve"> PAGEREF _Toc223984712 \h </w:instrText>
             </w:r>
             <w:r>
               <w:rPr>
@@ -428,20 +428,20 @@
         </w:p>
         <w:p>
           <w:pPr>
-            <w:pStyle w:val="TOC2"/>
+            <w:pStyle w:val="TJ2"/>
             <w:tabs>
               <w:tab w:val="right" w:leader="dot" w:pos="9062"/>
             </w:tabs>
             <w:rPr>
               <w:rFonts w:eastAsiaTheme="minorEastAsia"/>
               <w:noProof/>
-              <w:lang w:val="en-US"/>
+              <w:lang w:eastAsia="hu-HU"/>
             </w:rPr>
           </w:pPr>
-          <w:hyperlink w:anchor="_Toc223805765" w:history="1">
-            <w:r>
-              <w:rPr>
-                <w:rStyle w:val="Hyperlink"/>
+          <w:hyperlink w:anchor="_Toc223984713" w:history="1">
+            <w:r>
+              <w:rPr>
+                <w:rStyle w:val="Hiperhivatkozs"/>
                 <w:noProof/>
               </w:rPr>
               <w:t>1.4 Csoport tagjai és munkamegosztás</w:t>
@@ -465,7 +465,7 @@
                 <w:noProof/>
                 <w:webHidden/>
               </w:rPr>
-              <w:instrText xml:space="preserve"> PAGEREF _Toc223805765 \h </w:instrText>
+              <w:instrText xml:space="preserve"> PAGEREF _Toc223984713 \h </w:instrText>
             </w:r>
             <w:r>
               <w:rPr>
@@ -498,20 +498,20 @@
         </w:p>
         <w:p>
           <w:pPr>
-            <w:pStyle w:val="TOC3"/>
+            <w:pStyle w:val="TJ3"/>
             <w:tabs>
               <w:tab w:val="right" w:leader="dot" w:pos="9062"/>
             </w:tabs>
             <w:rPr>
               <w:rFonts w:eastAsiaTheme="minorEastAsia"/>
               <w:noProof/>
-              <w:lang w:val="en-US"/>
+              <w:lang w:eastAsia="hu-HU"/>
             </w:rPr>
           </w:pPr>
-          <w:hyperlink w:anchor="_Toc223805766" w:history="1">
-            <w:r>
-              <w:rPr>
-                <w:rStyle w:val="Hyperlink"/>
+          <w:hyperlink w:anchor="_Toc223984714" w:history="1">
+            <w:r>
+              <w:rPr>
+                <w:rStyle w:val="Hiperhivatkozs"/>
                 <w:noProof/>
               </w:rPr>
               <w:t>1.4.1 Tarcsányi Csongor Márk feladatai</w:t>
@@ -535,7 +535,7 @@
                 <w:noProof/>
                 <w:webHidden/>
               </w:rPr>
-              <w:instrText xml:space="preserve"> PAGEREF _Toc223805766 \h </w:instrText>
+              <w:instrText xml:space="preserve"> PAGEREF _Toc223984714 \h </w:instrText>
             </w:r>
             <w:r>
               <w:rPr>
@@ -568,20 +568,20 @@
         </w:p>
         <w:p>
           <w:pPr>
-            <w:pStyle w:val="TOC3"/>
+            <w:pStyle w:val="TJ3"/>
             <w:tabs>
               <w:tab w:val="right" w:leader="dot" w:pos="9062"/>
             </w:tabs>
             <w:rPr>
               <w:rFonts w:eastAsiaTheme="minorEastAsia"/>
               <w:noProof/>
-              <w:lang w:val="en-US"/>
+              <w:lang w:eastAsia="hu-HU"/>
             </w:rPr>
           </w:pPr>
-          <w:hyperlink w:anchor="_Toc223805767" w:history="1">
-            <w:r>
-              <w:rPr>
-                <w:rStyle w:val="Hyperlink"/>
+          <w:hyperlink w:anchor="_Toc223984715" w:history="1">
+            <w:r>
+              <w:rPr>
+                <w:rStyle w:val="Hiperhivatkozs"/>
                 <w:noProof/>
               </w:rPr>
               <w:t>1.4.2 Lőrincz Antal feladatai</w:t>
@@ -605,7 +605,7 @@
                 <w:noProof/>
                 <w:webHidden/>
               </w:rPr>
-              <w:instrText xml:space="preserve"> PAGEREF _Toc223805767 \h </w:instrText>
+              <w:instrText xml:space="preserve"> PAGEREF _Toc223984715 \h </w:instrText>
             </w:r>
             <w:r>
               <w:rPr>
@@ -638,20 +638,20 @@
         </w:p>
         <w:p>
           <w:pPr>
-            <w:pStyle w:val="TOC3"/>
+            <w:pStyle w:val="TJ3"/>
             <w:tabs>
               <w:tab w:val="right" w:leader="dot" w:pos="9062"/>
             </w:tabs>
             <w:rPr>
               <w:rFonts w:eastAsiaTheme="minorEastAsia"/>
               <w:noProof/>
-              <w:lang w:val="en-US"/>
+              <w:lang w:eastAsia="hu-HU"/>
             </w:rPr>
           </w:pPr>
-          <w:hyperlink w:anchor="_Toc223805768" w:history="1">
-            <w:r>
-              <w:rPr>
-                <w:rStyle w:val="Hyperlink"/>
+          <w:hyperlink w:anchor="_Toc223984716" w:history="1">
+            <w:r>
+              <w:rPr>
+                <w:rStyle w:val="Hiperhivatkozs"/>
                 <w:noProof/>
               </w:rPr>
               <w:t>1.4.3 Le Tuan Anh (Róbert) feladatai</w:t>
@@ -675,7 +675,7 @@
                 <w:noProof/>
                 <w:webHidden/>
               </w:rPr>
-              <w:instrText xml:space="preserve"> PAGEREF _Toc223805768 \h </w:instrText>
+              <w:instrText xml:space="preserve"> PAGEREF _Toc223984716 \h </w:instrText>
             </w:r>
             <w:r>
               <w:rPr>
@@ -708,20 +708,20 @@
         </w:p>
         <w:p>
           <w:pPr>
-            <w:pStyle w:val="TOC3"/>
+            <w:pStyle w:val="TJ3"/>
             <w:tabs>
               <w:tab w:val="right" w:leader="dot" w:pos="9062"/>
             </w:tabs>
             <w:rPr>
               <w:rFonts w:eastAsiaTheme="minorEastAsia"/>
               <w:noProof/>
-              <w:lang w:val="en-US"/>
+              <w:lang w:eastAsia="hu-HU"/>
             </w:rPr>
           </w:pPr>
-          <w:hyperlink w:anchor="_Toc223805769" w:history="1">
-            <w:r>
-              <w:rPr>
-                <w:rStyle w:val="Hyperlink"/>
+          <w:hyperlink w:anchor="_Toc223984717" w:history="1">
+            <w:r>
+              <w:rPr>
+                <w:rStyle w:val="Hiperhivatkozs"/>
                 <w:noProof/>
               </w:rPr>
               <w:t>1.4.4 Közös fejlesztések</w:t>
@@ -745,7 +745,7 @@
                 <w:noProof/>
                 <w:webHidden/>
               </w:rPr>
-              <w:instrText xml:space="preserve"> PAGEREF _Toc223805769 \h </w:instrText>
+              <w:instrText xml:space="preserve"> PAGEREF _Toc223984717 \h </w:instrText>
             </w:r>
             <w:r>
               <w:rPr>
@@ -778,20 +778,20 @@
         </w:p>
         <w:p>
           <w:pPr>
-            <w:pStyle w:val="TOC2"/>
+            <w:pStyle w:val="TJ2"/>
             <w:tabs>
               <w:tab w:val="right" w:leader="dot" w:pos="9062"/>
             </w:tabs>
             <w:rPr>
               <w:rFonts w:eastAsiaTheme="minorEastAsia"/>
               <w:noProof/>
-              <w:lang w:val="en-US"/>
+              <w:lang w:eastAsia="hu-HU"/>
             </w:rPr>
           </w:pPr>
-          <w:hyperlink w:anchor="_Toc223805770" w:history="1">
-            <w:r>
-              <w:rPr>
-                <w:rStyle w:val="Hyperlink"/>
+          <w:hyperlink w:anchor="_Toc223984718" w:history="1">
+            <w:r>
+              <w:rPr>
+                <w:rStyle w:val="Hiperhivatkozs"/>
                 <w:noProof/>
               </w:rPr>
               <w:t>1.5 Szükséges adatok a megvalósításhoz</w:t>
@@ -815,7 +815,7 @@
                 <w:noProof/>
                 <w:webHidden/>
               </w:rPr>
-              <w:instrText xml:space="preserve"> PAGEREF _Toc223805770 \h </w:instrText>
+              <w:instrText xml:space="preserve"> PAGEREF _Toc223984718 \h </w:instrText>
             </w:r>
             <w:r>
               <w:rPr>
@@ -848,20 +848,20 @@
         </w:p>
         <w:p>
           <w:pPr>
-            <w:pStyle w:val="TOC1"/>
+            <w:pStyle w:val="TJ1"/>
             <w:tabs>
               <w:tab w:val="right" w:leader="dot" w:pos="9062"/>
             </w:tabs>
             <w:rPr>
               <w:rFonts w:eastAsiaTheme="minorEastAsia"/>
               <w:noProof/>
-              <w:lang w:val="en-US"/>
+              <w:lang w:eastAsia="hu-HU"/>
             </w:rPr>
           </w:pPr>
-          <w:hyperlink w:anchor="_Toc223805771" w:history="1">
-            <w:r>
-              <w:rPr>
-                <w:rStyle w:val="Hyperlink"/>
+          <w:hyperlink w:anchor="_Toc223984719" w:history="1">
+            <w:r>
+              <w:rPr>
+                <w:rStyle w:val="Hiperhivatkozs"/>
                 <w:rFonts w:cstheme="minorHAnsi"/>
                 <w:noProof/>
                 <w:lang w:eastAsia="hu-HU"/>
@@ -887,7 +887,7 @@
                 <w:noProof/>
                 <w:webHidden/>
               </w:rPr>
-              <w:instrText xml:space="preserve"> PAGEREF _Toc223805771 \h </w:instrText>
+              <w:instrText xml:space="preserve"> PAGEREF _Toc223984719 \h </w:instrText>
             </w:r>
             <w:r>
               <w:rPr>
@@ -920,20 +920,20 @@
         </w:p>
         <w:p>
           <w:pPr>
-            <w:pStyle w:val="TOC2"/>
+            <w:pStyle w:val="TJ2"/>
             <w:tabs>
               <w:tab w:val="right" w:leader="dot" w:pos="9062"/>
             </w:tabs>
             <w:rPr>
               <w:rFonts w:eastAsiaTheme="minorEastAsia"/>
               <w:noProof/>
-              <w:lang w:val="en-US"/>
+              <w:lang w:eastAsia="hu-HU"/>
             </w:rPr>
           </w:pPr>
-          <w:hyperlink w:anchor="_Toc223805772" w:history="1">
-            <w:r>
-              <w:rPr>
-                <w:rStyle w:val="Hyperlink"/>
+          <w:hyperlink w:anchor="_Toc223984720" w:history="1">
+            <w:r>
+              <w:rPr>
+                <w:rStyle w:val="Hiperhivatkozs"/>
                 <w:noProof/>
               </w:rPr>
               <w:t>2.1 Alkalmazás áttekintés</w:t>
@@ -957,7 +957,7 @@
                 <w:noProof/>
                 <w:webHidden/>
               </w:rPr>
-              <w:instrText xml:space="preserve"> PAGEREF _Toc223805772 \h </w:instrText>
+              <w:instrText xml:space="preserve"> PAGEREF _Toc223984720 \h </w:instrText>
             </w:r>
             <w:r>
               <w:rPr>
@@ -990,20 +990,20 @@
         </w:p>
         <w:p>
           <w:pPr>
-            <w:pStyle w:val="TOC2"/>
+            <w:pStyle w:val="TJ2"/>
             <w:tabs>
               <w:tab w:val="right" w:leader="dot" w:pos="9062"/>
             </w:tabs>
             <w:rPr>
               <w:rFonts w:eastAsiaTheme="minorEastAsia"/>
               <w:noProof/>
-              <w:lang w:val="en-US"/>
+              <w:lang w:eastAsia="hu-HU"/>
             </w:rPr>
           </w:pPr>
-          <w:hyperlink w:anchor="_Toc223805773" w:history="1">
-            <w:r>
-              <w:rPr>
-                <w:rStyle w:val="Hyperlink"/>
+          <w:hyperlink w:anchor="_Toc223984721" w:history="1">
+            <w:r>
+              <w:rPr>
+                <w:rStyle w:val="Hiperhivatkozs"/>
                 <w:noProof/>
               </w:rPr>
               <w:t>2.2 Felhasznált szoftverek</w:t>
@@ -1027,7 +1027,7 @@
                 <w:noProof/>
                 <w:webHidden/>
               </w:rPr>
-              <w:instrText xml:space="preserve"> PAGEREF _Toc223805773 \h </w:instrText>
+              <w:instrText xml:space="preserve"> PAGEREF _Toc223984721 \h </w:instrText>
             </w:r>
             <w:r>
               <w:rPr>
@@ -1060,20 +1060,20 @@
         </w:p>
         <w:p>
           <w:pPr>
-            <w:pStyle w:val="TOC2"/>
+            <w:pStyle w:val="TJ2"/>
             <w:tabs>
               <w:tab w:val="right" w:leader="dot" w:pos="9062"/>
             </w:tabs>
             <w:rPr>
               <w:rFonts w:eastAsiaTheme="minorEastAsia"/>
               <w:noProof/>
-              <w:lang w:val="en-US"/>
+              <w:lang w:eastAsia="hu-HU"/>
             </w:rPr>
           </w:pPr>
-          <w:hyperlink w:anchor="_Toc223805774" w:history="1">
-            <w:r>
-              <w:rPr>
-                <w:rStyle w:val="Hyperlink"/>
+          <w:hyperlink w:anchor="_Toc223984722" w:history="1">
+            <w:r>
+              <w:rPr>
+                <w:rStyle w:val="Hiperhivatkozs"/>
                 <w:noProof/>
               </w:rPr>
               <w:t>2.3 Github</w:t>
@@ -1097,7 +1097,7 @@
                 <w:noProof/>
                 <w:webHidden/>
               </w:rPr>
-              <w:instrText xml:space="preserve"> PAGEREF _Toc223805774 \h </w:instrText>
+              <w:instrText xml:space="preserve"> PAGEREF _Toc223984722 \h </w:instrText>
             </w:r>
             <w:r>
               <w:rPr>
@@ -1130,20 +1130,20 @@
         </w:p>
         <w:p>
           <w:pPr>
-            <w:pStyle w:val="TOC2"/>
+            <w:pStyle w:val="TJ2"/>
             <w:tabs>
               <w:tab w:val="right" w:leader="dot" w:pos="9062"/>
             </w:tabs>
             <w:rPr>
               <w:rFonts w:eastAsiaTheme="minorEastAsia"/>
               <w:noProof/>
-              <w:lang w:val="en-US"/>
+              <w:lang w:eastAsia="hu-HU"/>
             </w:rPr>
           </w:pPr>
-          <w:hyperlink w:anchor="_Toc223805775" w:history="1">
-            <w:r>
-              <w:rPr>
-                <w:rStyle w:val="Hyperlink"/>
+          <w:hyperlink w:anchor="_Toc223984723" w:history="1">
+            <w:r>
+              <w:rPr>
+                <w:rStyle w:val="Hiperhivatkozs"/>
                 <w:noProof/>
               </w:rPr>
               <w:t>2.4 Fő funkciók</w:t>
@@ -1167,7 +1167,7 @@
                 <w:noProof/>
                 <w:webHidden/>
               </w:rPr>
-              <w:instrText xml:space="preserve"> PAGEREF _Toc223805775 \h </w:instrText>
+              <w:instrText xml:space="preserve"> PAGEREF _Toc223984723 \h </w:instrText>
             </w:r>
             <w:r>
               <w:rPr>
@@ -1200,20 +1200,20 @@
         </w:p>
         <w:p>
           <w:pPr>
-            <w:pStyle w:val="TOC2"/>
+            <w:pStyle w:val="TJ2"/>
             <w:tabs>
               <w:tab w:val="right" w:leader="dot" w:pos="9062"/>
             </w:tabs>
             <w:rPr>
               <w:rFonts w:eastAsiaTheme="minorEastAsia"/>
               <w:noProof/>
-              <w:lang w:val="en-US"/>
+              <w:lang w:eastAsia="hu-HU"/>
             </w:rPr>
           </w:pPr>
-          <w:hyperlink w:anchor="_Toc223805776" w:history="1">
-            <w:r>
-              <w:rPr>
-                <w:rStyle w:val="Hyperlink"/>
+          <w:hyperlink w:anchor="_Toc223984724" w:history="1">
+            <w:r>
+              <w:rPr>
+                <w:rStyle w:val="Hiperhivatkozs"/>
                 <w:rFonts w:eastAsia="Arial"/>
                 <w:noProof/>
               </w:rPr>
@@ -1238,7 +1238,7 @@
                 <w:noProof/>
                 <w:webHidden/>
               </w:rPr>
-              <w:instrText xml:space="preserve"> PAGEREF _Toc223805776 \h </w:instrText>
+              <w:instrText xml:space="preserve"> PAGEREF _Toc223984724 \h </w:instrText>
             </w:r>
             <w:r>
               <w:rPr>
@@ -1271,20 +1271,20 @@
         </w:p>
         <w:p>
           <w:pPr>
-            <w:pStyle w:val="TOC3"/>
+            <w:pStyle w:val="TJ3"/>
             <w:tabs>
               <w:tab w:val="right" w:leader="dot" w:pos="9062"/>
             </w:tabs>
             <w:rPr>
               <w:rFonts w:eastAsiaTheme="minorEastAsia"/>
               <w:noProof/>
-              <w:lang w:val="en-US"/>
+              <w:lang w:eastAsia="hu-HU"/>
             </w:rPr>
           </w:pPr>
-          <w:hyperlink w:anchor="_Toc223805777" w:history="1">
-            <w:r>
-              <w:rPr>
-                <w:rStyle w:val="Hyperlink"/>
+          <w:hyperlink w:anchor="_Toc223984725" w:history="1">
+            <w:r>
+              <w:rPr>
+                <w:rStyle w:val="Hiperhivatkozs"/>
                 <w:rFonts w:eastAsia="Arial"/>
                 <w:noProof/>
               </w:rPr>
@@ -1309,7 +1309,7 @@
                 <w:noProof/>
                 <w:webHidden/>
               </w:rPr>
-              <w:instrText xml:space="preserve"> PAGEREF _Toc223805777 \h </w:instrText>
+              <w:instrText xml:space="preserve"> PAGEREF _Toc223984725 \h </w:instrText>
             </w:r>
             <w:r>
               <w:rPr>
@@ -1342,20 +1342,20 @@
         </w:p>
         <w:p>
           <w:pPr>
-            <w:pStyle w:val="TOC3"/>
+            <w:pStyle w:val="TJ3"/>
             <w:tabs>
               <w:tab w:val="right" w:leader="dot" w:pos="9062"/>
             </w:tabs>
             <w:rPr>
               <w:rFonts w:eastAsiaTheme="minorEastAsia"/>
               <w:noProof/>
-              <w:lang w:val="en-US"/>
+              <w:lang w:eastAsia="hu-HU"/>
             </w:rPr>
           </w:pPr>
-          <w:hyperlink w:anchor="_Toc223805778" w:history="1">
-            <w:r>
-              <w:rPr>
-                <w:rStyle w:val="Hyperlink"/>
+          <w:hyperlink w:anchor="_Toc223984726" w:history="1">
+            <w:r>
+              <w:rPr>
+                <w:rStyle w:val="Hiperhivatkozs"/>
                 <w:noProof/>
               </w:rPr>
               <w:t>2.5.2 Enrollments tábla (Beiratkozások)</w:t>
@@ -1379,7 +1379,7 @@
                 <w:noProof/>
                 <w:webHidden/>
               </w:rPr>
-              <w:instrText xml:space="preserve"> PAGEREF _Toc223805778 \h </w:instrText>
+              <w:instrText xml:space="preserve"> PAGEREF _Toc223984726 \h </w:instrText>
             </w:r>
             <w:r>
               <w:rPr>
@@ -1412,20 +1412,20 @@
         </w:p>
         <w:p>
           <w:pPr>
-            <w:pStyle w:val="TOC3"/>
+            <w:pStyle w:val="TJ3"/>
             <w:tabs>
               <w:tab w:val="right" w:leader="dot" w:pos="9062"/>
             </w:tabs>
             <w:rPr>
               <w:rFonts w:eastAsiaTheme="minorEastAsia"/>
               <w:noProof/>
-              <w:lang w:val="en-US"/>
+              <w:lang w:eastAsia="hu-HU"/>
             </w:rPr>
           </w:pPr>
-          <w:hyperlink w:anchor="_Toc223805779" w:history="1">
-            <w:r>
-              <w:rPr>
-                <w:rStyle w:val="Hyperlink"/>
+          <w:hyperlink w:anchor="_Toc223984727" w:history="1">
+            <w:r>
+              <w:rPr>
+                <w:rStyle w:val="Hiperhivatkozs"/>
                 <w:noProof/>
               </w:rPr>
               <w:t>2.5.3 Subjects tábla (Tantárgyak)</w:t>
@@ -1449,7 +1449,7 @@
                 <w:noProof/>
                 <w:webHidden/>
               </w:rPr>
-              <w:instrText xml:space="preserve"> PAGEREF _Toc223805779 \h </w:instrText>
+              <w:instrText xml:space="preserve"> PAGEREF _Toc223984727 \h </w:instrText>
             </w:r>
             <w:r>
               <w:rPr>
@@ -1482,20 +1482,20 @@
         </w:p>
         <w:p>
           <w:pPr>
-            <w:pStyle w:val="TOC3"/>
+            <w:pStyle w:val="TJ3"/>
             <w:tabs>
               <w:tab w:val="right" w:leader="dot" w:pos="9062"/>
             </w:tabs>
             <w:rPr>
               <w:rFonts w:eastAsiaTheme="minorEastAsia"/>
               <w:noProof/>
-              <w:lang w:val="en-US"/>
+              <w:lang w:eastAsia="hu-HU"/>
             </w:rPr>
           </w:pPr>
-          <w:hyperlink w:anchor="_Toc223805780" w:history="1">
-            <w:r>
-              <w:rPr>
-                <w:rStyle w:val="Hyperlink"/>
+          <w:hyperlink w:anchor="_Toc223984728" w:history="1">
+            <w:r>
+              <w:rPr>
+                <w:rStyle w:val="Hiperhivatkozs"/>
                 <w:noProof/>
               </w:rPr>
               <w:t>2.5.4 ScheduleEntries tábla (Órarend)</w:t>
@@ -1519,7 +1519,7 @@
                 <w:noProof/>
                 <w:webHidden/>
               </w:rPr>
-              <w:instrText xml:space="preserve"> PAGEREF _Toc223805780 \h </w:instrText>
+              <w:instrText xml:space="preserve"> PAGEREF _Toc223984728 \h </w:instrText>
             </w:r>
             <w:r>
               <w:rPr>
@@ -1540,6 +1540,154 @@
                 <w:webHidden/>
               </w:rPr>
               <w:t>7</w:t>
+            </w:r>
+            <w:r>
+              <w:rPr>
+                <w:noProof/>
+                <w:webHidden/>
+              </w:rPr>
+              <w:fldChar w:fldCharType="end"/>
+            </w:r>
+          </w:hyperlink>
+        </w:p>
+        <w:p>
+          <w:pPr>
+            <w:pStyle w:val="TJ3"/>
+            <w:tabs>
+              <w:tab w:val="right" w:leader="dot" w:pos="9062"/>
+            </w:tabs>
+            <w:rPr>
+              <w:rFonts w:eastAsiaTheme="minorEastAsia"/>
+              <w:noProof/>
+              <w:lang w:eastAsia="hu-HU"/>
+            </w:rPr>
+          </w:pPr>
+          <w:hyperlink w:anchor="_Toc223984729" w:history="1">
+            <w:r>
+              <w:rPr>
+                <w:rStyle w:val="Hiperhivatkozs"/>
+                <w:noProof/>
+              </w:rPr>
+              <w:t xml:space="preserve">2.5.5 </w:t>
+            </w:r>
+            <w:r>
+              <w:rPr>
+                <w:rStyle w:val="Hiperhivatkozs"/>
+                <w:rFonts w:eastAsia="Arial"/>
+                <w:noProof/>
+              </w:rPr>
+              <w:t>Backend-Frontend kapcsolat</w:t>
+            </w:r>
+            <w:r>
+              <w:rPr>
+                <w:noProof/>
+                <w:webHidden/>
+              </w:rPr>
+              <w:tab/>
+            </w:r>
+            <w:r>
+              <w:rPr>
+                <w:noProof/>
+                <w:webHidden/>
+              </w:rPr>
+              <w:fldChar w:fldCharType="begin"/>
+            </w:r>
+            <w:r>
+              <w:rPr>
+                <w:noProof/>
+                <w:webHidden/>
+              </w:rPr>
+              <w:instrText xml:space="preserve"> PAGEREF _Toc223984729 \h </w:instrText>
+            </w:r>
+            <w:r>
+              <w:rPr>
+                <w:noProof/>
+                <w:webHidden/>
+              </w:rPr>
+            </w:r>
+            <w:r>
+              <w:rPr>
+                <w:noProof/>
+                <w:webHidden/>
+              </w:rPr>
+              <w:fldChar w:fldCharType="separate"/>
+            </w:r>
+            <w:r>
+              <w:rPr>
+                <w:noProof/>
+                <w:webHidden/>
+              </w:rPr>
+              <w:t>8</w:t>
+            </w:r>
+            <w:r>
+              <w:rPr>
+                <w:noProof/>
+                <w:webHidden/>
+              </w:rPr>
+              <w:fldChar w:fldCharType="end"/>
+            </w:r>
+          </w:hyperlink>
+        </w:p>
+        <w:p>
+          <w:pPr>
+            <w:pStyle w:val="TJ2"/>
+            <w:tabs>
+              <w:tab w:val="right" w:leader="dot" w:pos="9062"/>
+            </w:tabs>
+            <w:rPr>
+              <w:rFonts w:eastAsiaTheme="minorEastAsia"/>
+              <w:noProof/>
+              <w:lang w:eastAsia="hu-HU"/>
+            </w:rPr>
+          </w:pPr>
+          <w:hyperlink w:anchor="_Toc223984730" w:history="1">
+            <w:r>
+              <w:rPr>
+                <w:rStyle w:val="Hiperhivatkozs"/>
+                <w:noProof/>
+              </w:rPr>
+              <w:t>2.7 JWT Autentikáció és Jogosultságkezelés</w:t>
+            </w:r>
+            <w:r>
+              <w:rPr>
+                <w:noProof/>
+                <w:webHidden/>
+              </w:rPr>
+              <w:tab/>
+            </w:r>
+            <w:r>
+              <w:rPr>
+                <w:noProof/>
+                <w:webHidden/>
+              </w:rPr>
+              <w:fldChar w:fldCharType="begin"/>
+            </w:r>
+            <w:r>
+              <w:rPr>
+                <w:noProof/>
+                <w:webHidden/>
+              </w:rPr>
+              <w:instrText xml:space="preserve"> PAGEREF _Toc223984730 \h </w:instrText>
+            </w:r>
+            <w:r>
+              <w:rPr>
+                <w:noProof/>
+                <w:webHidden/>
+              </w:rPr>
+            </w:r>
+            <w:r>
+              <w:rPr>
+                <w:noProof/>
+                <w:webHidden/>
+              </w:rPr>
+              <w:fldChar w:fldCharType="separate"/>
+            </w:r>
+            <w:r>
+              <w:rPr>
+                <w:noProof/>
+                <w:webHidden/>
+              </w:rPr>
+              <w:t>8</w:t>
             </w:r>
             <w:r>
               <w:rPr>
@@ -1584,13 +1732,13 @@
     </w:p>
     <w:p>
       <w:pPr>
-        <w:pStyle w:val="Heading1"/>
+        <w:pStyle w:val="Cmsor1"/>
         <w:jc w:val="both"/>
         <w:rPr>
           <w:rFonts w:cstheme="minorHAnsi"/>
         </w:rPr>
       </w:pPr>
-      <w:bookmarkStart w:id="1" w:name="_Toc223805761"/>
+      <w:bookmarkStart w:id="1" w:name="_Toc223984709"/>
       <w:r>
         <w:rPr>
           <w:rFonts w:cstheme="minorHAnsi"/>
@@ -1602,18 +1750,18 @@
     </w:p>
     <w:p>
       <w:pPr>
-        <w:pStyle w:val="NormalWeb"/>
+        <w:pStyle w:val="NormlWeb"/>
         <w:spacing w:line="400" w:lineRule="exact"/>
         <w:jc w:val="both"/>
         <w:rPr>
-          <w:rStyle w:val="Heading2Char"/>
+          <w:rStyle w:val="Cmsor2Char"/>
           <w:rFonts w:asciiTheme="minorHAnsi" w:hAnsiTheme="minorHAnsi"/>
         </w:rPr>
       </w:pPr>
-      <w:bookmarkStart w:id="2" w:name="_Toc223805762"/>
-      <w:r>
-        <w:rPr>
-          <w:rStyle w:val="Heading2Char"/>
+      <w:bookmarkStart w:id="2" w:name="_Toc223984710"/>
+      <w:r>
+        <w:rPr>
+          <w:rStyle w:val="Cmsor2Char"/>
           <w:rFonts w:asciiTheme="minorHAnsi" w:hAnsiTheme="minorHAnsi"/>
         </w:rPr>
         <w:t>1.1 Projekt célja</w:t>
@@ -1622,7 +1770,7 @@
     </w:p>
     <w:p>
       <w:pPr>
-        <w:pStyle w:val="NormalWeb"/>
+        <w:pStyle w:val="NormlWeb"/>
         <w:spacing w:line="360" w:lineRule="auto"/>
         <w:jc w:val="both"/>
         <w:rPr>
@@ -1637,7 +1785,7 @@
       </w:r>
       <w:r>
         <w:rPr>
-          <w:rStyle w:val="Strong"/>
+          <w:rStyle w:val="Kiemels2"/>
           <w:rFonts w:asciiTheme="minorHAnsi" w:hAnsiTheme="minorHAnsi" w:cstheme="minorHAnsi"/>
         </w:rPr>
         <w:t>diákok és tanárok számára készült online naptár- és feladatkezelő platform</w:t>
@@ -1663,13 +1811,13 @@
     </w:p>
     <w:p>
       <w:pPr>
-        <w:pStyle w:val="Heading2"/>
+        <w:pStyle w:val="Cmsor2"/>
         <w:jc w:val="both"/>
       </w:pPr>
-      <w:bookmarkStart w:id="3" w:name="_Toc223805763"/>
-      <w:r>
-        <w:rPr>
-          <w:rStyle w:val="Strong"/>
+      <w:bookmarkStart w:id="3" w:name="_Toc223984711"/>
+      <w:r>
+        <w:rPr>
+          <w:rStyle w:val="Kiemels2"/>
           <w:b w:val="0"/>
           <w:bCs w:val="0"/>
         </w:rPr>
@@ -1749,13 +1897,13 @@
     </w:p>
     <w:p>
       <w:pPr>
-        <w:pStyle w:val="Heading2"/>
+        <w:pStyle w:val="Cmsor2"/>
         <w:jc w:val="both"/>
       </w:pPr>
-      <w:bookmarkStart w:id="4" w:name="_Toc223805764"/>
-      <w:r>
-        <w:rPr>
-          <w:rStyle w:val="Strong"/>
+      <w:bookmarkStart w:id="4" w:name="_Toc223984712"/>
+      <w:r>
+        <w:rPr>
+          <w:rStyle w:val="Kiemels2"/>
           <w:b w:val="0"/>
           <w:bCs w:val="0"/>
         </w:rPr>
@@ -1765,7 +1913,7 @@
     </w:p>
     <w:p>
       <w:pPr>
-        <w:pStyle w:val="NormalWeb"/>
+        <w:pStyle w:val="NormlWeb"/>
         <w:spacing w:line="360" w:lineRule="auto"/>
         <w:jc w:val="both"/>
         <w:rPr>
@@ -1786,10 +1934,10 @@
           <w:rFonts w:cstheme="minorHAnsi"/>
         </w:rPr>
       </w:pPr>
-      <w:bookmarkStart w:id="5" w:name="_Toc223805765"/>
-      <w:r>
-        <w:rPr>
-          <w:rStyle w:val="Heading2Char"/>
+      <w:bookmarkStart w:id="5" w:name="_Toc223984713"/>
+      <w:r>
+        <w:rPr>
+          <w:rStyle w:val="Cmsor2Char"/>
           <w:rFonts w:eastAsiaTheme="minorHAnsi"/>
         </w:rPr>
         <w:t>1.4 Csoport tagjai és munkamegosztás</w:t>
@@ -1798,7 +1946,7 @@
     </w:p>
     <w:p>
       <w:pPr>
-        <w:pStyle w:val="NormalWeb"/>
+        <w:pStyle w:val="NormlWeb"/>
         <w:spacing w:line="360" w:lineRule="auto"/>
         <w:jc w:val="both"/>
         <w:rPr>
@@ -1814,10 +1962,10 @@
     </w:p>
     <w:p>
       <w:pPr>
-        <w:pStyle w:val="Heading3"/>
+        <w:pStyle w:val="Cmsor3"/>
         <w:jc w:val="both"/>
       </w:pPr>
-      <w:bookmarkStart w:id="6" w:name="_Toc223805766"/>
+      <w:bookmarkStart w:id="6" w:name="_Toc223984714"/>
       <w:r>
         <w:t>1.4.1 Tarcsányi Csongor Márk feladatai</w:t>
       </w:r>
@@ -1825,7 +1973,7 @@
     </w:p>
     <w:p>
       <w:pPr>
-        <w:pStyle w:val="ListParagraph"/>
+        <w:pStyle w:val="Listaszerbekezds"/>
         <w:numPr>
           <w:ilvl w:val="0"/>
           <w:numId w:val="2"/>
@@ -1880,7 +2028,7 @@
     </w:p>
     <w:p>
       <w:pPr>
-        <w:pStyle w:val="ListParagraph"/>
+        <w:pStyle w:val="Listaszerbekezds"/>
         <w:numPr>
           <w:ilvl w:val="0"/>
           <w:numId w:val="2"/>
@@ -1935,7 +2083,7 @@
     </w:p>
     <w:p>
       <w:pPr>
-        <w:pStyle w:val="ListParagraph"/>
+        <w:pStyle w:val="Listaszerbekezds"/>
         <w:numPr>
           <w:ilvl w:val="0"/>
           <w:numId w:val="2"/>
@@ -1958,10 +2106,10 @@
     </w:p>
     <w:p>
       <w:pPr>
-        <w:pStyle w:val="Heading3"/>
+        <w:pStyle w:val="Cmsor3"/>
         <w:jc w:val="both"/>
       </w:pPr>
-      <w:bookmarkStart w:id="7" w:name="_Toc223805767"/>
+      <w:bookmarkStart w:id="7" w:name="_Toc223984715"/>
       <w:r>
         <w:t>1.4.2 Lőrincz Antal feladatai</w:t>
       </w:r>
@@ -1969,7 +2117,7 @@
     </w:p>
     <w:p>
       <w:pPr>
-        <w:pStyle w:val="ListParagraph"/>
+        <w:pStyle w:val="Listaszerbekezds"/>
         <w:numPr>
           <w:ilvl w:val="0"/>
           <w:numId w:val="4"/>
@@ -1992,7 +2140,7 @@
     </w:p>
     <w:p>
       <w:pPr>
-        <w:pStyle w:val="ListParagraph"/>
+        <w:pStyle w:val="Listaszerbekezds"/>
         <w:numPr>
           <w:ilvl w:val="0"/>
           <w:numId w:val="3"/>
@@ -2015,7 +2163,7 @@
     </w:p>
     <w:p>
       <w:pPr>
-        <w:pStyle w:val="ListParagraph"/>
+        <w:pStyle w:val="Listaszerbekezds"/>
         <w:jc w:val="both"/>
         <w:rPr>
           <w:rFonts w:cstheme="minorHAnsi"/>
@@ -2024,7 +2172,7 @@
     </w:p>
     <w:p>
       <w:pPr>
-        <w:pStyle w:val="ListParagraph"/>
+        <w:pStyle w:val="Listaszerbekezds"/>
         <w:jc w:val="both"/>
         <w:rPr>
           <w:rFonts w:cstheme="minorHAnsi"/>
@@ -2033,10 +2181,10 @@
     </w:p>
     <w:p>
       <w:pPr>
-        <w:pStyle w:val="Heading3"/>
+        <w:pStyle w:val="Cmsor3"/>
         <w:jc w:val="both"/>
       </w:pPr>
-      <w:bookmarkStart w:id="8" w:name="_Toc223805768"/>
+      <w:bookmarkStart w:id="8" w:name="_Toc223984716"/>
       <w:r>
         <w:lastRenderedPageBreak/>
         <w:t>1.4.3 Le Tuan Anh (Róbert) feladatai</w:t>
@@ -2045,7 +2193,7 @@
     </w:p>
     <w:p>
       <w:pPr>
-        <w:pStyle w:val="ListParagraph"/>
+        <w:pStyle w:val="Listaszerbekezds"/>
         <w:numPr>
           <w:ilvl w:val="0"/>
           <w:numId w:val="3"/>
@@ -2084,7 +2232,7 @@
     </w:p>
     <w:p>
       <w:pPr>
-        <w:pStyle w:val="ListParagraph"/>
+        <w:pStyle w:val="Listaszerbekezds"/>
         <w:numPr>
           <w:ilvl w:val="0"/>
           <w:numId w:val="3"/>
@@ -2107,7 +2255,7 @@
     </w:p>
     <w:p>
       <w:pPr>
-        <w:pStyle w:val="ListParagraph"/>
+        <w:pStyle w:val="Listaszerbekezds"/>
         <w:numPr>
           <w:ilvl w:val="0"/>
           <w:numId w:val="3"/>
@@ -2130,7 +2278,7 @@
     </w:p>
     <w:p>
       <w:pPr>
-        <w:pStyle w:val="ListParagraph"/>
+        <w:pStyle w:val="Listaszerbekezds"/>
         <w:jc w:val="both"/>
         <w:rPr>
           <w:rFonts w:cstheme="minorHAnsi"/>
@@ -2139,10 +2287,10 @@
     </w:p>
     <w:p>
       <w:pPr>
-        <w:pStyle w:val="Heading3"/>
+        <w:pStyle w:val="Cmsor3"/>
         <w:jc w:val="both"/>
       </w:pPr>
-      <w:bookmarkStart w:id="9" w:name="_Toc223805769"/>
+      <w:bookmarkStart w:id="9" w:name="_Toc223984717"/>
       <w:r>
         <w:t>1.4.4 Közös fejlesztések</w:t>
       </w:r>
@@ -2150,7 +2298,7 @@
     </w:p>
     <w:p>
       <w:pPr>
-        <w:pStyle w:val="NormalWeb"/>
+        <w:pStyle w:val="NormlWeb"/>
         <w:numPr>
           <w:ilvl w:val="0"/>
           <w:numId w:val="6"/>
@@ -2169,7 +2317,7 @@
     </w:p>
     <w:p>
       <w:pPr>
-        <w:pStyle w:val="NormalWeb"/>
+        <w:pStyle w:val="NormlWeb"/>
         <w:numPr>
           <w:ilvl w:val="0"/>
           <w:numId w:val="6"/>
@@ -2188,7 +2336,7 @@
     </w:p>
     <w:p>
       <w:pPr>
-        <w:pStyle w:val="NormalWeb"/>
+        <w:pStyle w:val="NormlWeb"/>
         <w:numPr>
           <w:ilvl w:val="0"/>
           <w:numId w:val="6"/>
@@ -2215,10 +2363,10 @@
     </w:p>
     <w:p>
       <w:pPr>
-        <w:pStyle w:val="Heading2"/>
+        <w:pStyle w:val="Cmsor2"/>
         <w:jc w:val="both"/>
       </w:pPr>
-      <w:bookmarkStart w:id="10" w:name="_Toc223805770"/>
+      <w:bookmarkStart w:id="10" w:name="_Toc223984718"/>
       <w:r>
         <w:t>1.5 Szükséges adatok a megvalósításhoz</w:t>
       </w:r>
@@ -2349,7 +2497,7 @@
     </w:p>
     <w:p>
       <w:pPr>
-        <w:pStyle w:val="Heading1"/>
+        <w:pStyle w:val="Cmsor1"/>
         <w:jc w:val="both"/>
         <w:rPr>
           <w:rFonts w:cstheme="minorHAnsi"/>
@@ -2357,7 +2505,7 @@
         </w:rPr>
       </w:pPr>
       <w:bookmarkStart w:id="11" w:name="_Toc223536920"/>
-      <w:bookmarkStart w:id="12" w:name="_Toc223805771"/>
+      <w:bookmarkStart w:id="12" w:name="_Toc223984719"/>
       <w:r>
         <w:rPr>
           <w:rFonts w:cstheme="minorHAnsi"/>
@@ -2371,11 +2519,11 @@
     </w:p>
     <w:p>
       <w:pPr>
-        <w:pStyle w:val="Heading2"/>
+        <w:pStyle w:val="Cmsor2"/>
         <w:jc w:val="both"/>
       </w:pPr>
       <w:bookmarkStart w:id="13" w:name="_Toc223536921"/>
-      <w:bookmarkStart w:id="14" w:name="_Toc223805772"/>
+      <w:bookmarkStart w:id="14" w:name="_Toc223984720"/>
       <w:r>
         <w:t>2.1 Alkalmazás áttekintés</w:t>
       </w:r>
@@ -2419,11 +2567,11 @@
     </w:p>
     <w:p>
       <w:pPr>
-        <w:pStyle w:val="Heading2"/>
+        <w:pStyle w:val="Cmsor2"/>
         <w:jc w:val="both"/>
       </w:pPr>
       <w:bookmarkStart w:id="15" w:name="_Toc223536922"/>
-      <w:bookmarkStart w:id="16" w:name="_Toc223805773"/>
+      <w:bookmarkStart w:id="16" w:name="_Toc223984721"/>
       <w:r>
         <w:t>2.2 Felhasznált szoftverek</w:t>
       </w:r>
@@ -2666,11 +2814,11 @@
     </w:p>
     <w:p>
       <w:pPr>
-        <w:pStyle w:val="Heading2"/>
+        <w:pStyle w:val="Cmsor2"/>
         <w:jc w:val="both"/>
       </w:pPr>
       <w:bookmarkStart w:id="17" w:name="_Toc223536923"/>
-      <w:bookmarkStart w:id="18" w:name="_Toc223805774"/>
+      <w:bookmarkStart w:id="18" w:name="_Toc223984722"/>
       <w:r>
         <w:t>2.3 Github</w:t>
       </w:r>
@@ -2697,11 +2845,11 @@
     </w:p>
     <w:p>
       <w:pPr>
-        <w:pStyle w:val="Heading2"/>
+        <w:pStyle w:val="Cmsor2"/>
         <w:jc w:val="both"/>
       </w:pPr>
       <w:bookmarkStart w:id="19" w:name="_Toc223536924"/>
-      <w:bookmarkStart w:id="20" w:name="_Toc223805775"/>
+      <w:bookmarkStart w:id="20" w:name="_Toc223984723"/>
       <w:r>
         <w:t>2.4 Fő funkciók</w:t>
       </w:r>
@@ -2710,7 +2858,7 @@
     </w:p>
     <w:p>
       <w:pPr>
-        <w:pStyle w:val="NormalWeb"/>
+        <w:pStyle w:val="NormlWeb"/>
         <w:jc w:val="both"/>
         <w:rPr>
           <w:rFonts w:asciiTheme="minorHAnsi" w:hAnsiTheme="minorHAnsi" w:cstheme="minorHAnsi"/>
@@ -2719,7 +2867,7 @@
       </w:pPr>
       <w:r>
         <w:rPr>
-          <w:rStyle w:val="Strong"/>
+          <w:rStyle w:val="Kiemels2"/>
           <w:rFonts w:asciiTheme="minorHAnsi" w:hAnsiTheme="minorHAnsi" w:cstheme="minorHAnsi"/>
           <w:b w:val="0"/>
           <w:sz w:val="28"/>
@@ -2729,7 +2877,7 @@
     </w:p>
     <w:p>
       <w:pPr>
-        <w:pStyle w:val="NormalWeb"/>
+        <w:pStyle w:val="NormlWeb"/>
         <w:numPr>
           <w:ilvl w:val="0"/>
           <w:numId w:val="7"/>
@@ -2748,7 +2896,7 @@
     </w:p>
     <w:p>
       <w:pPr>
-        <w:pStyle w:val="NormalWeb"/>
+        <w:pStyle w:val="NormlWeb"/>
         <w:numPr>
           <w:ilvl w:val="0"/>
           <w:numId w:val="7"/>
@@ -2767,7 +2915,7 @@
     </w:p>
     <w:p>
       <w:pPr>
-        <w:pStyle w:val="NormalWeb"/>
+        <w:pStyle w:val="NormlWeb"/>
         <w:numPr>
           <w:ilvl w:val="0"/>
           <w:numId w:val="7"/>
@@ -2786,7 +2934,7 @@
     </w:p>
     <w:p>
       <w:pPr>
-        <w:pStyle w:val="NormalWeb"/>
+        <w:pStyle w:val="NormlWeb"/>
         <w:jc w:val="both"/>
         <w:rPr>
           <w:rFonts w:asciiTheme="minorHAnsi" w:hAnsiTheme="minorHAnsi" w:cstheme="minorHAnsi"/>
@@ -2795,7 +2943,7 @@
       </w:pPr>
       <w:r>
         <w:rPr>
-          <w:rStyle w:val="Strong"/>
+          <w:rStyle w:val="Kiemels2"/>
           <w:rFonts w:asciiTheme="minorHAnsi" w:hAnsiTheme="minorHAnsi" w:cstheme="minorHAnsi"/>
           <w:b w:val="0"/>
           <w:sz w:val="28"/>
@@ -2805,7 +2953,7 @@
     </w:p>
     <w:p>
       <w:pPr>
-        <w:pStyle w:val="NormalWeb"/>
+        <w:pStyle w:val="NormlWeb"/>
         <w:numPr>
           <w:ilvl w:val="0"/>
           <w:numId w:val="8"/>
@@ -2824,7 +2972,7 @@
     </w:p>
     <w:p>
       <w:pPr>
-        <w:pStyle w:val="NormalWeb"/>
+        <w:pStyle w:val="NormlWeb"/>
         <w:numPr>
           <w:ilvl w:val="0"/>
           <w:numId w:val="8"/>
@@ -2843,7 +2991,7 @@
     </w:p>
     <w:p>
       <w:pPr>
-        <w:pStyle w:val="NormalWeb"/>
+        <w:pStyle w:val="NormlWeb"/>
         <w:numPr>
           <w:ilvl w:val="0"/>
           <w:numId w:val="8"/>
@@ -2862,14 +3010,14 @@
     </w:p>
     <w:p>
       <w:pPr>
-        <w:pStyle w:val="Heading2"/>
+        <w:pStyle w:val="Cmsor2"/>
         <w:jc w:val="both"/>
         <w:rPr>
           <w:rFonts w:eastAsia="Arial"/>
         </w:rPr>
       </w:pPr>
       <w:bookmarkStart w:id="21" w:name="_Toc223536925"/>
-      <w:bookmarkStart w:id="22" w:name="_Toc223805776"/>
+      <w:bookmarkStart w:id="22" w:name="_Toc223984724"/>
       <w:r>
         <w:rPr>
           <w:rFonts w:eastAsia="Arial"/>
@@ -2899,7 +3047,7 @@
     </w:p>
     <w:p>
       <w:pPr>
-        <w:pStyle w:val="Heading3"/>
+        <w:pStyle w:val="Cmsor3"/>
         <w:spacing w:before="240"/>
         <w:jc w:val="both"/>
         <w:rPr>
@@ -2907,7 +3055,7 @@
         </w:rPr>
       </w:pPr>
       <w:bookmarkStart w:id="23" w:name="_Toc223536926"/>
-      <w:bookmarkStart w:id="24" w:name="_Toc223805777"/>
+      <w:bookmarkStart w:id="24" w:name="_Toc223984725"/>
       <w:r>
         <w:rPr>
           <w:rFonts w:eastAsia="Arial"/>
@@ -2968,7 +3116,7 @@
               <w:bottom w:val="single" w:sz="4" w:space="0" w:color="auto"/>
               <w:right w:val="single" w:sz="4" w:space="0" w:color="auto"/>
             </w:tcBorders>
-            <w:shd w:val="clear" w:color="auto" w:fill="2E75B6"/>
+            <w:shd w:val="clear" w:color="auto" w:fill="2563EB"/>
             <w:tcMar>
               <w:top w:w="80" w:type="dxa"/>
               <w:left w:w="120" w:type="dxa"/>
@@ -3002,7 +3150,7 @@
               <w:bottom w:val="single" w:sz="4" w:space="0" w:color="auto"/>
               <w:right w:val="single" w:sz="4" w:space="0" w:color="auto"/>
             </w:tcBorders>
-            <w:shd w:val="clear" w:color="auto" w:fill="2E75B6"/>
+            <w:shd w:val="clear" w:color="auto" w:fill="2563EB"/>
             <w:tcMar>
               <w:top w:w="80" w:type="dxa"/>
               <w:left w:w="120" w:type="dxa"/>
@@ -3036,7 +3184,7 @@
               <w:bottom w:val="single" w:sz="4" w:space="0" w:color="auto"/>
               <w:right w:val="single" w:sz="4" w:space="0" w:color="auto"/>
             </w:tcBorders>
-            <w:shd w:val="clear" w:color="auto" w:fill="2E75B6"/>
+            <w:shd w:val="clear" w:color="auto" w:fill="2563EB"/>
             <w:tcMar>
               <w:top w:w="80" w:type="dxa"/>
               <w:left w:w="120" w:type="dxa"/>
@@ -3837,9 +3985,9 @@
     </w:p>
     <w:p>
       <w:pPr>
-        <w:pStyle w:val="Heading3"/>
-      </w:pPr>
-      <w:bookmarkStart w:id="25" w:name="_Toc223805778"/>
+        <w:pStyle w:val="Cmsor3"/>
+      </w:pPr>
+      <w:bookmarkStart w:id="25" w:name="_Toc223984726"/>
       <w:r>
         <w:t>2.5.2 Enrollments tábla (Beiratkozások)</w:t>
       </w:r>
@@ -4200,9 +4348,9 @@
     </w:p>
     <w:p>
       <w:pPr>
-        <w:pStyle w:val="Heading3"/>
-      </w:pPr>
-      <w:bookmarkStart w:id="26" w:name="_Toc223805779"/>
+        <w:pStyle w:val="Cmsor3"/>
+      </w:pPr>
+      <w:bookmarkStart w:id="26" w:name="_Toc223984727"/>
       <w:r>
         <w:lastRenderedPageBreak/>
         <w:t>2.5.3 Subjects tábla (Tantárgyak)</w:t>
@@ -4752,9 +4900,9 @@
     </w:p>
     <w:p>
       <w:pPr>
-        <w:pStyle w:val="Heading3"/>
-      </w:pPr>
-      <w:bookmarkStart w:id="27" w:name="_Toc223805780"/>
+        <w:pStyle w:val="Cmsor3"/>
+      </w:pPr>
+      <w:bookmarkStart w:id="27" w:name="_Toc223984728"/>
       <w:r>
         <w:t>2.5.4 ScheduleEntries tábla (Órarend)</w:t>
       </w:r>
@@ -5486,14 +5634,7 @@
                 <w:sz w:val="20"/>
                 <w:szCs w:val="20"/>
               </w:rPr>
-              <w:t>Recurrence</w:t>
-            </w:r>
-            <w:r>
-              <w:rPr>
-                <w:sz w:val="20"/>
-                <w:szCs w:val="20"/>
-              </w:rPr>
-              <w:t>EndDate</w:t>
+              <w:t>RecurrenceEndDate</w:t>
             </w:r>
           </w:p>
         </w:tc>
@@ -5539,14 +5680,7 @@
                 <w:sz w:val="20"/>
                 <w:szCs w:val="20"/>
               </w:rPr>
-              <w:t>Ismétlődés:</w:t>
-            </w:r>
-            <w:r>
-              <w:rPr>
-                <w:sz w:val="20"/>
-                <w:szCs w:val="20"/>
-              </w:rPr>
-              <w:t>befejezési dátuma</w:t>
+              <w:t>Ismétlődés:befejezési dátuma</w:t>
             </w:r>
           </w:p>
         </w:tc>
@@ -5640,18 +5774,1094 @@
       <w:pPr>
         <w:spacing w:before="80" w:after="80"/>
         <w:jc w:val="both"/>
-      </w:pPr>
-      <w:r>
-        <w:rPr>
-          <w:sz w:val="24"/>
-          <w:szCs w:val="24"/>
-        </w:rPr>
-        <w:t>A ScheduleEntries tábla tárolja a diákok személyes órarendjeit. A DayOfWeek mező 1-től 7-ig terjed, ahol 1 a hétfőt és 7 a vasárnapot jelenti. A StartTime és EndTime mezők "HH:mm" formátumban tárolják az óra kezdését és végét. A RecurrenceType határozza meg az ismétlődés típusát: None (egyszeri), Weekly (heti), Biweekly (kétheatente), Monthly (havonta). A rendszer automatikusan felismeri, ha egy óra éppen folyamatban van, és ezt a dashboardon jelzi a felhasználónak.</w:t>
+        <w:rPr>
+          <w:sz w:val="24"/>
+          <w:szCs w:val="24"/>
+        </w:rPr>
+      </w:pPr>
+      <w:r>
+        <w:rPr>
+          <w:sz w:val="24"/>
+          <w:szCs w:val="24"/>
+        </w:rPr>
+        <w:t xml:space="preserve">A ScheduleEntries tábla tárolja a diákok személyes órarendjeit. A DayOfWeek mező 1-től 7-ig terjed, ahol 1 a hétfőt és 7 a vasárnapot jelenti. A StartTime és EndTime mezők "HH:mm" formátumban tárolják az óra kezdését és végét. A RecurrenceType határozza meg az ismétlődés típusát: None (egyszeri), Weekly (heti), Biweekly (kétheatente), Monthly (havonta). A rendszer automatikusan felismeri, ha egy óra éppen folyamatban van, és ezt a </w:t>
+      </w:r>
+      <w:proofErr w:type="spellStart"/>
+      <w:r>
+        <w:rPr>
+          <w:sz w:val="24"/>
+          <w:szCs w:val="24"/>
+        </w:rPr>
+        <w:t>dashboardon</w:t>
+      </w:r>
+      <w:proofErr w:type="spellEnd"/>
+      <w:r>
+        <w:rPr>
+          <w:sz w:val="24"/>
+          <w:szCs w:val="24"/>
+        </w:rPr>
+        <w:t xml:space="preserve"> jelzi a felhasználónak.</w:t>
       </w:r>
     </w:p>
     <w:p>
       <w:pPr>
-        <w:pStyle w:val="NormalWeb"/>
+        <w:pStyle w:val="Cmsor3"/>
+      </w:pPr>
+      <w:bookmarkStart w:id="28" w:name="_Toc223984729"/>
+      <w:r>
+        <w:t xml:space="preserve">2.5.5 </w:t>
+      </w:r>
+      <w:r>
+        <w:rPr>
+          <w:rFonts w:eastAsia="Arial"/>
+        </w:rPr>
+        <w:t>Backend-Frontend kapcsolat</w:t>
+      </w:r>
+      <w:bookmarkEnd w:id="28"/>
+    </w:p>
+    <w:p>
+      <w:pPr>
+        <w:spacing w:before="80" w:after="80"/>
+        <w:jc w:val="both"/>
+        <w:rPr>
+          <w:sz w:val="24"/>
+          <w:szCs w:val="24"/>
+        </w:rPr>
+      </w:pPr>
+      <w:r>
+        <w:rPr>
+          <w:sz w:val="24"/>
+          <w:szCs w:val="24"/>
+        </w:rPr>
+        <w:t xml:space="preserve">A </w:t>
+      </w:r>
+      <w:proofErr w:type="spellStart"/>
+      <w:r>
+        <w:rPr>
+          <w:sz w:val="24"/>
+          <w:szCs w:val="24"/>
+        </w:rPr>
+        <w:t>Blazor</w:t>
+      </w:r>
+      <w:proofErr w:type="spellEnd"/>
+      <w:r>
+        <w:rPr>
+          <w:sz w:val="24"/>
+          <w:szCs w:val="24"/>
+        </w:rPr>
+        <w:t xml:space="preserve"> Server alkalmaz</w:t>
+      </w:r>
+      <w:r>
+        <w:rPr>
+          <w:sz w:val="24"/>
+          <w:szCs w:val="24"/>
+        </w:rPr>
+        <w:t>á</w:t>
+      </w:r>
+      <w:r>
+        <w:rPr>
+          <w:sz w:val="24"/>
+          <w:szCs w:val="24"/>
+        </w:rPr>
+        <w:t>s k</w:t>
+      </w:r>
+      <w:r>
+        <w:rPr>
+          <w:sz w:val="24"/>
+          <w:szCs w:val="24"/>
+        </w:rPr>
+        <w:t>ö</w:t>
+      </w:r>
+      <w:r>
+        <w:rPr>
+          <w:sz w:val="24"/>
+          <w:szCs w:val="24"/>
+        </w:rPr>
+        <w:t>zvetlen C# k</w:t>
+      </w:r>
+      <w:r>
+        <w:rPr>
+          <w:sz w:val="24"/>
+          <w:szCs w:val="24"/>
+        </w:rPr>
+        <w:t>ó</w:t>
+      </w:r>
+      <w:r>
+        <w:rPr>
+          <w:sz w:val="24"/>
+          <w:szCs w:val="24"/>
+        </w:rPr>
+        <w:t>don kereszt</w:t>
+      </w:r>
+      <w:r>
+        <w:rPr>
+          <w:sz w:val="24"/>
+          <w:szCs w:val="24"/>
+        </w:rPr>
+        <w:t>ü</w:t>
+      </w:r>
+      <w:r>
+        <w:rPr>
+          <w:sz w:val="24"/>
+          <w:szCs w:val="24"/>
+        </w:rPr>
+        <w:t>l kommunik</w:t>
+      </w:r>
+      <w:r>
+        <w:rPr>
+          <w:sz w:val="24"/>
+          <w:szCs w:val="24"/>
+        </w:rPr>
+        <w:t>á</w:t>
+      </w:r>
+      <w:r>
+        <w:rPr>
+          <w:sz w:val="24"/>
+          <w:szCs w:val="24"/>
+        </w:rPr>
+        <w:t>l a backend API-</w:t>
+      </w:r>
+      <w:proofErr w:type="spellStart"/>
+      <w:r>
+        <w:rPr>
+          <w:sz w:val="24"/>
+          <w:szCs w:val="24"/>
+        </w:rPr>
+        <w:t>val</w:t>
+      </w:r>
+      <w:proofErr w:type="spellEnd"/>
+      <w:r>
+        <w:rPr>
+          <w:sz w:val="24"/>
+          <w:szCs w:val="24"/>
+        </w:rPr>
+        <w:t xml:space="preserve"> </w:t>
+      </w:r>
+      <w:proofErr w:type="spellStart"/>
+      <w:r>
+        <w:rPr>
+          <w:sz w:val="24"/>
+          <w:szCs w:val="24"/>
+        </w:rPr>
+        <w:t>HttpClient</w:t>
+      </w:r>
+      <w:proofErr w:type="spellEnd"/>
+      <w:r>
+        <w:rPr>
+          <w:sz w:val="24"/>
+          <w:szCs w:val="24"/>
+        </w:rPr>
+        <w:t xml:space="preserve"> seg</w:t>
+      </w:r>
+      <w:r>
+        <w:rPr>
+          <w:sz w:val="24"/>
+          <w:szCs w:val="24"/>
+        </w:rPr>
+        <w:t>í</w:t>
+      </w:r>
+      <w:r>
+        <w:rPr>
+          <w:sz w:val="24"/>
+          <w:szCs w:val="24"/>
+        </w:rPr>
+        <w:t>ts</w:t>
+      </w:r>
+      <w:r>
+        <w:rPr>
+          <w:sz w:val="24"/>
+          <w:szCs w:val="24"/>
+        </w:rPr>
+        <w:t>é</w:t>
+      </w:r>
+      <w:r>
+        <w:rPr>
+          <w:sz w:val="24"/>
+          <w:szCs w:val="24"/>
+        </w:rPr>
+        <w:t>g</w:t>
+      </w:r>
+      <w:r>
+        <w:rPr>
+          <w:sz w:val="24"/>
+          <w:szCs w:val="24"/>
+        </w:rPr>
+        <w:t>é</w:t>
+      </w:r>
+      <w:r>
+        <w:rPr>
+          <w:sz w:val="24"/>
+          <w:szCs w:val="24"/>
+        </w:rPr>
+        <w:t xml:space="preserve">vel. Az </w:t>
+      </w:r>
+      <w:proofErr w:type="spellStart"/>
+      <w:r>
+        <w:rPr>
+          <w:sz w:val="24"/>
+          <w:szCs w:val="24"/>
+        </w:rPr>
+        <w:t>autentik</w:t>
+      </w:r>
+      <w:r>
+        <w:rPr>
+          <w:sz w:val="24"/>
+          <w:szCs w:val="24"/>
+        </w:rPr>
+        <w:t>á</w:t>
+      </w:r>
+      <w:r>
+        <w:rPr>
+          <w:sz w:val="24"/>
+          <w:szCs w:val="24"/>
+        </w:rPr>
+        <w:t>ci</w:t>
+      </w:r>
+      <w:r>
+        <w:rPr>
+          <w:sz w:val="24"/>
+          <w:szCs w:val="24"/>
+        </w:rPr>
+        <w:t>ó</w:t>
+      </w:r>
+      <w:proofErr w:type="spellEnd"/>
+      <w:r>
+        <w:rPr>
+          <w:sz w:val="24"/>
+          <w:szCs w:val="24"/>
+        </w:rPr>
+        <w:t xml:space="preserve"> JWT </w:t>
+      </w:r>
+      <w:proofErr w:type="spellStart"/>
+      <w:r>
+        <w:rPr>
+          <w:sz w:val="24"/>
+          <w:szCs w:val="24"/>
+        </w:rPr>
+        <w:t>tokenr</w:t>
+      </w:r>
+      <w:r>
+        <w:rPr>
+          <w:sz w:val="24"/>
+          <w:szCs w:val="24"/>
+        </w:rPr>
+        <w:t>ő</w:t>
+      </w:r>
+      <w:r>
+        <w:rPr>
+          <w:sz w:val="24"/>
+          <w:szCs w:val="24"/>
+        </w:rPr>
+        <w:t>l</w:t>
+      </w:r>
+      <w:proofErr w:type="spellEnd"/>
+      <w:r>
+        <w:rPr>
+          <w:sz w:val="24"/>
+          <w:szCs w:val="24"/>
+        </w:rPr>
+        <w:t xml:space="preserve"> t</w:t>
+      </w:r>
+      <w:r>
+        <w:rPr>
+          <w:sz w:val="24"/>
+          <w:szCs w:val="24"/>
+        </w:rPr>
+        <w:t>ö</w:t>
+      </w:r>
+      <w:r>
+        <w:rPr>
+          <w:sz w:val="24"/>
+          <w:szCs w:val="24"/>
+        </w:rPr>
+        <w:t>rt</w:t>
+      </w:r>
+      <w:r>
+        <w:rPr>
+          <w:sz w:val="24"/>
+          <w:szCs w:val="24"/>
+        </w:rPr>
+        <w:t>é</w:t>
+      </w:r>
+      <w:r>
+        <w:rPr>
+          <w:sz w:val="24"/>
+          <w:szCs w:val="24"/>
+        </w:rPr>
+        <w:t>nik: bejelentkez</w:t>
+      </w:r>
+      <w:r>
+        <w:rPr>
+          <w:sz w:val="24"/>
+          <w:szCs w:val="24"/>
+        </w:rPr>
+        <w:t>é</w:t>
+      </w:r>
+      <w:r>
+        <w:rPr>
+          <w:sz w:val="24"/>
+          <w:szCs w:val="24"/>
+        </w:rPr>
+        <w:t xml:space="preserve">skor a kliens megkapja a </w:t>
+      </w:r>
+      <w:proofErr w:type="spellStart"/>
+      <w:r>
+        <w:rPr>
+          <w:sz w:val="24"/>
+          <w:szCs w:val="24"/>
+        </w:rPr>
+        <w:t>tokent</w:t>
+      </w:r>
+      <w:proofErr w:type="spellEnd"/>
+      <w:r>
+        <w:rPr>
+          <w:sz w:val="24"/>
+          <w:szCs w:val="24"/>
+        </w:rPr>
+        <w:t>, amelyet minden tov</w:t>
+      </w:r>
+      <w:r>
+        <w:rPr>
+          <w:sz w:val="24"/>
+          <w:szCs w:val="24"/>
+        </w:rPr>
+        <w:t>á</w:t>
+      </w:r>
+      <w:r>
+        <w:rPr>
+          <w:sz w:val="24"/>
+          <w:szCs w:val="24"/>
+        </w:rPr>
+        <w:t>bbi API k</w:t>
+      </w:r>
+      <w:r>
+        <w:rPr>
+          <w:sz w:val="24"/>
+          <w:szCs w:val="24"/>
+        </w:rPr>
+        <w:t>é</w:t>
+      </w:r>
+      <w:r>
+        <w:rPr>
+          <w:sz w:val="24"/>
+          <w:szCs w:val="24"/>
+        </w:rPr>
+        <w:t>r</w:t>
+      </w:r>
+      <w:r>
+        <w:rPr>
+          <w:sz w:val="24"/>
+          <w:szCs w:val="24"/>
+        </w:rPr>
+        <w:t>é</w:t>
+      </w:r>
+      <w:r>
+        <w:rPr>
+          <w:sz w:val="24"/>
+          <w:szCs w:val="24"/>
+        </w:rPr>
+        <w:t xml:space="preserve">shez az </w:t>
+      </w:r>
+      <w:proofErr w:type="spellStart"/>
+      <w:r>
+        <w:rPr>
+          <w:sz w:val="24"/>
+          <w:szCs w:val="24"/>
+        </w:rPr>
+        <w:t>Authorization</w:t>
+      </w:r>
+      <w:proofErr w:type="spellEnd"/>
+      <w:r>
+        <w:rPr>
+          <w:sz w:val="24"/>
+          <w:szCs w:val="24"/>
+        </w:rPr>
+        <w:t xml:space="preserve"> </w:t>
+      </w:r>
+      <w:proofErr w:type="spellStart"/>
+      <w:r>
+        <w:rPr>
+          <w:sz w:val="24"/>
+          <w:szCs w:val="24"/>
+        </w:rPr>
+        <w:t>header</w:t>
+      </w:r>
+      <w:proofErr w:type="spellEnd"/>
+      <w:r>
+        <w:rPr>
+          <w:sz w:val="24"/>
+          <w:szCs w:val="24"/>
+        </w:rPr>
+        <w:t>-ben k</w:t>
+      </w:r>
+      <w:r>
+        <w:rPr>
+          <w:sz w:val="24"/>
+          <w:szCs w:val="24"/>
+        </w:rPr>
+        <w:t>ü</w:t>
+      </w:r>
+      <w:r>
+        <w:rPr>
+          <w:sz w:val="24"/>
+          <w:szCs w:val="24"/>
+        </w:rPr>
+        <w:t>ld el.</w:t>
+      </w:r>
+    </w:p>
+    <w:p>
+      <w:pPr>
+        <w:pStyle w:val="Cmsor2"/>
+        <w:jc w:val="both"/>
+      </w:pPr>
+      <w:bookmarkStart w:id="29" w:name="_Toc223536933"/>
+      <w:bookmarkStart w:id="30" w:name="_Toc223984730"/>
+      <w:r>
+        <w:t>2</w:t>
+      </w:r>
+      <w:r>
+        <w:t>.</w:t>
+      </w:r>
+      <w:r>
+        <w:rPr>
+          <w:rStyle w:val="Cmsor2Char"/>
+        </w:rPr>
+        <w:t>7</w:t>
+      </w:r>
+      <w:r>
+        <w:rPr>
+          <w:rStyle w:val="Cmsor2Char"/>
+        </w:rPr>
+        <w:t xml:space="preserve"> JWT </w:t>
+      </w:r>
+      <w:proofErr w:type="spellStart"/>
+      <w:r>
+        <w:rPr>
+          <w:rStyle w:val="Cmsor2Char"/>
+        </w:rPr>
+        <w:t>Autentikáció</w:t>
+      </w:r>
+      <w:proofErr w:type="spellEnd"/>
+      <w:r>
+        <w:rPr>
+          <w:rStyle w:val="Cmsor2Char"/>
+        </w:rPr>
+        <w:t xml:space="preserve"> és Jogosultságkezelés</w:t>
+      </w:r>
+      <w:bookmarkEnd w:id="29"/>
+      <w:bookmarkEnd w:id="30"/>
+    </w:p>
+    <w:p>
+      <w:pPr>
+        <w:spacing w:before="80"/>
+        <w:jc w:val="both"/>
+        <w:rPr>
+          <w:rFonts w:cstheme="minorHAnsi"/>
+          <w:sz w:val="24"/>
+          <w:szCs w:val="24"/>
+        </w:rPr>
+      </w:pPr>
+      <w:r>
+        <w:rPr>
+          <w:rFonts w:cstheme="minorHAnsi"/>
+          <w:sz w:val="24"/>
+          <w:szCs w:val="24"/>
+        </w:rPr>
+        <w:t xml:space="preserve">Az alkalmazás </w:t>
+      </w:r>
+      <w:proofErr w:type="spellStart"/>
+      <w:r>
+        <w:rPr>
+          <w:rFonts w:cstheme="minorHAnsi"/>
+          <w:sz w:val="24"/>
+          <w:szCs w:val="24"/>
+        </w:rPr>
+        <w:t>stateless</w:t>
+      </w:r>
+      <w:proofErr w:type="spellEnd"/>
+      <w:r>
+        <w:rPr>
+          <w:rFonts w:cstheme="minorHAnsi"/>
+          <w:sz w:val="24"/>
+          <w:szCs w:val="24"/>
+        </w:rPr>
+        <w:t xml:space="preserve"> JWT (JSON Web </w:t>
+      </w:r>
+      <w:proofErr w:type="spellStart"/>
+      <w:r>
+        <w:rPr>
+          <w:rFonts w:cstheme="minorHAnsi"/>
+          <w:sz w:val="24"/>
+          <w:szCs w:val="24"/>
+        </w:rPr>
+        <w:t>Token</w:t>
+      </w:r>
+      <w:proofErr w:type="spellEnd"/>
+      <w:r>
+        <w:rPr>
+          <w:rFonts w:cstheme="minorHAnsi"/>
+          <w:sz w:val="24"/>
+          <w:szCs w:val="24"/>
+        </w:rPr>
+        <w:t>) alapú hi</w:t>
+      </w:r>
+      <w:bookmarkStart w:id="31" w:name="_GoBack"/>
+      <w:bookmarkEnd w:id="31"/>
+      <w:r>
+        <w:rPr>
+          <w:rFonts w:cstheme="minorHAnsi"/>
+          <w:sz w:val="24"/>
+          <w:szCs w:val="24"/>
+        </w:rPr>
+        <w:t xml:space="preserve">telesítést alkalmaz. A </w:t>
+      </w:r>
+      <w:proofErr w:type="spellStart"/>
+      <w:r>
+        <w:rPr>
+          <w:rFonts w:cstheme="minorHAnsi"/>
+          <w:sz w:val="24"/>
+          <w:szCs w:val="24"/>
+        </w:rPr>
+        <w:t>token</w:t>
+      </w:r>
+      <w:proofErr w:type="spellEnd"/>
+      <w:r>
+        <w:rPr>
+          <w:rFonts w:cstheme="minorHAnsi"/>
+          <w:sz w:val="24"/>
+          <w:szCs w:val="24"/>
+        </w:rPr>
+        <w:t xml:space="preserve"> tartalmazza a felhasználó azonosítóját (</w:t>
+      </w:r>
+      <w:proofErr w:type="spellStart"/>
+      <w:r>
+        <w:rPr>
+          <w:rFonts w:cstheme="minorHAnsi"/>
+          <w:sz w:val="24"/>
+          <w:szCs w:val="24"/>
+        </w:rPr>
+        <w:t>UserId</w:t>
+      </w:r>
+      <w:proofErr w:type="spellEnd"/>
+      <w:r>
+        <w:rPr>
+          <w:rFonts w:cstheme="minorHAnsi"/>
+          <w:sz w:val="24"/>
+          <w:szCs w:val="24"/>
+        </w:rPr>
+        <w:t>), szerepkörét (</w:t>
+      </w:r>
+      <w:proofErr w:type="spellStart"/>
+      <w:r>
+        <w:rPr>
+          <w:rFonts w:cstheme="minorHAnsi"/>
+          <w:sz w:val="24"/>
+          <w:szCs w:val="24"/>
+        </w:rPr>
+        <w:t>Role</w:t>
+      </w:r>
+      <w:proofErr w:type="spellEnd"/>
+      <w:r>
+        <w:rPr>
+          <w:rFonts w:cstheme="minorHAnsi"/>
+          <w:sz w:val="24"/>
+          <w:szCs w:val="24"/>
+        </w:rPr>
+        <w:t>) és lejárati idejét.</w:t>
+      </w:r>
+    </w:p>
+    <w:tbl>
+      <w:tblPr>
+        <w:tblW w:w="9026" w:type="dxa"/>
+        <w:tblBorders>
+          <w:top w:val="single" w:sz="4" w:space="0" w:color="auto"/>
+          <w:left w:val="single" w:sz="4" w:space="0" w:color="auto"/>
+          <w:bottom w:val="single" w:sz="4" w:space="0" w:color="auto"/>
+          <w:right w:val="single" w:sz="4" w:space="0" w:color="auto"/>
+          <w:insideH w:val="single" w:sz="4" w:space="0" w:color="auto"/>
+          <w:insideV w:val="single" w:sz="4" w:space="0" w:color="auto"/>
+        </w:tblBorders>
+        <w:tblCellMar>
+          <w:left w:w="10" w:type="dxa"/>
+          <w:right w:w="10" w:type="dxa"/>
+        </w:tblCellMar>
+        <w:tblLook w:val="04A0" w:firstRow="1" w:lastRow="0" w:firstColumn="1" w:lastColumn="0" w:noHBand="0" w:noVBand="1"/>
+      </w:tblPr>
+      <w:tblGrid>
+        <w:gridCol w:w="3008"/>
+        <w:gridCol w:w="3009"/>
+        <w:gridCol w:w="3009"/>
+      </w:tblGrid>
+      <w:tr>
+        <w:tc>
+          <w:tcPr>
+            <w:tcW w:w="3008" w:type="dxa"/>
+            <w:shd w:val="clear" w:color="auto" w:fill="2563EB"/>
+            <w:tcMar>
+              <w:top w:w="80" w:type="dxa"/>
+              <w:left w:w="120" w:type="dxa"/>
+              <w:bottom w:w="80" w:type="dxa"/>
+              <w:right w:w="120" w:type="dxa"/>
+            </w:tcMar>
+          </w:tcPr>
+          <w:p>
+            <w:pPr>
+              <w:jc w:val="both"/>
+              <w:rPr>
+                <w:rFonts w:cstheme="minorHAnsi"/>
+              </w:rPr>
+            </w:pPr>
+            <w:r>
+              <w:rPr>
+                <w:rFonts w:cstheme="minorHAnsi"/>
+                <w:b/>
+                <w:bCs/>
+                <w:color w:val="FFFFFF"/>
+                <w:sz w:val="20"/>
+                <w:szCs w:val="20"/>
+              </w:rPr>
+              <w:t>Funkci</w:t>
+            </w:r>
+            <w:r>
+              <w:rPr>
+                <w:rFonts w:cstheme="minorHAnsi"/>
+                <w:b/>
+                <w:bCs/>
+                <w:color w:val="FFFFFF"/>
+                <w:sz w:val="20"/>
+                <w:szCs w:val="20"/>
+              </w:rPr>
+              <w:t>ó</w:t>
+            </w:r>
+          </w:p>
+        </w:tc>
+        <w:tc>
+          <w:tcPr>
+            <w:tcW w:w="3008" w:type="dxa"/>
+            <w:shd w:val="clear" w:color="auto" w:fill="2563EB"/>
+            <w:tcMar>
+              <w:top w:w="80" w:type="dxa"/>
+              <w:left w:w="120" w:type="dxa"/>
+              <w:bottom w:w="80" w:type="dxa"/>
+              <w:right w:w="120" w:type="dxa"/>
+            </w:tcMar>
+          </w:tcPr>
+          <w:p>
+            <w:pPr>
+              <w:jc w:val="both"/>
+              <w:rPr>
+                <w:rFonts w:cstheme="minorHAnsi"/>
+              </w:rPr>
+            </w:pPr>
+            <w:r>
+              <w:rPr>
+                <w:rFonts w:cstheme="minorHAnsi"/>
+                <w:b/>
+                <w:bCs/>
+                <w:color w:val="FFFFFF"/>
+                <w:sz w:val="20"/>
+                <w:szCs w:val="20"/>
+              </w:rPr>
+              <w:t>Di</w:t>
+            </w:r>
+            <w:r>
+              <w:rPr>
+                <w:rFonts w:cstheme="minorHAnsi"/>
+                <w:b/>
+                <w:bCs/>
+                <w:color w:val="FFFFFF"/>
+                <w:sz w:val="20"/>
+                <w:szCs w:val="20"/>
+              </w:rPr>
+              <w:t>á</w:t>
+            </w:r>
+            <w:r>
+              <w:rPr>
+                <w:rFonts w:cstheme="minorHAnsi"/>
+                <w:b/>
+                <w:bCs/>
+                <w:color w:val="FFFFFF"/>
+                <w:sz w:val="20"/>
+                <w:szCs w:val="20"/>
+              </w:rPr>
+              <w:t>k (</w:t>
+            </w:r>
+            <w:proofErr w:type="spellStart"/>
+            <w:r>
+              <w:rPr>
+                <w:rFonts w:cstheme="minorHAnsi"/>
+                <w:b/>
+                <w:bCs/>
+                <w:color w:val="FFFFFF"/>
+                <w:sz w:val="20"/>
+                <w:szCs w:val="20"/>
+              </w:rPr>
+              <w:t>student</w:t>
+            </w:r>
+            <w:proofErr w:type="spellEnd"/>
+            <w:r>
+              <w:rPr>
+                <w:rFonts w:cstheme="minorHAnsi"/>
+                <w:b/>
+                <w:bCs/>
+                <w:color w:val="FFFFFF"/>
+                <w:sz w:val="20"/>
+                <w:szCs w:val="20"/>
+              </w:rPr>
+              <w:t>)</w:t>
+            </w:r>
+          </w:p>
+        </w:tc>
+        <w:tc>
+          <w:tcPr>
+            <w:tcW w:w="3008" w:type="dxa"/>
+            <w:shd w:val="clear" w:color="auto" w:fill="2563EB"/>
+            <w:tcMar>
+              <w:top w:w="80" w:type="dxa"/>
+              <w:left w:w="120" w:type="dxa"/>
+              <w:bottom w:w="80" w:type="dxa"/>
+              <w:right w:w="120" w:type="dxa"/>
+            </w:tcMar>
+          </w:tcPr>
+          <w:p>
+            <w:pPr>
+              <w:jc w:val="both"/>
+              <w:rPr>
+                <w:rFonts w:cstheme="minorHAnsi"/>
+              </w:rPr>
+            </w:pPr>
+            <w:r>
+              <w:rPr>
+                <w:rFonts w:cstheme="minorHAnsi"/>
+                <w:b/>
+                <w:bCs/>
+                <w:color w:val="FFFFFF"/>
+                <w:sz w:val="20"/>
+                <w:szCs w:val="20"/>
+              </w:rPr>
+              <w:t>Tan</w:t>
+            </w:r>
+            <w:r>
+              <w:rPr>
+                <w:rFonts w:cstheme="minorHAnsi"/>
+                <w:b/>
+                <w:bCs/>
+                <w:color w:val="FFFFFF"/>
+                <w:sz w:val="20"/>
+                <w:szCs w:val="20"/>
+              </w:rPr>
+              <w:t>á</w:t>
+            </w:r>
+            <w:r>
+              <w:rPr>
+                <w:rFonts w:cstheme="minorHAnsi"/>
+                <w:b/>
+                <w:bCs/>
+                <w:color w:val="FFFFFF"/>
+                <w:sz w:val="20"/>
+                <w:szCs w:val="20"/>
+              </w:rPr>
+              <w:t>r (</w:t>
+            </w:r>
+            <w:proofErr w:type="spellStart"/>
+            <w:r>
+              <w:rPr>
+                <w:rFonts w:cstheme="minorHAnsi"/>
+                <w:b/>
+                <w:bCs/>
+                <w:color w:val="FFFFFF"/>
+                <w:sz w:val="20"/>
+                <w:szCs w:val="20"/>
+              </w:rPr>
+              <w:t>teacher</w:t>
+            </w:r>
+            <w:proofErr w:type="spellEnd"/>
+            <w:r>
+              <w:rPr>
+                <w:rFonts w:cstheme="minorHAnsi"/>
+                <w:b/>
+                <w:bCs/>
+                <w:color w:val="FFFFFF"/>
+                <w:sz w:val="20"/>
+                <w:szCs w:val="20"/>
+              </w:rPr>
+              <w:t>)</w:t>
+            </w:r>
+          </w:p>
+        </w:tc>
+      </w:tr>
+      <w:tr>
+        <w:tc>
+          <w:tcPr>
+            <w:tcW w:w="3008" w:type="dxa"/>
+            <w:shd w:val="clear" w:color="auto" w:fill="auto"/>
+            <w:tcMar>
+              <w:top w:w="60" w:type="dxa"/>
+              <w:left w:w="120" w:type="dxa"/>
+              <w:bottom w:w="60" w:type="dxa"/>
+              <w:right w:w="120" w:type="dxa"/>
+            </w:tcMar>
+          </w:tcPr>
+          <w:p>
+            <w:pPr>
+              <w:jc w:val="both"/>
+              <w:rPr>
+                <w:rFonts w:cstheme="minorHAnsi"/>
+              </w:rPr>
+            </w:pPr>
+            <w:r>
+              <w:rPr>
+                <w:rFonts w:cstheme="minorHAnsi"/>
+                <w:sz w:val="20"/>
+                <w:szCs w:val="20"/>
+              </w:rPr>
+              <w:t>Napt</w:t>
+            </w:r>
+            <w:r>
+              <w:rPr>
+                <w:rFonts w:cstheme="minorHAnsi"/>
+                <w:sz w:val="20"/>
+                <w:szCs w:val="20"/>
+              </w:rPr>
+              <w:t>á</w:t>
+            </w:r>
+            <w:r>
+              <w:rPr>
+                <w:rFonts w:cstheme="minorHAnsi"/>
+                <w:sz w:val="20"/>
+                <w:szCs w:val="20"/>
+              </w:rPr>
+              <w:t>r megtekint</w:t>
+            </w:r>
+            <w:r>
+              <w:rPr>
+                <w:rFonts w:cstheme="minorHAnsi"/>
+                <w:sz w:val="20"/>
+                <w:szCs w:val="20"/>
+              </w:rPr>
+              <w:t>é</w:t>
+            </w:r>
+            <w:r>
+              <w:rPr>
+                <w:rFonts w:cstheme="minorHAnsi"/>
+                <w:sz w:val="20"/>
+                <w:szCs w:val="20"/>
+              </w:rPr>
+              <w:t>se</w:t>
+            </w:r>
+          </w:p>
+        </w:tc>
+        <w:tc>
+          <w:tcPr>
+            <w:tcW w:w="3008" w:type="dxa"/>
+            <w:shd w:val="clear" w:color="auto" w:fill="auto"/>
+            <w:tcMar>
+              <w:top w:w="60" w:type="dxa"/>
+              <w:left w:w="120" w:type="dxa"/>
+              <w:bottom w:w="60" w:type="dxa"/>
+              <w:right w:w="120" w:type="dxa"/>
+            </w:tcMar>
+          </w:tcPr>
+          <w:p>
+            <w:pPr>
+              <w:jc w:val="both"/>
+              <w:rPr>
+                <w:rFonts w:cstheme="minorHAnsi"/>
+              </w:rPr>
+            </w:pPr>
+            <w:r>
+              <w:rPr>
+                <w:rFonts w:cstheme="minorHAnsi"/>
+                <w:sz w:val="20"/>
+                <w:szCs w:val="20"/>
+              </w:rPr>
+              <w:t>igen</w:t>
+            </w:r>
+          </w:p>
+        </w:tc>
+        <w:tc>
+          <w:tcPr>
+            <w:tcW w:w="3008" w:type="dxa"/>
+            <w:shd w:val="clear" w:color="auto" w:fill="auto"/>
+            <w:tcMar>
+              <w:top w:w="60" w:type="dxa"/>
+              <w:left w:w="120" w:type="dxa"/>
+              <w:bottom w:w="60" w:type="dxa"/>
+              <w:right w:w="120" w:type="dxa"/>
+            </w:tcMar>
+          </w:tcPr>
+          <w:p>
+            <w:pPr>
+              <w:jc w:val="both"/>
+              <w:rPr>
+                <w:rFonts w:cstheme="minorHAnsi"/>
+              </w:rPr>
+            </w:pPr>
+            <w:r>
+              <w:rPr>
+                <w:rFonts w:cstheme="minorHAnsi"/>
+                <w:sz w:val="20"/>
+                <w:szCs w:val="20"/>
+              </w:rPr>
+              <w:t>igen</w:t>
+            </w:r>
+          </w:p>
+        </w:tc>
+      </w:tr>
+      <w:tr>
+        <w:tc>
+          <w:tcPr>
+            <w:tcW w:w="3008" w:type="dxa"/>
+            <w:shd w:val="clear" w:color="auto" w:fill="auto"/>
+            <w:tcMar>
+              <w:top w:w="60" w:type="dxa"/>
+              <w:left w:w="120" w:type="dxa"/>
+              <w:bottom w:w="60" w:type="dxa"/>
+              <w:right w:w="120" w:type="dxa"/>
+            </w:tcMar>
+          </w:tcPr>
+          <w:p>
+            <w:pPr>
+              <w:jc w:val="both"/>
+              <w:rPr>
+                <w:rFonts w:cstheme="minorHAnsi"/>
+              </w:rPr>
+            </w:pPr>
+            <w:r>
+              <w:rPr>
+                <w:rFonts w:cstheme="minorHAnsi"/>
+                <w:sz w:val="20"/>
+                <w:szCs w:val="20"/>
+              </w:rPr>
+              <w:t>Esem</w:t>
+            </w:r>
+            <w:r>
+              <w:rPr>
+                <w:rFonts w:cstheme="minorHAnsi"/>
+                <w:sz w:val="20"/>
+                <w:szCs w:val="20"/>
+              </w:rPr>
+              <w:t>é</w:t>
+            </w:r>
+            <w:r>
+              <w:rPr>
+                <w:rFonts w:cstheme="minorHAnsi"/>
+                <w:sz w:val="20"/>
+                <w:szCs w:val="20"/>
+              </w:rPr>
+              <w:t>ny felt</w:t>
+            </w:r>
+            <w:r>
+              <w:rPr>
+                <w:rFonts w:cstheme="minorHAnsi"/>
+                <w:sz w:val="20"/>
+                <w:szCs w:val="20"/>
+              </w:rPr>
+              <w:t>ö</w:t>
+            </w:r>
+            <w:r>
+              <w:rPr>
+                <w:rFonts w:cstheme="minorHAnsi"/>
+                <w:sz w:val="20"/>
+                <w:szCs w:val="20"/>
+              </w:rPr>
+              <w:t>lt</w:t>
+            </w:r>
+            <w:r>
+              <w:rPr>
+                <w:rFonts w:cstheme="minorHAnsi"/>
+                <w:sz w:val="20"/>
+                <w:szCs w:val="20"/>
+              </w:rPr>
+              <w:t>é</w:t>
+            </w:r>
+            <w:r>
+              <w:rPr>
+                <w:rFonts w:cstheme="minorHAnsi"/>
+                <w:sz w:val="20"/>
+                <w:szCs w:val="20"/>
+              </w:rPr>
+              <w:t>se</w:t>
+            </w:r>
+          </w:p>
+        </w:tc>
+        <w:tc>
+          <w:tcPr>
+            <w:tcW w:w="3008" w:type="dxa"/>
+            <w:shd w:val="clear" w:color="auto" w:fill="auto"/>
+            <w:tcMar>
+              <w:top w:w="60" w:type="dxa"/>
+              <w:left w:w="120" w:type="dxa"/>
+              <w:bottom w:w="60" w:type="dxa"/>
+              <w:right w:w="120" w:type="dxa"/>
+            </w:tcMar>
+          </w:tcPr>
+          <w:p>
+            <w:pPr>
+              <w:jc w:val="both"/>
+              <w:rPr>
+                <w:rFonts w:cstheme="minorHAnsi"/>
+              </w:rPr>
+            </w:pPr>
+            <w:r>
+              <w:rPr>
+                <w:rFonts w:cstheme="minorHAnsi"/>
+                <w:sz w:val="20"/>
+                <w:szCs w:val="20"/>
+              </w:rPr>
+              <w:t>igen (t</w:t>
+            </w:r>
+            <w:r>
+              <w:rPr>
+                <w:rFonts w:cstheme="minorHAnsi"/>
+                <w:sz w:val="20"/>
+                <w:szCs w:val="20"/>
+              </w:rPr>
+              <w:t>á</w:t>
+            </w:r>
+            <w:r>
+              <w:rPr>
+                <w:rFonts w:cstheme="minorHAnsi"/>
+                <w:sz w:val="20"/>
+                <w:szCs w:val="20"/>
+              </w:rPr>
+              <w:t>rsainak)</w:t>
+            </w:r>
+          </w:p>
+        </w:tc>
+        <w:tc>
+          <w:tcPr>
+            <w:tcW w:w="3008" w:type="dxa"/>
+            <w:shd w:val="clear" w:color="auto" w:fill="auto"/>
+            <w:tcMar>
+              <w:top w:w="60" w:type="dxa"/>
+              <w:left w:w="120" w:type="dxa"/>
+              <w:bottom w:w="60" w:type="dxa"/>
+              <w:right w:w="120" w:type="dxa"/>
+            </w:tcMar>
+          </w:tcPr>
+          <w:p>
+            <w:pPr>
+              <w:jc w:val="both"/>
+              <w:rPr>
+                <w:rFonts w:cstheme="minorHAnsi"/>
+              </w:rPr>
+            </w:pPr>
+            <w:r>
+              <w:rPr>
+                <w:rFonts w:cstheme="minorHAnsi"/>
+                <w:sz w:val="20"/>
+                <w:szCs w:val="20"/>
+              </w:rPr>
+              <w:t>igen (hivatalos)</w:t>
+            </w:r>
+          </w:p>
+        </w:tc>
+      </w:tr>
+    </w:tbl>
+    <w:p>
+      <w:pPr>
+        <w:pStyle w:val="NormlWeb"/>
         <w:jc w:val="both"/>
         <w:rPr>
           <w:rFonts w:asciiTheme="minorHAnsi" w:hAnsiTheme="minorHAnsi" w:cstheme="minorHAnsi"/>
@@ -5671,7 +6881,7 @@
 </file>
 
 <file path=word/endnotes.xml><?xml version="1.0" encoding="utf-8"?>
-<w:endnotes xmlns:wpc="http://schemas.microsoft.com/office/word/2010/wordprocessingCanvas" xmlns:cx="http://schemas.microsoft.com/office/drawing/2014/chartex" xmlns:cx1="http://schemas.microsoft.com/office/drawing/2015/9/8/chartex" xmlns:cx2="http://schemas.microsoft.com/office/drawing/2015/10/21/chartex" xmlns:cx3="http://schemas.microsoft.com/office/drawing/2016/5/9/chartex" xmlns:cx4="http://schemas.microsoft.com/office/drawing/2016/5/10/chartex" xmlns:cx5="http://schemas.microsoft.com/office/drawing/2016/5/11/chartex" xmlns:cx6="http://schemas.microsoft.com/office/drawing/2016/5/12/chartex" xmlns:cx7="http://schemas.microsoft.com/office/drawing/2016/5/13/chartex" xmlns:cx8="http://schemas.microsoft.com/office/drawing/2016/5/14/chartex" xmlns:mc="http://schemas.openxmlformats.org/markup-compatibility/2006" xmlns:aink="http://schemas.microsoft.com/office/drawing/2016/ink" xmlns:am3d="http://schemas.microsoft.com/office/drawing/2017/model3d" xmlns:o="urn:schemas-microsoft-com:office:office" xmlns:r="http://schemas.openxmlformats.org/officeDocument/2006/relationships" xmlns:m="http://schemas.openxmlformats.org/officeDocument/2006/math" xmlns:v="urn:schemas-microsoft-com:vml" xmlns:wp14="http://schemas.microsoft.com/office/word/2010/wordprocessingDrawing" xmlns:wp="http://schemas.openxmlformats.org/drawingml/2006/wordprocessingDrawing" xmlns:w10="urn:schemas-microsoft-com:office:word" xmlns:w="http://schemas.openxmlformats.org/wordprocessingml/2006/main" xmlns:w14="http://schemas.microsoft.com/office/word/2010/wordml" xmlns:w15="http://schemas.microsoft.com/office/word/2012/wordml" xmlns:w16cex="http://schemas.microsoft.com/office/word/2018/wordml/cex" xmlns:w16cid="http://schemas.microsoft.com/office/word/2016/wordml/cid" xmlns:w16="http://schemas.microsoft.com/office/word/2018/wordml" xmlns:w16sdtdh="http://schemas.microsoft.com/office/word/2020/wordml/sdtdatahash" xmlns:w16se="http://schemas.microsoft.com/office/word/2015/wordml/symex" xmlns:wpg="http://schemas.microsoft.com/office/word/2010/wordprocessingGroup" xmlns:wpi="http://schemas.microsoft.com/office/word/2010/wordprocessingInk" xmlns:wne="http://schemas.microsoft.com/office/word/2006/wordml" xmlns:wps="http://schemas.microsoft.com/office/word/2010/wordprocessingShape" mc:Ignorable="w14 w15 w16se w16cid w16 w16cex w16sdtdh wp14">
+<w:endnotes xmlns:wpc="http://schemas.microsoft.com/office/word/2010/wordprocessingCanvas" xmlns:cx="http://schemas.microsoft.com/office/drawing/2014/chartex" xmlns:cx1="http://schemas.microsoft.com/office/drawing/2015/9/8/chartex" xmlns:cx2="http://schemas.microsoft.com/office/drawing/2015/10/21/chartex" xmlns:cx3="http://schemas.microsoft.com/office/drawing/2016/5/9/chartex" xmlns:cx4="http://schemas.microsoft.com/office/drawing/2016/5/10/chartex" xmlns:cx5="http://schemas.microsoft.com/office/drawing/2016/5/11/chartex" xmlns:cx6="http://schemas.microsoft.com/office/drawing/2016/5/12/chartex" xmlns:cx7="http://schemas.microsoft.com/office/drawing/2016/5/13/chartex" xmlns:cx8="http://schemas.microsoft.com/office/drawing/2016/5/14/chartex" xmlns:mc="http://schemas.openxmlformats.org/markup-compatibility/2006" xmlns:aink="http://schemas.microsoft.com/office/drawing/2016/ink" xmlns:am3d="http://schemas.microsoft.com/office/drawing/2017/model3d" xmlns:o="urn:schemas-microsoft-com:office:office" xmlns:r="http://schemas.openxmlformats.org/officeDocument/2006/relationships" xmlns:m="http://schemas.openxmlformats.org/officeDocument/2006/math" xmlns:v="urn:schemas-microsoft-com:vml" xmlns:wp14="http://schemas.microsoft.com/office/word/2010/wordprocessingDrawing" xmlns:wp="http://schemas.openxmlformats.org/drawingml/2006/wordprocessingDrawing" xmlns:w10="urn:schemas-microsoft-com:office:word" xmlns:w="http://schemas.openxmlformats.org/wordprocessingml/2006/main" xmlns:w14="http://schemas.microsoft.com/office/word/2010/wordml" xmlns:w15="http://schemas.microsoft.com/office/word/2012/wordml" xmlns:w16cid="http://schemas.microsoft.com/office/word/2016/wordml/cid" xmlns:w16se="http://schemas.microsoft.com/office/word/2015/wordml/symex" xmlns:wpg="http://schemas.microsoft.com/office/word/2010/wordprocessingGroup" xmlns:wpi="http://schemas.microsoft.com/office/word/2010/wordprocessingInk" xmlns:wne="http://schemas.microsoft.com/office/word/2006/wordml" xmlns:wps="http://schemas.microsoft.com/office/word/2010/wordprocessingShape" mc:Ignorable="w14 w15 w16se w16cid wp14">
   <w:endnote w:type="separator" w:id="-1">
     <w:p>
       <w:pPr>
@@ -5696,10 +6906,10 @@
 </file>
 
 <file path=word/footer1.xml><?xml version="1.0" encoding="utf-8"?>
-<w:ftr xmlns:wpc="http://schemas.microsoft.com/office/word/2010/wordprocessingCanvas" xmlns:cx="http://schemas.microsoft.com/office/drawing/2014/chartex" xmlns:cx1="http://schemas.microsoft.com/office/drawing/2015/9/8/chartex" xmlns:cx2="http://schemas.microsoft.com/office/drawing/2015/10/21/chartex" xmlns:cx3="http://schemas.microsoft.com/office/drawing/2016/5/9/chartex" xmlns:cx4="http://schemas.microsoft.com/office/drawing/2016/5/10/chartex" xmlns:cx5="http://schemas.microsoft.com/office/drawing/2016/5/11/chartex" xmlns:cx6="http://schemas.microsoft.com/office/drawing/2016/5/12/chartex" xmlns:cx7="http://schemas.microsoft.com/office/drawing/2016/5/13/chartex" xmlns:cx8="http://schemas.microsoft.com/office/drawing/2016/5/14/chartex" xmlns:mc="http://schemas.openxmlformats.org/markup-compatibility/2006" xmlns:aink="http://schemas.microsoft.com/office/drawing/2016/ink" xmlns:am3d="http://schemas.microsoft.com/office/drawing/2017/model3d" xmlns:o="urn:schemas-microsoft-com:office:office" xmlns:r="http://schemas.openxmlformats.org/officeDocument/2006/relationships" xmlns:m="http://schemas.openxmlformats.org/officeDocument/2006/math" xmlns:v="urn:schemas-microsoft-com:vml" xmlns:wp14="http://schemas.microsoft.com/office/word/2010/wordprocessingDrawing" xmlns:wp="http://schemas.openxmlformats.org/drawingml/2006/wordprocessingDrawing" xmlns:w10="urn:schemas-microsoft-com:office:word" xmlns:w="http://schemas.openxmlformats.org/wordprocessingml/2006/main" xmlns:w14="http://schemas.microsoft.com/office/word/2010/wordml" xmlns:w15="http://schemas.microsoft.com/office/word/2012/wordml" xmlns:w16cex="http://schemas.microsoft.com/office/word/2018/wordml/cex" xmlns:w16cid="http://schemas.microsoft.com/office/word/2016/wordml/cid" xmlns:w16="http://schemas.microsoft.com/office/word/2018/wordml" xmlns:w16sdtdh="http://schemas.microsoft.com/office/word/2020/wordml/sdtdatahash" xmlns:w16se="http://schemas.microsoft.com/office/word/2015/wordml/symex" xmlns:wpg="http://schemas.microsoft.com/office/word/2010/wordprocessingGroup" xmlns:wpi="http://schemas.microsoft.com/office/word/2010/wordprocessingInk" xmlns:wne="http://schemas.microsoft.com/office/word/2006/wordml" xmlns:wps="http://schemas.microsoft.com/office/word/2010/wordprocessingShape" mc:Ignorable="w14 w15 w16se w16cid w16 w16cex w16sdtdh wp14">
+<w:ftr xmlns:wpc="http://schemas.microsoft.com/office/word/2010/wordprocessingCanvas" xmlns:cx="http://schemas.microsoft.com/office/drawing/2014/chartex" xmlns:cx1="http://schemas.microsoft.com/office/drawing/2015/9/8/chartex" xmlns:cx2="http://schemas.microsoft.com/office/drawing/2015/10/21/chartex" xmlns:cx3="http://schemas.microsoft.com/office/drawing/2016/5/9/chartex" xmlns:cx4="http://schemas.microsoft.com/office/drawing/2016/5/10/chartex" xmlns:cx5="http://schemas.microsoft.com/office/drawing/2016/5/11/chartex" xmlns:cx6="http://schemas.microsoft.com/office/drawing/2016/5/12/chartex" xmlns:cx7="http://schemas.microsoft.com/office/drawing/2016/5/13/chartex" xmlns:cx8="http://schemas.microsoft.com/office/drawing/2016/5/14/chartex" xmlns:mc="http://schemas.openxmlformats.org/markup-compatibility/2006" xmlns:aink="http://schemas.microsoft.com/office/drawing/2016/ink" xmlns:am3d="http://schemas.microsoft.com/office/drawing/2017/model3d" xmlns:o="urn:schemas-microsoft-com:office:office" xmlns:r="http://schemas.openxmlformats.org/officeDocument/2006/relationships" xmlns:m="http://schemas.openxmlformats.org/officeDocument/2006/math" xmlns:v="urn:schemas-microsoft-com:vml" xmlns:wp14="http://schemas.microsoft.com/office/word/2010/wordprocessingDrawing" xmlns:wp="http://schemas.openxmlformats.org/drawingml/2006/wordprocessingDrawing" xmlns:w10="urn:schemas-microsoft-com:office:word" xmlns:w="http://schemas.openxmlformats.org/wordprocessingml/2006/main" xmlns:w14="http://schemas.microsoft.com/office/word/2010/wordml" xmlns:w15="http://schemas.microsoft.com/office/word/2012/wordml" xmlns:w16cid="http://schemas.microsoft.com/office/word/2016/wordml/cid" xmlns:w16se="http://schemas.microsoft.com/office/word/2015/wordml/symex" xmlns:wpg="http://schemas.microsoft.com/office/word/2010/wordprocessingGroup" xmlns:wpi="http://schemas.microsoft.com/office/word/2010/wordprocessingInk" xmlns:wne="http://schemas.microsoft.com/office/word/2006/wordml" xmlns:wps="http://schemas.microsoft.com/office/word/2010/wordprocessingShape" mc:Ignorable="w14 w15 w16se w16cid wp14">
   <w:p>
     <w:pPr>
-      <w:pStyle w:val="Footer"/>
+      <w:pStyle w:val="llb"/>
       <w:jc w:val="center"/>
       <w:rPr>
         <w:caps/>
@@ -5744,14 +6954,14 @@
   </w:p>
   <w:p>
     <w:pPr>
-      <w:pStyle w:val="Footer"/>
+      <w:pStyle w:val="llb"/>
     </w:pPr>
   </w:p>
 </w:ftr>
 </file>
 
 <file path=word/footnotes.xml><?xml version="1.0" encoding="utf-8"?>
-<w:footnotes xmlns:wpc="http://schemas.microsoft.com/office/word/2010/wordprocessingCanvas" xmlns:cx="http://schemas.microsoft.com/office/drawing/2014/chartex" xmlns:cx1="http://schemas.microsoft.com/office/drawing/2015/9/8/chartex" xmlns:cx2="http://schemas.microsoft.com/office/drawing/2015/10/21/chartex" xmlns:cx3="http://schemas.microsoft.com/office/drawing/2016/5/9/chartex" xmlns:cx4="http://schemas.microsoft.com/office/drawing/2016/5/10/chartex" xmlns:cx5="http://schemas.microsoft.com/office/drawing/2016/5/11/chartex" xmlns:cx6="http://schemas.microsoft.com/office/drawing/2016/5/12/chartex" xmlns:cx7="http://schemas.microsoft.com/office/drawing/2016/5/13/chartex" xmlns:cx8="http://schemas.microsoft.com/office/drawing/2016/5/14/chartex" xmlns:mc="http://schemas.openxmlformats.org/markup-compatibility/2006" xmlns:aink="http://schemas.microsoft.com/office/drawing/2016/ink" xmlns:am3d="http://schemas.microsoft.com/office/drawing/2017/model3d" xmlns:o="urn:schemas-microsoft-com:office:office" xmlns:r="http://schemas.openxmlformats.org/officeDocument/2006/relationships" xmlns:m="http://schemas.openxmlformats.org/officeDocument/2006/math" xmlns:v="urn:schemas-microsoft-com:vml" xmlns:wp14="http://schemas.microsoft.com/office/word/2010/wordprocessingDrawing" xmlns:wp="http://schemas.openxmlformats.org/drawingml/2006/wordprocessingDrawing" xmlns:w10="urn:schemas-microsoft-com:office:word" xmlns:w="http://schemas.openxmlformats.org/wordprocessingml/2006/main" xmlns:w14="http://schemas.microsoft.com/office/word/2010/wordml" xmlns:w15="http://schemas.microsoft.com/office/word/2012/wordml" xmlns:w16cex="http://schemas.microsoft.com/office/word/2018/wordml/cex" xmlns:w16cid="http://schemas.microsoft.com/office/word/2016/wordml/cid" xmlns:w16="http://schemas.microsoft.com/office/word/2018/wordml" xmlns:w16sdtdh="http://schemas.microsoft.com/office/word/2020/wordml/sdtdatahash" xmlns:w16se="http://schemas.microsoft.com/office/word/2015/wordml/symex" xmlns:wpg="http://schemas.microsoft.com/office/word/2010/wordprocessingGroup" xmlns:wpi="http://schemas.microsoft.com/office/word/2010/wordprocessingInk" xmlns:wne="http://schemas.microsoft.com/office/word/2006/wordml" xmlns:wps="http://schemas.microsoft.com/office/word/2010/wordprocessingShape" mc:Ignorable="w14 w15 w16se w16cid w16 w16cex w16sdtdh wp14">
+<w:footnotes xmlns:wpc="http://schemas.microsoft.com/office/word/2010/wordprocessingCanvas" xmlns:cx="http://schemas.microsoft.com/office/drawing/2014/chartex" xmlns:cx1="http://schemas.microsoft.com/office/drawing/2015/9/8/chartex" xmlns:cx2="http://schemas.microsoft.com/office/drawing/2015/10/21/chartex" xmlns:cx3="http://schemas.microsoft.com/office/drawing/2016/5/9/chartex" xmlns:cx4="http://schemas.microsoft.com/office/drawing/2016/5/10/chartex" xmlns:cx5="http://schemas.microsoft.com/office/drawing/2016/5/11/chartex" xmlns:cx6="http://schemas.microsoft.com/office/drawing/2016/5/12/chartex" xmlns:cx7="http://schemas.microsoft.com/office/drawing/2016/5/13/chartex" xmlns:cx8="http://schemas.microsoft.com/office/drawing/2016/5/14/chartex" xmlns:mc="http://schemas.openxmlformats.org/markup-compatibility/2006" xmlns:aink="http://schemas.microsoft.com/office/drawing/2016/ink" xmlns:am3d="http://schemas.microsoft.com/office/drawing/2017/model3d" xmlns:o="urn:schemas-microsoft-com:office:office" xmlns:r="http://schemas.openxmlformats.org/officeDocument/2006/relationships" xmlns:m="http://schemas.openxmlformats.org/officeDocument/2006/math" xmlns:v="urn:schemas-microsoft-com:vml" xmlns:wp14="http://schemas.microsoft.com/office/word/2010/wordprocessingDrawing" xmlns:wp="http://schemas.openxmlformats.org/drawingml/2006/wordprocessingDrawing" xmlns:w10="urn:schemas-microsoft-com:office:word" xmlns:w="http://schemas.openxmlformats.org/wordprocessingml/2006/main" xmlns:w14="http://schemas.microsoft.com/office/word/2010/wordml" xmlns:w15="http://schemas.microsoft.com/office/word/2012/wordml" xmlns:w16cid="http://schemas.microsoft.com/office/word/2016/wordml/cid" xmlns:w16se="http://schemas.microsoft.com/office/word/2015/wordml/symex" xmlns:wpg="http://schemas.microsoft.com/office/word/2010/wordprocessingGroup" xmlns:wpi="http://schemas.microsoft.com/office/word/2010/wordprocessingInk" xmlns:wne="http://schemas.microsoft.com/office/word/2006/wordml" xmlns:wps="http://schemas.microsoft.com/office/word/2010/wordprocessingShape" mc:Ignorable="w14 w15 w16se w16cid wp14">
   <w:footnote w:type="separator" w:id="-1">
     <w:p>
       <w:pPr>
@@ -5776,7 +6986,7 @@
 </file>
 
 <file path=word/header1.xml><?xml version="1.0" encoding="utf-8"?>
-<w:hdr xmlns:wpc="http://schemas.microsoft.com/office/word/2010/wordprocessingCanvas" xmlns:cx="http://schemas.microsoft.com/office/drawing/2014/chartex" xmlns:cx1="http://schemas.microsoft.com/office/drawing/2015/9/8/chartex" xmlns:cx2="http://schemas.microsoft.com/office/drawing/2015/10/21/chartex" xmlns:cx3="http://schemas.microsoft.com/office/drawing/2016/5/9/chartex" xmlns:cx4="http://schemas.microsoft.com/office/drawing/2016/5/10/chartex" xmlns:cx5="http://schemas.microsoft.com/office/drawing/2016/5/11/chartex" xmlns:cx6="http://schemas.microsoft.com/office/drawing/2016/5/12/chartex" xmlns:cx7="http://schemas.microsoft.com/office/drawing/2016/5/13/chartex" xmlns:cx8="http://schemas.microsoft.com/office/drawing/2016/5/14/chartex" xmlns:mc="http://schemas.openxmlformats.org/markup-compatibility/2006" xmlns:aink="http://schemas.microsoft.com/office/drawing/2016/ink" xmlns:am3d="http://schemas.microsoft.com/office/drawing/2017/model3d" xmlns:o="urn:schemas-microsoft-com:office:office" xmlns:r="http://schemas.openxmlformats.org/officeDocument/2006/relationships" xmlns:m="http://schemas.openxmlformats.org/officeDocument/2006/math" xmlns:v="urn:schemas-microsoft-com:vml" xmlns:wp14="http://schemas.microsoft.com/office/word/2010/wordprocessingDrawing" xmlns:wp="http://schemas.openxmlformats.org/drawingml/2006/wordprocessingDrawing" xmlns:w10="urn:schemas-microsoft-com:office:word" xmlns:w="http://schemas.openxmlformats.org/wordprocessingml/2006/main" xmlns:w14="http://schemas.microsoft.com/office/word/2010/wordml" xmlns:w15="http://schemas.microsoft.com/office/word/2012/wordml" xmlns:w16cex="http://schemas.microsoft.com/office/word/2018/wordml/cex" xmlns:w16cid="http://schemas.microsoft.com/office/word/2016/wordml/cid" xmlns:w16="http://schemas.microsoft.com/office/word/2018/wordml" xmlns:w16sdtdh="http://schemas.microsoft.com/office/word/2020/wordml/sdtdatahash" xmlns:w16se="http://schemas.microsoft.com/office/word/2015/wordml/symex" xmlns:wpg="http://schemas.microsoft.com/office/word/2010/wordprocessingGroup" xmlns:wpi="http://schemas.microsoft.com/office/word/2010/wordprocessingInk" xmlns:wne="http://schemas.microsoft.com/office/word/2006/wordml" xmlns:wps="http://schemas.microsoft.com/office/word/2010/wordprocessingShape" mc:Ignorable="w14 w15 w16se w16cid w16 w16cex w16sdtdh wp14">
+<w:hdr xmlns:wpc="http://schemas.microsoft.com/office/word/2010/wordprocessingCanvas" xmlns:cx="http://schemas.microsoft.com/office/drawing/2014/chartex" xmlns:cx1="http://schemas.microsoft.com/office/drawing/2015/9/8/chartex" xmlns:cx2="http://schemas.microsoft.com/office/drawing/2015/10/21/chartex" xmlns:cx3="http://schemas.microsoft.com/office/drawing/2016/5/9/chartex" xmlns:cx4="http://schemas.microsoft.com/office/drawing/2016/5/10/chartex" xmlns:cx5="http://schemas.microsoft.com/office/drawing/2016/5/11/chartex" xmlns:cx6="http://schemas.microsoft.com/office/drawing/2016/5/12/chartex" xmlns:cx7="http://schemas.microsoft.com/office/drawing/2016/5/13/chartex" xmlns:cx8="http://schemas.microsoft.com/office/drawing/2016/5/14/chartex" xmlns:mc="http://schemas.openxmlformats.org/markup-compatibility/2006" xmlns:aink="http://schemas.microsoft.com/office/drawing/2016/ink" xmlns:am3d="http://schemas.microsoft.com/office/drawing/2017/model3d" xmlns:o="urn:schemas-microsoft-com:office:office" xmlns:r="http://schemas.openxmlformats.org/officeDocument/2006/relationships" xmlns:m="http://schemas.openxmlformats.org/officeDocument/2006/math" xmlns:v="urn:schemas-microsoft-com:vml" xmlns:wp14="http://schemas.microsoft.com/office/word/2010/wordprocessingDrawing" xmlns:wp="http://schemas.openxmlformats.org/drawingml/2006/wordprocessingDrawing" xmlns:w10="urn:schemas-microsoft-com:office:word" xmlns:w="http://schemas.openxmlformats.org/wordprocessingml/2006/main" xmlns:w14="http://schemas.microsoft.com/office/word/2010/wordml" xmlns:w15="http://schemas.microsoft.com/office/word/2012/wordml" xmlns:w16cid="http://schemas.microsoft.com/office/word/2016/wordml/cid" xmlns:w16se="http://schemas.microsoft.com/office/word/2015/wordml/symex" xmlns:wpg="http://schemas.microsoft.com/office/word/2010/wordprocessingGroup" xmlns:wpi="http://schemas.microsoft.com/office/word/2010/wordprocessingInk" xmlns:wne="http://schemas.microsoft.com/office/word/2006/wordml" xmlns:wps="http://schemas.microsoft.com/office/word/2010/wordprocessingShape" mc:Ignorable="w14 w15 w16se w16cid wp14">
   <w:sdt>
     <w:sdtPr>
       <w:rPr>
@@ -5795,7 +7005,7 @@
     <w:sdtContent>
       <w:p>
         <w:pPr>
-          <w:pStyle w:val="Header"/>
+          <w:pStyle w:val="lfej"/>
           <w:jc w:val="right"/>
           <w:rPr>
             <w:color w:val="7F7F7F" w:themeColor="text1" w:themeTint="80"/>
@@ -5812,14 +7022,14 @@
   </w:sdt>
   <w:p>
     <w:pPr>
-      <w:pStyle w:val="Header"/>
+      <w:pStyle w:val="lfej"/>
     </w:pPr>
   </w:p>
 </w:hdr>
 </file>
 
 <file path=word/numbering.xml><?xml version="1.0" encoding="utf-8"?>
-<w:numbering xmlns:wpc="http://schemas.microsoft.com/office/word/2010/wordprocessingCanvas" xmlns:cx="http://schemas.microsoft.com/office/drawing/2014/chartex" xmlns:cx1="http://schemas.microsoft.com/office/drawing/2015/9/8/chartex" xmlns:cx2="http://schemas.microsoft.com/office/drawing/2015/10/21/chartex" xmlns:cx3="http://schemas.microsoft.com/office/drawing/2016/5/9/chartex" xmlns:cx4="http://schemas.microsoft.com/office/drawing/2016/5/10/chartex" xmlns:cx5="http://schemas.microsoft.com/office/drawing/2016/5/11/chartex" xmlns:cx6="http://schemas.microsoft.com/office/drawing/2016/5/12/chartex" xmlns:cx7="http://schemas.microsoft.com/office/drawing/2016/5/13/chartex" xmlns:cx8="http://schemas.microsoft.com/office/drawing/2016/5/14/chartex" xmlns:mc="http://schemas.openxmlformats.org/markup-compatibility/2006" xmlns:aink="http://schemas.microsoft.com/office/drawing/2016/ink" xmlns:am3d="http://schemas.microsoft.com/office/drawing/2017/model3d" xmlns:o="urn:schemas-microsoft-com:office:office" xmlns:r="http://schemas.openxmlformats.org/officeDocument/2006/relationships" xmlns:m="http://schemas.openxmlformats.org/officeDocument/2006/math" xmlns:v="urn:schemas-microsoft-com:vml" xmlns:wp14="http://schemas.microsoft.com/office/word/2010/wordprocessingDrawing" xmlns:wp="http://schemas.openxmlformats.org/drawingml/2006/wordprocessingDrawing" xmlns:w10="urn:schemas-microsoft-com:office:word" xmlns:w="http://schemas.openxmlformats.org/wordprocessingml/2006/main" xmlns:w14="http://schemas.microsoft.com/office/word/2010/wordml" xmlns:w15="http://schemas.microsoft.com/office/word/2012/wordml" xmlns:w16cex="http://schemas.microsoft.com/office/word/2018/wordml/cex" xmlns:w16cid="http://schemas.microsoft.com/office/word/2016/wordml/cid" xmlns:w16="http://schemas.microsoft.com/office/word/2018/wordml" xmlns:w16sdtdh="http://schemas.microsoft.com/office/word/2020/wordml/sdtdatahash" xmlns:w16se="http://schemas.microsoft.com/office/word/2015/wordml/symex" xmlns:wpg="http://schemas.microsoft.com/office/word/2010/wordprocessingGroup" xmlns:wpi="http://schemas.microsoft.com/office/word/2010/wordprocessingInk" xmlns:wne="http://schemas.microsoft.com/office/word/2006/wordml" xmlns:wps="http://schemas.microsoft.com/office/word/2010/wordprocessingShape" mc:Ignorable="w14 w15 w16se w16cid w16 w16cex w16sdtdh wp14">
+<w:numbering xmlns:wpc="http://schemas.microsoft.com/office/word/2010/wordprocessingCanvas" xmlns:cx="http://schemas.microsoft.com/office/drawing/2014/chartex" xmlns:cx1="http://schemas.microsoft.com/office/drawing/2015/9/8/chartex" xmlns:cx2="http://schemas.microsoft.com/office/drawing/2015/10/21/chartex" xmlns:cx3="http://schemas.microsoft.com/office/drawing/2016/5/9/chartex" xmlns:cx4="http://schemas.microsoft.com/office/drawing/2016/5/10/chartex" xmlns:cx5="http://schemas.microsoft.com/office/drawing/2016/5/11/chartex" xmlns:cx6="http://schemas.microsoft.com/office/drawing/2016/5/12/chartex" xmlns:cx7="http://schemas.microsoft.com/office/drawing/2016/5/13/chartex" xmlns:cx8="http://schemas.microsoft.com/office/drawing/2016/5/14/chartex" xmlns:mc="http://schemas.openxmlformats.org/markup-compatibility/2006" xmlns:aink="http://schemas.microsoft.com/office/drawing/2016/ink" xmlns:am3d="http://schemas.microsoft.com/office/drawing/2017/model3d" xmlns:o="urn:schemas-microsoft-com:office:office" xmlns:r="http://schemas.openxmlformats.org/officeDocument/2006/relationships" xmlns:m="http://schemas.openxmlformats.org/officeDocument/2006/math" xmlns:v="urn:schemas-microsoft-com:vml" xmlns:wp14="http://schemas.microsoft.com/office/word/2010/wordprocessingDrawing" xmlns:wp="http://schemas.openxmlformats.org/drawingml/2006/wordprocessingDrawing" xmlns:w10="urn:schemas-microsoft-com:office:word" xmlns:w="http://schemas.openxmlformats.org/wordprocessingml/2006/main" xmlns:w14="http://schemas.microsoft.com/office/word/2010/wordml" xmlns:w15="http://schemas.microsoft.com/office/word/2012/wordml" xmlns:w16cid="http://schemas.microsoft.com/office/word/2016/wordml/cid" xmlns:w16se="http://schemas.microsoft.com/office/word/2015/wordml/symex" xmlns:wpg="http://schemas.microsoft.com/office/word/2010/wordprocessingGroup" xmlns:wpi="http://schemas.microsoft.com/office/word/2010/wordprocessingInk" xmlns:wne="http://schemas.microsoft.com/office/word/2006/wordml" xmlns:wps="http://schemas.microsoft.com/office/word/2010/wordprocessingShape" mc:Ignorable="w14 w15 w16se w16cid wp14">
   <w:abstractNum w:abstractNumId="0" w15:restartNumberingAfterBreak="0">
     <w:nsid w:val="002D78F0"/>
     <w:multiLevelType w:val="hybridMultilevel"/>
@@ -9107,7 +10317,7 @@
 </file>
 
 <file path=word/styles.xml><?xml version="1.0" encoding="utf-8"?>
-<w:styles xmlns:mc="http://schemas.openxmlformats.org/markup-compatibility/2006" xmlns:r="http://schemas.openxmlformats.org/officeDocument/2006/relationships" xmlns:w="http://schemas.openxmlformats.org/wordprocessingml/2006/main" xmlns:w14="http://schemas.microsoft.com/office/word/2010/wordml" xmlns:w15="http://schemas.microsoft.com/office/word/2012/wordml" xmlns:w16cex="http://schemas.microsoft.com/office/word/2018/wordml/cex" xmlns:w16cid="http://schemas.microsoft.com/office/word/2016/wordml/cid" xmlns:w16="http://schemas.microsoft.com/office/word/2018/wordml" xmlns:w16sdtdh="http://schemas.microsoft.com/office/word/2020/wordml/sdtdatahash" xmlns:w16se="http://schemas.microsoft.com/office/word/2015/wordml/symex" mc:Ignorable="w14 w15 w16se w16cid w16 w16cex w16sdtdh">
+<w:styles xmlns:mc="http://schemas.openxmlformats.org/markup-compatibility/2006" xmlns:r="http://schemas.openxmlformats.org/officeDocument/2006/relationships" xmlns:w="http://schemas.openxmlformats.org/wordprocessingml/2006/main" xmlns:w14="http://schemas.microsoft.com/office/word/2010/wordml" xmlns:w15="http://schemas.microsoft.com/office/word/2012/wordml" xmlns:w16cid="http://schemas.microsoft.com/office/word/2016/wordml/cid" xmlns:w16se="http://schemas.microsoft.com/office/word/2015/wordml/symex" mc:Ignorable="w14 w15 w16se w16cid">
   <w:docDefaults>
     <w:rPrDefault>
       <w:rPr>
@@ -9123,7 +10333,7 @@
       </w:pPr>
     </w:pPrDefault>
   </w:docDefaults>
-  <w:latentStyles w:defLockedState="0" w:defUIPriority="99" w:defSemiHidden="0" w:defUnhideWhenUsed="0" w:defQFormat="0" w:count="376">
+  <w:latentStyles w:defLockedState="0" w:defUIPriority="99" w:defSemiHidden="0" w:defUnhideWhenUsed="0" w:defQFormat="0" w:count="375">
     <w:lsdException w:name="Normal" w:uiPriority="0" w:qFormat="1"/>
     <w:lsdException w:name="heading 1" w:uiPriority="9" w:qFormat="1"/>
     <w:lsdException w:name="heading 2" w:semiHidden="1" w:uiPriority="9" w:unhideWhenUsed="1" w:qFormat="1"/>
@@ -9499,17 +10709,16 @@
     <w:lsdException w:name="Smart Hyperlink" w:semiHidden="1" w:unhideWhenUsed="1"/>
     <w:lsdException w:name="Hashtag" w:semiHidden="1" w:unhideWhenUsed="1"/>
     <w:lsdException w:name="Unresolved Mention" w:semiHidden="1" w:unhideWhenUsed="1"/>
-    <w:lsdException w:name="Smart Link" w:semiHidden="1" w:unhideWhenUsed="1"/>
   </w:latentStyles>
-  <w:style w:type="paragraph" w:default="1" w:styleId="Normal">
+  <w:style w:type="paragraph" w:default="1" w:styleId="Norml">
     <w:name w:val="Normal"/>
     <w:qFormat/>
   </w:style>
-  <w:style w:type="paragraph" w:styleId="Heading1">
+  <w:style w:type="paragraph" w:styleId="Cmsor1">
     <w:name w:val="heading 1"/>
-    <w:basedOn w:val="Normal"/>
-    <w:next w:val="Normal"/>
-    <w:link w:val="Heading1Char"/>
+    <w:basedOn w:val="Norml"/>
+    <w:next w:val="Norml"/>
+    <w:link w:val="Cmsor1Char"/>
     <w:uiPriority w:val="9"/>
     <w:qFormat/>
     <w:rsid w:val="0056423D"/>
@@ -9521,11 +10730,11 @@
       <w:szCs w:val="52"/>
     </w:rPr>
   </w:style>
-  <w:style w:type="paragraph" w:styleId="Heading2">
+  <w:style w:type="paragraph" w:styleId="Cmsor2">
     <w:name w:val="heading 2"/>
-    <w:basedOn w:val="NormalWeb"/>
-    <w:next w:val="Normal"/>
-    <w:link w:val="Heading2Char"/>
+    <w:basedOn w:val="NormlWeb"/>
+    <w:next w:val="Norml"/>
+    <w:link w:val="Cmsor2Char"/>
     <w:uiPriority w:val="9"/>
     <w:unhideWhenUsed/>
     <w:qFormat/>
@@ -9539,11 +10748,11 @@
       <w:szCs w:val="36"/>
     </w:rPr>
   </w:style>
-  <w:style w:type="paragraph" w:styleId="Heading3">
+  <w:style w:type="paragraph" w:styleId="Cmsor3">
     <w:name w:val="heading 3"/>
-    <w:basedOn w:val="Normal"/>
-    <w:next w:val="Normal"/>
-    <w:link w:val="Heading3Char"/>
+    <w:basedOn w:val="Norml"/>
+    <w:next w:val="Norml"/>
+    <w:link w:val="Cmsor3Char"/>
     <w:uiPriority w:val="9"/>
     <w:unhideWhenUsed/>
     <w:qFormat/>
@@ -9562,11 +10771,11 @@
       <w:szCs w:val="28"/>
     </w:rPr>
   </w:style>
-  <w:style w:type="paragraph" w:styleId="Heading4">
+  <w:style w:type="paragraph" w:styleId="Cmsor4">
     <w:name w:val="heading 4"/>
-    <w:basedOn w:val="Normal"/>
-    <w:next w:val="Normal"/>
-    <w:link w:val="Heading4Char"/>
+    <w:basedOn w:val="Norml"/>
+    <w:next w:val="Norml"/>
+    <w:link w:val="Cmsor4Char"/>
     <w:uiPriority w:val="9"/>
     <w:unhideWhenUsed/>
     <w:qFormat/>
@@ -9580,11 +10789,11 @@
       <w:sz w:val="24"/>
     </w:rPr>
   </w:style>
-  <w:style w:type="paragraph" w:styleId="Heading5">
+  <w:style w:type="paragraph" w:styleId="Cmsor5">
     <w:name w:val="heading 5"/>
-    <w:basedOn w:val="Normal"/>
-    <w:next w:val="Normal"/>
-    <w:link w:val="Heading5Char"/>
+    <w:basedOn w:val="Norml"/>
+    <w:next w:val="Norml"/>
+    <w:link w:val="Cmsor5Char"/>
     <w:uiPriority w:val="9"/>
     <w:unhideWhenUsed/>
     <w:qFormat/>
@@ -9598,11 +10807,11 @@
       <w:sz w:val="24"/>
     </w:rPr>
   </w:style>
-  <w:style w:type="paragraph" w:styleId="Heading6">
+  <w:style w:type="paragraph" w:styleId="Cmsor6">
     <w:name w:val="heading 6"/>
-    <w:basedOn w:val="Normal"/>
-    <w:next w:val="Normal"/>
-    <w:link w:val="Heading6Char"/>
+    <w:basedOn w:val="Norml"/>
+    <w:next w:val="Norml"/>
+    <w:link w:val="Cmsor6Char"/>
     <w:uiPriority w:val="9"/>
     <w:unhideWhenUsed/>
     <w:qFormat/>
@@ -9615,13 +10824,13 @@
       <w:sz w:val="24"/>
     </w:rPr>
   </w:style>
-  <w:style w:type="character" w:default="1" w:styleId="DefaultParagraphFont">
+  <w:style w:type="character" w:default="1" w:styleId="Bekezdsalapbettpusa">
     <w:name w:val="Default Paragraph Font"/>
     <w:uiPriority w:val="1"/>
     <w:semiHidden/>
     <w:unhideWhenUsed/>
   </w:style>
-  <w:style w:type="table" w:default="1" w:styleId="TableNormal">
+  <w:style w:type="table" w:default="1" w:styleId="Normltblzat">
     <w:name w:val="Normal Table"/>
     <w:uiPriority w:val="99"/>
     <w:semiHidden/>
@@ -9636,16 +10845,16 @@
       </w:tblCellMar>
     </w:tblPr>
   </w:style>
-  <w:style w:type="numbering" w:default="1" w:styleId="NoList">
+  <w:style w:type="numbering" w:default="1" w:styleId="Nemlista">
     <w:name w:val="No List"/>
     <w:uiPriority w:val="99"/>
     <w:semiHidden/>
     <w:unhideWhenUsed/>
   </w:style>
-  <w:style w:type="character" w:customStyle="1" w:styleId="Heading1Char">
-    <w:name w:val="Heading 1 Char"/>
-    <w:basedOn w:val="DefaultParagraphFont"/>
-    <w:link w:val="Heading1"/>
+  <w:style w:type="character" w:customStyle="1" w:styleId="Cmsor1Char">
+    <w:name w:val="Címsor 1 Char"/>
+    <w:basedOn w:val="Bekezdsalapbettpusa"/>
+    <w:link w:val="Cmsor1"/>
     <w:uiPriority w:val="9"/>
     <w:rsid w:val="0056423D"/>
     <w:rPr>
@@ -9653,10 +10862,10 @@
       <w:szCs w:val="52"/>
     </w:rPr>
   </w:style>
-  <w:style w:type="character" w:customStyle="1" w:styleId="Heading2Char">
-    <w:name w:val="Heading 2 Char"/>
-    <w:basedOn w:val="DefaultParagraphFont"/>
-    <w:link w:val="Heading2"/>
+  <w:style w:type="character" w:customStyle="1" w:styleId="Cmsor2Char">
+    <w:name w:val="Címsor 2 Char"/>
+    <w:basedOn w:val="Bekezdsalapbettpusa"/>
+    <w:link w:val="Cmsor2"/>
     <w:uiPriority w:val="9"/>
     <w:rsid w:val="005B3E60"/>
     <w:rPr>
@@ -9666,9 +10875,9 @@
       <w:lang w:eastAsia="hu-HU"/>
     </w:rPr>
   </w:style>
-  <w:style w:type="paragraph" w:styleId="NormalWeb">
+  <w:style w:type="paragraph" w:styleId="NormlWeb">
     <w:name w:val="Normal (Web)"/>
-    <w:basedOn w:val="Normal"/>
+    <w:basedOn w:val="Norml"/>
     <w:uiPriority w:val="99"/>
     <w:unhideWhenUsed/>
     <w:rsid w:val="0056423D"/>
@@ -9682,9 +10891,9 @@
       <w:lang w:eastAsia="hu-HU"/>
     </w:rPr>
   </w:style>
-  <w:style w:type="character" w:styleId="Strong">
+  <w:style w:type="character" w:styleId="Kiemels2">
     <w:name w:val="Strong"/>
-    <w:basedOn w:val="DefaultParagraphFont"/>
+    <w:basedOn w:val="Bekezdsalapbettpusa"/>
     <w:uiPriority w:val="22"/>
     <w:qFormat/>
     <w:rsid w:val="0056423D"/>
@@ -9693,10 +10902,10 @@
       <w:bCs/>
     </w:rPr>
   </w:style>
-  <w:style w:type="paragraph" w:styleId="Header">
+  <w:style w:type="paragraph" w:styleId="lfej">
     <w:name w:val="header"/>
-    <w:basedOn w:val="Normal"/>
-    <w:link w:val="HeaderChar"/>
+    <w:basedOn w:val="Norml"/>
+    <w:link w:val="lfejChar"/>
     <w:uiPriority w:val="99"/>
     <w:unhideWhenUsed/>
     <w:rsid w:val="00E94C38"/>
@@ -9708,17 +10917,17 @@
       <w:spacing w:after="0" w:line="240" w:lineRule="auto"/>
     </w:pPr>
   </w:style>
-  <w:style w:type="character" w:customStyle="1" w:styleId="HeaderChar">
-    <w:name w:val="Header Char"/>
-    <w:basedOn w:val="DefaultParagraphFont"/>
-    <w:link w:val="Header"/>
+  <w:style w:type="character" w:customStyle="1" w:styleId="lfejChar">
+    <w:name w:val="Élőfej Char"/>
+    <w:basedOn w:val="Bekezdsalapbettpusa"/>
+    <w:link w:val="lfej"/>
     <w:uiPriority w:val="99"/>
     <w:rsid w:val="00E94C38"/>
   </w:style>
-  <w:style w:type="paragraph" w:styleId="Footer">
+  <w:style w:type="paragraph" w:styleId="llb">
     <w:name w:val="footer"/>
-    <w:basedOn w:val="Normal"/>
-    <w:link w:val="FooterChar"/>
+    <w:basedOn w:val="Norml"/>
+    <w:link w:val="llbChar"/>
     <w:uiPriority w:val="99"/>
     <w:unhideWhenUsed/>
     <w:rsid w:val="00E94C38"/>
@@ -9730,17 +10939,17 @@
       <w:spacing w:after="0" w:line="240" w:lineRule="auto"/>
     </w:pPr>
   </w:style>
-  <w:style w:type="character" w:customStyle="1" w:styleId="FooterChar">
-    <w:name w:val="Footer Char"/>
-    <w:basedOn w:val="DefaultParagraphFont"/>
-    <w:link w:val="Footer"/>
+  <w:style w:type="character" w:customStyle="1" w:styleId="llbChar">
+    <w:name w:val="Élőláb Char"/>
+    <w:basedOn w:val="Bekezdsalapbettpusa"/>
+    <w:link w:val="llb"/>
     <w:uiPriority w:val="99"/>
     <w:rsid w:val="00E94C38"/>
   </w:style>
-  <w:style w:type="paragraph" w:styleId="TOCHeading">
+  <w:style w:type="paragraph" w:styleId="Tartalomjegyzkcmsora">
     <w:name w:val="TOC Heading"/>
-    <w:basedOn w:val="Heading1"/>
-    <w:next w:val="Normal"/>
+    <w:basedOn w:val="Cmsor1"/>
+    <w:next w:val="Norml"/>
     <w:uiPriority w:val="39"/>
     <w:unhideWhenUsed/>
     <w:qFormat/>
@@ -9759,10 +10968,10 @@
       <w:lang w:eastAsia="hu-HU"/>
     </w:rPr>
   </w:style>
-  <w:style w:type="paragraph" w:styleId="TOC1">
+  <w:style w:type="paragraph" w:styleId="TJ1">
     <w:name w:val="toc 1"/>
-    <w:basedOn w:val="Normal"/>
-    <w:next w:val="Normal"/>
+    <w:basedOn w:val="Norml"/>
+    <w:next w:val="Norml"/>
     <w:autoRedefine/>
     <w:uiPriority w:val="39"/>
     <w:unhideWhenUsed/>
@@ -9771,10 +10980,10 @@
       <w:spacing w:after="100"/>
     </w:pPr>
   </w:style>
-  <w:style w:type="paragraph" w:styleId="TOC2">
+  <w:style w:type="paragraph" w:styleId="TJ2">
     <w:name w:val="toc 2"/>
-    <w:basedOn w:val="Normal"/>
-    <w:next w:val="Normal"/>
+    <w:basedOn w:val="Norml"/>
+    <w:next w:val="Norml"/>
     <w:autoRedefine/>
     <w:uiPriority w:val="39"/>
     <w:unhideWhenUsed/>
@@ -9784,9 +10993,9 @@
       <w:ind w:left="220"/>
     </w:pPr>
   </w:style>
-  <w:style w:type="character" w:styleId="Hyperlink">
+  <w:style w:type="character" w:styleId="Hiperhivatkozs">
     <w:name w:val="Hyperlink"/>
-    <w:basedOn w:val="DefaultParagraphFont"/>
+    <w:basedOn w:val="Bekezdsalapbettpusa"/>
     <w:uiPriority w:val="99"/>
     <w:unhideWhenUsed/>
     <w:rsid w:val="00E94C38"/>
@@ -9795,9 +11004,9 @@
       <w:u w:val="single"/>
     </w:rPr>
   </w:style>
-  <w:style w:type="paragraph" w:styleId="ListParagraph">
+  <w:style w:type="paragraph" w:styleId="Listaszerbekezds">
     <w:name w:val="List Paragraph"/>
-    <w:basedOn w:val="Normal"/>
+    <w:basedOn w:val="Norml"/>
     <w:uiPriority w:val="34"/>
     <w:qFormat/>
     <w:rsid w:val="00E76741"/>
@@ -9806,10 +11015,10 @@
       <w:contextualSpacing/>
     </w:pPr>
   </w:style>
-  <w:style w:type="character" w:customStyle="1" w:styleId="Heading3Char">
-    <w:name w:val="Heading 3 Char"/>
-    <w:basedOn w:val="DefaultParagraphFont"/>
-    <w:link w:val="Heading3"/>
+  <w:style w:type="character" w:customStyle="1" w:styleId="Cmsor3Char">
+    <w:name w:val="Címsor 3 Char"/>
+    <w:basedOn w:val="Bekezdsalapbettpusa"/>
+    <w:link w:val="Cmsor3"/>
     <w:uiPriority w:val="9"/>
     <w:rsid w:val="004420DF"/>
     <w:rPr>
@@ -9820,10 +11029,10 @@
       <w:szCs w:val="28"/>
     </w:rPr>
   </w:style>
-  <w:style w:type="paragraph" w:styleId="TOC3">
+  <w:style w:type="paragraph" w:styleId="TJ3">
     <w:name w:val="toc 3"/>
-    <w:basedOn w:val="Normal"/>
-    <w:next w:val="Normal"/>
+    <w:basedOn w:val="Norml"/>
+    <w:next w:val="Norml"/>
     <w:autoRedefine/>
     <w:uiPriority w:val="39"/>
     <w:unhideWhenUsed/>
@@ -9835,7 +11044,7 @@
   </w:style>
   <w:style w:type="paragraph" w:customStyle="1" w:styleId="whitespace-normal">
     <w:name w:val="whitespace-normal"/>
-    <w:basedOn w:val="Normal"/>
+    <w:basedOn w:val="Norml"/>
     <w:rsid w:val="00A9676A"/>
     <w:pPr>
       <w:spacing w:before="100" w:beforeAutospacing="1" w:after="100" w:afterAutospacing="1" w:line="240" w:lineRule="auto"/>
@@ -9849,7 +11058,7 @@
   </w:style>
   <w:style w:type="paragraph" w:customStyle="1" w:styleId="font-claude-response-body">
     <w:name w:val="font-claude-response-body"/>
-    <w:basedOn w:val="Normal"/>
+    <w:basedOn w:val="Norml"/>
     <w:rsid w:val="00A9676A"/>
     <w:pPr>
       <w:spacing w:before="100" w:beforeAutospacing="1" w:after="100" w:afterAutospacing="1" w:line="240" w:lineRule="auto"/>
@@ -9861,10 +11070,10 @@
       <w:lang w:eastAsia="hu-HU"/>
     </w:rPr>
   </w:style>
-  <w:style w:type="character" w:customStyle="1" w:styleId="Heading4Char">
-    <w:name w:val="Heading 4 Char"/>
-    <w:basedOn w:val="DefaultParagraphFont"/>
-    <w:link w:val="Heading4"/>
+  <w:style w:type="character" w:customStyle="1" w:styleId="Cmsor4Char">
+    <w:name w:val="Címsor 4 Char"/>
+    <w:basedOn w:val="Bekezdsalapbettpusa"/>
+    <w:link w:val="Cmsor4"/>
     <w:uiPriority w:val="9"/>
     <w:rsid w:val="00120911"/>
     <w:rPr>
@@ -9885,10 +11094,10 @@
       <w:lang w:eastAsia="hu-HU"/>
     </w:rPr>
   </w:style>
-  <w:style w:type="character" w:customStyle="1" w:styleId="Heading5Char">
-    <w:name w:val="Heading 5 Char"/>
-    <w:basedOn w:val="DefaultParagraphFont"/>
-    <w:link w:val="Heading5"/>
+  <w:style w:type="character" w:customStyle="1" w:styleId="Cmsor5Char">
+    <w:name w:val="Címsor 5 Char"/>
+    <w:basedOn w:val="Bekezdsalapbettpusa"/>
+    <w:link w:val="Cmsor5"/>
     <w:uiPriority w:val="9"/>
     <w:rsid w:val="00F43B8F"/>
     <w:rPr>
@@ -9896,10 +11105,10 @@
       <w:sz w:val="24"/>
     </w:rPr>
   </w:style>
-  <w:style w:type="character" w:customStyle="1" w:styleId="Heading6Char">
-    <w:name w:val="Heading 6 Char"/>
-    <w:basedOn w:val="DefaultParagraphFont"/>
-    <w:link w:val="Heading6"/>
+  <w:style w:type="character" w:customStyle="1" w:styleId="Cmsor6Char">
+    <w:name w:val="Címsor 6 Char"/>
+    <w:basedOn w:val="Bekezdsalapbettpusa"/>
+    <w:link w:val="Cmsor6"/>
     <w:uiPriority w:val="9"/>
     <w:rsid w:val="00793C1E"/>
     <w:rPr>
@@ -9911,7 +11120,7 @@
 </file>
 
 <file path=word/glossary/document.xml><?xml version="1.0" encoding="utf-8"?>
-<w:glossaryDocument xmlns:wpc="http://schemas.microsoft.com/office/word/2010/wordprocessingCanvas" xmlns:cx="http://schemas.microsoft.com/office/drawing/2014/chartex" xmlns:cx1="http://schemas.microsoft.com/office/drawing/2015/9/8/chartex" xmlns:cx2="http://schemas.microsoft.com/office/drawing/2015/10/21/chartex" xmlns:cx3="http://schemas.microsoft.com/office/drawing/2016/5/9/chartex" xmlns:cx4="http://schemas.microsoft.com/office/drawing/2016/5/10/chartex" xmlns:cx5="http://schemas.microsoft.com/office/drawing/2016/5/11/chartex" xmlns:cx6="http://schemas.microsoft.com/office/drawing/2016/5/12/chartex" xmlns:cx7="http://schemas.microsoft.com/office/drawing/2016/5/13/chartex" xmlns:cx8="http://schemas.microsoft.com/office/drawing/2016/5/14/chartex" xmlns:mc="http://schemas.openxmlformats.org/markup-compatibility/2006" xmlns:aink="http://schemas.microsoft.com/office/drawing/2016/ink" xmlns:am3d="http://schemas.microsoft.com/office/drawing/2017/model3d" xmlns:o="urn:schemas-microsoft-com:office:office" xmlns:r="http://schemas.openxmlformats.org/officeDocument/2006/relationships" xmlns:m="http://schemas.openxmlformats.org/officeDocument/2006/math" xmlns:v="urn:schemas-microsoft-com:vml" xmlns:wp14="http://schemas.microsoft.com/office/word/2010/wordprocessingDrawing" xmlns:wp="http://schemas.openxmlformats.org/drawingml/2006/wordprocessingDrawing" xmlns:w10="urn:schemas-microsoft-com:office:word" xmlns:w="http://schemas.openxmlformats.org/wordprocessingml/2006/main" xmlns:w14="http://schemas.microsoft.com/office/word/2010/wordml" xmlns:w15="http://schemas.microsoft.com/office/word/2012/wordml" xmlns:w16cex="http://schemas.microsoft.com/office/word/2018/wordml/cex" xmlns:w16cid="http://schemas.microsoft.com/office/word/2016/wordml/cid" xmlns:w16="http://schemas.microsoft.com/office/word/2018/wordml" xmlns:w16sdtdh="http://schemas.microsoft.com/office/word/2020/wordml/sdtdatahash" xmlns:w16se="http://schemas.microsoft.com/office/word/2015/wordml/symex" xmlns:wpg="http://schemas.microsoft.com/office/word/2010/wordprocessingGroup" xmlns:wpi="http://schemas.microsoft.com/office/word/2010/wordprocessingInk" xmlns:wne="http://schemas.microsoft.com/office/word/2006/wordml" xmlns:wps="http://schemas.microsoft.com/office/word/2010/wordprocessingShape" mc:Ignorable="w14 w15 w16se w16cid w16 w16cex w16sdtdh wp14">
+<w:glossaryDocument xmlns:wpc="http://schemas.microsoft.com/office/word/2010/wordprocessingCanvas" xmlns:cx="http://schemas.microsoft.com/office/drawing/2014/chartex" xmlns:cx1="http://schemas.microsoft.com/office/drawing/2015/9/8/chartex" xmlns:cx2="http://schemas.microsoft.com/office/drawing/2015/10/21/chartex" xmlns:cx3="http://schemas.microsoft.com/office/drawing/2016/5/9/chartex" xmlns:cx4="http://schemas.microsoft.com/office/drawing/2016/5/10/chartex" xmlns:cx5="http://schemas.microsoft.com/office/drawing/2016/5/11/chartex" xmlns:cx6="http://schemas.microsoft.com/office/drawing/2016/5/12/chartex" xmlns:cx7="http://schemas.microsoft.com/office/drawing/2016/5/13/chartex" xmlns:cx8="http://schemas.microsoft.com/office/drawing/2016/5/14/chartex" xmlns:mc="http://schemas.openxmlformats.org/markup-compatibility/2006" xmlns:aink="http://schemas.microsoft.com/office/drawing/2016/ink" xmlns:am3d="http://schemas.microsoft.com/office/drawing/2017/model3d" xmlns:o="urn:schemas-microsoft-com:office:office" xmlns:r="http://schemas.openxmlformats.org/officeDocument/2006/relationships" xmlns:m="http://schemas.openxmlformats.org/officeDocument/2006/math" xmlns:v="urn:schemas-microsoft-com:vml" xmlns:wp14="http://schemas.microsoft.com/office/word/2010/wordprocessingDrawing" xmlns:wp="http://schemas.openxmlformats.org/drawingml/2006/wordprocessingDrawing" xmlns:w10="urn:schemas-microsoft-com:office:word" xmlns:w="http://schemas.openxmlformats.org/wordprocessingml/2006/main" xmlns:w14="http://schemas.microsoft.com/office/word/2010/wordml" xmlns:w15="http://schemas.microsoft.com/office/word/2012/wordml" xmlns:w16cid="http://schemas.microsoft.com/office/word/2016/wordml/cid" xmlns:w16se="http://schemas.microsoft.com/office/word/2015/wordml/symex" xmlns:wpg="http://schemas.microsoft.com/office/word/2010/wordprocessingGroup" xmlns:wpi="http://schemas.microsoft.com/office/word/2010/wordprocessingInk" xmlns:wne="http://schemas.microsoft.com/office/word/2006/wordml" xmlns:wps="http://schemas.microsoft.com/office/word/2010/wordprocessingShape" mc:Ignorable="w14 w15 w16se w16cid wp14">
   <w:docParts>
     <w:docPart>
       <w:docPartPr>
@@ -9947,7 +11156,7 @@
 </file>
 
 <file path=word/glossary/fontTable.xml><?xml version="1.0" encoding="utf-8"?>
-<w:fonts xmlns:mc="http://schemas.openxmlformats.org/markup-compatibility/2006" xmlns:r="http://schemas.openxmlformats.org/officeDocument/2006/relationships" xmlns:w="http://schemas.openxmlformats.org/wordprocessingml/2006/main" xmlns:w14="http://schemas.microsoft.com/office/word/2010/wordml" xmlns:w15="http://schemas.microsoft.com/office/word/2012/wordml" xmlns:w16cex="http://schemas.microsoft.com/office/word/2018/wordml/cex" xmlns:w16cid="http://schemas.microsoft.com/office/word/2016/wordml/cid" xmlns:w16="http://schemas.microsoft.com/office/word/2018/wordml" xmlns:w16sdtdh="http://schemas.microsoft.com/office/word/2020/wordml/sdtdatahash" xmlns:w16se="http://schemas.microsoft.com/office/word/2015/wordml/symex" mc:Ignorable="w14 w15 w16se w16cid w16 w16cex w16sdtdh">
+<w:fonts xmlns:mc="http://schemas.openxmlformats.org/markup-compatibility/2006" xmlns:r="http://schemas.openxmlformats.org/officeDocument/2006/relationships" xmlns:w="http://schemas.openxmlformats.org/wordprocessingml/2006/main" xmlns:w14="http://schemas.microsoft.com/office/word/2010/wordml" xmlns:w15="http://schemas.microsoft.com/office/word/2012/wordml" xmlns:w16cid="http://schemas.microsoft.com/office/word/2016/wordml/cid" xmlns:w16se="http://schemas.microsoft.com/office/word/2015/wordml/symex" mc:Ignorable="w14 w15 w16se w16cid">
   <w:font w:name="Symbol">
     <w:panose1 w:val="05050102010706020507"/>
     <w:charset w:val="02"/>
@@ -9964,7 +11173,7 @@
   </w:font>
   <w:font w:name="Courier New">
     <w:panose1 w:val="02070309020205020404"/>
-    <w:charset w:val="00"/>
+    <w:charset w:val="EE"/>
     <w:family w:val="modern"/>
     <w:pitch w:val="fixed"/>
     <w:sig w:usb0="E0002EFF" w:usb1="C0007843" w:usb2="00000009" w:usb3="00000000" w:csb0="000001FF" w:csb1="00000000"/>
@@ -9978,14 +11187,14 @@
   </w:font>
   <w:font w:name="Calibri">
     <w:panose1 w:val="020F0502020204030204"/>
-    <w:charset w:val="00"/>
+    <w:charset w:val="EE"/>
     <w:family w:val="swiss"/>
     <w:pitch w:val="variable"/>
     <w:sig w:usb0="E4002EFF" w:usb1="C200247B" w:usb2="00000009" w:usb3="00000000" w:csb0="000001FF" w:csb1="00000000"/>
   </w:font>
   <w:font w:name="Calibri Light">
     <w:panose1 w:val="020F0302020204030204"/>
-    <w:charset w:val="00"/>
+    <w:charset w:val="EE"/>
     <w:family w:val="swiss"/>
     <w:pitch w:val="variable"/>
     <w:sig w:usb0="E4002EFF" w:usb1="C200247B" w:usb2="00000009" w:usb3="00000000" w:csb0="000001FF" w:csb1="00000000"/>
@@ -10001,7 +11210,7 @@
 </file>
 
 <file path=word/glossary/settings.xml><?xml version="1.0" encoding="utf-8"?>
-<w:settings xmlns:mc="http://schemas.openxmlformats.org/markup-compatibility/2006" xmlns:o="urn:schemas-microsoft-com:office:office" xmlns:r="http://schemas.openxmlformats.org/officeDocument/2006/relationships" xmlns:m="http://schemas.openxmlformats.org/officeDocument/2006/math" xmlns:v="urn:schemas-microsoft-com:vml" xmlns:w10="urn:schemas-microsoft-com:office:word" xmlns:w="http://schemas.openxmlformats.org/wordprocessingml/2006/main" xmlns:w14="http://schemas.microsoft.com/office/word/2010/wordml" xmlns:w15="http://schemas.microsoft.com/office/word/2012/wordml" xmlns:w16cex="http://schemas.microsoft.com/office/word/2018/wordml/cex" xmlns:w16cid="http://schemas.microsoft.com/office/word/2016/wordml/cid" xmlns:w16="http://schemas.microsoft.com/office/word/2018/wordml" xmlns:w16sdtdh="http://schemas.microsoft.com/office/word/2020/wordml/sdtdatahash" xmlns:w16se="http://schemas.microsoft.com/office/word/2015/wordml/symex" xmlns:sl="http://schemas.openxmlformats.org/schemaLibrary/2006/main" mc:Ignorable="w14 w15 w16se w16cid w16 w16cex w16sdtdh">
+<w:settings xmlns:mc="http://schemas.openxmlformats.org/markup-compatibility/2006" xmlns:o="urn:schemas-microsoft-com:office:office" xmlns:r="http://schemas.openxmlformats.org/officeDocument/2006/relationships" xmlns:m="http://schemas.openxmlformats.org/officeDocument/2006/math" xmlns:v="urn:schemas-microsoft-com:vml" xmlns:w10="urn:schemas-microsoft-com:office:word" xmlns:w="http://schemas.openxmlformats.org/wordprocessingml/2006/main" xmlns:w14="http://schemas.microsoft.com/office/word/2010/wordml" xmlns:w15="http://schemas.microsoft.com/office/word/2012/wordml" xmlns:w16cid="http://schemas.microsoft.com/office/word/2016/wordml/cid" xmlns:w16se="http://schemas.microsoft.com/office/word/2015/wordml/symex" xmlns:sl="http://schemas.openxmlformats.org/schemaLibrary/2006/main" mc:Ignorable="w14 w15 w16se w16cid">
   <w:view w:val="normal"/>
   <w:defaultTabStop w:val="708"/>
   <w:hyphenationZone w:val="425"/>
@@ -10037,7 +11246,9 @@
     <w:rsid w:val="00B66DEA"/>
     <w:rsid w:val="00BB1830"/>
     <w:rsid w:val="00CC2121"/>
+    <w:rsid w:val="00D229FD"/>
     <w:rsid w:val="00D609F3"/>
+    <w:rsid w:val="00F01533"/>
     <w:rsid w:val="00F23542"/>
   </w:rsids>
   <m:mathPr>
@@ -10062,7 +11273,7 @@
 </file>
 
 <file path=word/glossary/styles.xml><?xml version="1.0" encoding="utf-8"?>
-<w:styles xmlns:mc="http://schemas.openxmlformats.org/markup-compatibility/2006" xmlns:r="http://schemas.openxmlformats.org/officeDocument/2006/relationships" xmlns:w="http://schemas.openxmlformats.org/wordprocessingml/2006/main" xmlns:w14="http://schemas.microsoft.com/office/word/2010/wordml" xmlns:w15="http://schemas.microsoft.com/office/word/2012/wordml" xmlns:w16cex="http://schemas.microsoft.com/office/word/2018/wordml/cex" xmlns:w16cid="http://schemas.microsoft.com/office/word/2016/wordml/cid" xmlns:w16="http://schemas.microsoft.com/office/word/2018/wordml" xmlns:w16sdtdh="http://schemas.microsoft.com/office/word/2020/wordml/sdtdatahash" xmlns:w16se="http://schemas.microsoft.com/office/word/2015/wordml/symex" mc:Ignorable="w14 w15 w16se w16cid w16 w16cex w16sdtdh">
+<w:styles xmlns:mc="http://schemas.openxmlformats.org/markup-compatibility/2006" xmlns:r="http://schemas.openxmlformats.org/officeDocument/2006/relationships" xmlns:w="http://schemas.openxmlformats.org/wordprocessingml/2006/main" xmlns:w14="http://schemas.microsoft.com/office/word/2010/wordml" xmlns:w15="http://schemas.microsoft.com/office/word/2012/wordml" xmlns:w16cid="http://schemas.microsoft.com/office/word/2016/wordml/cid" xmlns:w16se="http://schemas.microsoft.com/office/word/2015/wordml/symex" mc:Ignorable="w14 w15 w16se w16cid">
   <w:docDefaults>
     <w:rPrDefault>
       <w:rPr>
@@ -10078,7 +11289,7 @@
       </w:pPr>
     </w:pPrDefault>
   </w:docDefaults>
-  <w:latentStyles w:defLockedState="0" w:defUIPriority="99" w:defSemiHidden="0" w:defUnhideWhenUsed="0" w:defQFormat="0" w:count="376">
+  <w:latentStyles w:defLockedState="0" w:defUIPriority="99" w:defSemiHidden="0" w:defUnhideWhenUsed="0" w:defQFormat="0" w:count="375">
     <w:lsdException w:name="Normal" w:uiPriority="0" w:qFormat="1"/>
     <w:lsdException w:name="heading 1" w:uiPriority="9" w:qFormat="1"/>
     <w:lsdException w:name="heading 2" w:semiHidden="1" w:uiPriority="9" w:unhideWhenUsed="1" w:qFormat="1"/>
@@ -10454,19 +11665,18 @@
     <w:lsdException w:name="Smart Hyperlink" w:semiHidden="1" w:unhideWhenUsed="1"/>
     <w:lsdException w:name="Hashtag" w:semiHidden="1" w:unhideWhenUsed="1"/>
     <w:lsdException w:name="Unresolved Mention" w:semiHidden="1" w:unhideWhenUsed="1"/>
-    <w:lsdException w:name="Smart Link" w:semiHidden="1" w:unhideWhenUsed="1"/>
   </w:latentStyles>
-  <w:style w:type="paragraph" w:default="1" w:styleId="Normal">
+  <w:style w:type="paragraph" w:default="1" w:styleId="Norml">
     <w:name w:val="Normal"/>
     <w:qFormat/>
   </w:style>
-  <w:style w:type="character" w:default="1" w:styleId="DefaultParagraphFont">
+  <w:style w:type="character" w:default="1" w:styleId="Bekezdsalapbettpusa">
     <w:name w:val="Default Paragraph Font"/>
     <w:uiPriority w:val="1"/>
     <w:semiHidden/>
     <w:unhideWhenUsed/>
   </w:style>
-  <w:style w:type="table" w:default="1" w:styleId="TableNormal">
+  <w:style w:type="table" w:default="1" w:styleId="Normltblzat">
     <w:name w:val="Normal Table"/>
     <w:uiPriority w:val="99"/>
     <w:semiHidden/>
@@ -10481,7 +11691,7 @@
       </w:tblCellMar>
     </w:tblPr>
   </w:style>
-  <w:style w:type="numbering" w:default="1" w:styleId="NoList">
+  <w:style w:type="numbering" w:default="1" w:styleId="Nemlista">
     <w:name w:val="No List"/>
     <w:uiPriority w:val="99"/>
     <w:semiHidden/>
@@ -10495,7 +11705,7 @@
 </file>
 
 <file path=word/glossary/webSettings.xml><?xml version="1.0" encoding="utf-8"?>
-<w:webSettings xmlns:mc="http://schemas.openxmlformats.org/markup-compatibility/2006" xmlns:r="http://schemas.openxmlformats.org/officeDocument/2006/relationships" xmlns:w="http://schemas.openxmlformats.org/wordprocessingml/2006/main" xmlns:w14="http://schemas.microsoft.com/office/word/2010/wordml" xmlns:w15="http://schemas.microsoft.com/office/word/2012/wordml" xmlns:w16cex="http://schemas.microsoft.com/office/word/2018/wordml/cex" xmlns:w16cid="http://schemas.microsoft.com/office/word/2016/wordml/cid" xmlns:w16="http://schemas.microsoft.com/office/word/2018/wordml" xmlns:w16sdtdh="http://schemas.microsoft.com/office/word/2020/wordml/sdtdatahash" xmlns:w16se="http://schemas.microsoft.com/office/word/2015/wordml/symex" mc:Ignorable="w14 w15 w16se w16cid w16 w16cex w16sdtdh">
+<w:webSettings xmlns:mc="http://schemas.openxmlformats.org/markup-compatibility/2006" xmlns:r="http://schemas.openxmlformats.org/officeDocument/2006/relationships" xmlns:w="http://schemas.openxmlformats.org/wordprocessingml/2006/main" xmlns:w14="http://schemas.microsoft.com/office/word/2010/wordml" xmlns:w15="http://schemas.microsoft.com/office/word/2012/wordml" xmlns:w16cid="http://schemas.microsoft.com/office/word/2016/wordml/cid" xmlns:w16se="http://schemas.microsoft.com/office/word/2015/wordml/symex" mc:Ignorable="w14 w15 w16se w16cid">
   <w:optimizeForBrowser/>
   <w:allowPNG/>
 </w:webSettings>
@@ -10801,7 +12011,7 @@
 </file>
 
 <file path=customXml/itemProps1.xml><?xml version="1.0" encoding="utf-8"?>
-<ds:datastoreItem xmlns:ds="http://schemas.openxmlformats.org/officeDocument/2006/customXml" ds:itemID="{3F3FB911-6E3C-4A92-B87D-27359A730D53}">
+<ds:datastoreItem xmlns:ds="http://schemas.openxmlformats.org/officeDocument/2006/customXml" ds:itemID="{A6B15545-47F6-4497-99F6-85E2F35AB1F9}">
   <ds:schemaRefs>
     <ds:schemaRef ds:uri="http://schemas.openxmlformats.org/officeDocument/2006/bibliography"/>
   </ds:schemaRefs>

</xml_diff>

<commit_message>
Kiegészítettem a dokumentáció 2.7 pontjában a táblázatot.
</commit_message>
<xml_diff>
--- a/FeladatRadar_Reszletes_Funkcio_Leiras.docx
+++ b/FeladatRadar_Reszletes_Funkcio_Leiras.docx
@@ -3116,7 +3116,7 @@
               <w:bottom w:val="single" w:sz="4" w:space="0" w:color="auto"/>
               <w:right w:val="single" w:sz="4" w:space="0" w:color="auto"/>
             </w:tcBorders>
-            <w:shd w:val="clear" w:color="auto" w:fill="2563EB"/>
+            <w:shd w:val="clear" w:color="auto" w:fill="0070C0"/>
             <w:tcMar>
               <w:top w:w="80" w:type="dxa"/>
               <w:left w:w="120" w:type="dxa"/>
@@ -3150,7 +3150,7 @@
               <w:bottom w:val="single" w:sz="4" w:space="0" w:color="auto"/>
               <w:right w:val="single" w:sz="4" w:space="0" w:color="auto"/>
             </w:tcBorders>
-            <w:shd w:val="clear" w:color="auto" w:fill="2563EB"/>
+            <w:shd w:val="clear" w:color="auto" w:fill="0070C0"/>
             <w:tcMar>
               <w:top w:w="80" w:type="dxa"/>
               <w:left w:w="120" w:type="dxa"/>
@@ -3184,7 +3184,7 @@
               <w:bottom w:val="single" w:sz="4" w:space="0" w:color="auto"/>
               <w:right w:val="single" w:sz="4" w:space="0" w:color="auto"/>
             </w:tcBorders>
-            <w:shd w:val="clear" w:color="auto" w:fill="2563EB"/>
+            <w:shd w:val="clear" w:color="auto" w:fill="0070C0"/>
             <w:tcMar>
               <w:top w:w="80" w:type="dxa"/>
               <w:left w:w="120" w:type="dxa"/>
@@ -4028,7 +4028,7 @@
         <w:tc>
           <w:tcPr>
             <w:tcW w:w="3009" w:type="dxa"/>
-            <w:shd w:val="clear" w:color="auto" w:fill="2563EB"/>
+            <w:shd w:val="clear" w:color="auto" w:fill="0070C0"/>
           </w:tcPr>
           <w:p>
             <w:r>
@@ -4045,7 +4045,7 @@
         <w:tc>
           <w:tcPr>
             <w:tcW w:w="3009" w:type="dxa"/>
-            <w:shd w:val="clear" w:color="auto" w:fill="2563EB"/>
+            <w:shd w:val="clear" w:color="auto" w:fill="0070C0"/>
           </w:tcPr>
           <w:p>
             <w:r>
@@ -4062,7 +4062,7 @@
         <w:tc>
           <w:tcPr>
             <w:tcW w:w="3008" w:type="dxa"/>
-            <w:shd w:val="clear" w:color="auto" w:fill="2563EB"/>
+            <w:shd w:val="clear" w:color="auto" w:fill="0070C0"/>
           </w:tcPr>
           <w:p>
             <w:r>
@@ -4392,7 +4392,7 @@
         <w:tc>
           <w:tcPr>
             <w:tcW w:w="3009" w:type="dxa"/>
-            <w:shd w:val="clear" w:color="auto" w:fill="2563EB"/>
+            <w:shd w:val="clear" w:color="auto" w:fill="0070C0"/>
           </w:tcPr>
           <w:p>
             <w:pPr>
@@ -4412,7 +4412,7 @@
         <w:tc>
           <w:tcPr>
             <w:tcW w:w="3009" w:type="dxa"/>
-            <w:shd w:val="clear" w:color="auto" w:fill="2563EB"/>
+            <w:shd w:val="clear" w:color="auto" w:fill="0070C0"/>
           </w:tcPr>
           <w:p>
             <w:pPr>
@@ -4432,7 +4432,7 @@
         <w:tc>
           <w:tcPr>
             <w:tcW w:w="3008" w:type="dxa"/>
-            <w:shd w:val="clear" w:color="auto" w:fill="2563EB"/>
+            <w:shd w:val="clear" w:color="auto" w:fill="0070C0"/>
           </w:tcPr>
           <w:p>
             <w:pPr>
@@ -4949,7 +4949,7 @@
               <w:bottom w:val="single" w:sz="4" w:space="0" w:color="auto"/>
               <w:right w:val="single" w:sz="4" w:space="0" w:color="auto"/>
             </w:tcBorders>
-            <w:shd w:val="clear" w:color="auto" w:fill="2563EB"/>
+            <w:shd w:val="clear" w:color="auto" w:fill="0070C0"/>
             <w:hideMark/>
           </w:tcPr>
           <w:p>
@@ -4976,7 +4976,7 @@
               <w:bottom w:val="single" w:sz="4" w:space="0" w:color="auto"/>
               <w:right w:val="single" w:sz="4" w:space="0" w:color="auto"/>
             </w:tcBorders>
-            <w:shd w:val="clear" w:color="auto" w:fill="2563EB"/>
+            <w:shd w:val="clear" w:color="auto" w:fill="0070C0"/>
             <w:hideMark/>
           </w:tcPr>
           <w:p>
@@ -5003,7 +5003,7 @@
               <w:bottom w:val="single" w:sz="4" w:space="0" w:color="auto"/>
               <w:right w:val="single" w:sz="4" w:space="0" w:color="auto"/>
             </w:tcBorders>
-            <w:shd w:val="clear" w:color="auto" w:fill="2563EB"/>
+            <w:shd w:val="clear" w:color="auto" w:fill="0070C0"/>
             <w:hideMark/>
           </w:tcPr>
           <w:p>
@@ -6303,17 +6303,7 @@
           <w:sz w:val="24"/>
           <w:szCs w:val="24"/>
         </w:rPr>
-        <w:t>) alapú hi</w:t>
-      </w:r>
-      <w:bookmarkStart w:id="31" w:name="_GoBack"/>
-      <w:bookmarkEnd w:id="31"/>
-      <w:r>
-        <w:rPr>
-          <w:rFonts w:cstheme="minorHAnsi"/>
-          <w:sz w:val="24"/>
-          <w:szCs w:val="24"/>
-        </w:rPr>
-        <w:t xml:space="preserve">telesítést alkalmaz. A </w:t>
+        <w:t xml:space="preserve">) alapú hitelesítést alkalmaz. A </w:t>
       </w:r>
       <w:proofErr w:type="spellStart"/>
       <w:r>
@@ -6396,7 +6386,7 @@
         <w:tc>
           <w:tcPr>
             <w:tcW w:w="3008" w:type="dxa"/>
-            <w:shd w:val="clear" w:color="auto" w:fill="2563EB"/>
+            <w:shd w:val="clear" w:color="auto" w:fill="0070C0"/>
             <w:tcMar>
               <w:top w:w="80" w:type="dxa"/>
               <w:left w:w="120" w:type="dxa"/>
@@ -6437,8 +6427,8 @@
         </w:tc>
         <w:tc>
           <w:tcPr>
-            <w:tcW w:w="3008" w:type="dxa"/>
-            <w:shd w:val="clear" w:color="auto" w:fill="2563EB"/>
+            <w:tcW w:w="3009" w:type="dxa"/>
+            <w:shd w:val="clear" w:color="auto" w:fill="0070C0"/>
             <w:tcMar>
               <w:top w:w="80" w:type="dxa"/>
               <w:left w:w="120" w:type="dxa"/>
@@ -6514,8 +6504,8 @@
         </w:tc>
         <w:tc>
           <w:tcPr>
-            <w:tcW w:w="3008" w:type="dxa"/>
-            <w:shd w:val="clear" w:color="auto" w:fill="2563EB"/>
+            <w:tcW w:w="3009" w:type="dxa"/>
+            <w:shd w:val="clear" w:color="auto" w:fill="0070C0"/>
             <w:tcMar>
               <w:top w:w="80" w:type="dxa"/>
               <w:left w:w="120" w:type="dxa"/>
@@ -6653,7 +6643,7 @@
         </w:tc>
         <w:tc>
           <w:tcPr>
-            <w:tcW w:w="3008" w:type="dxa"/>
+            <w:tcW w:w="3009" w:type="dxa"/>
             <w:shd w:val="clear" w:color="auto" w:fill="auto"/>
             <w:tcMar>
               <w:top w:w="60" w:type="dxa"/>
@@ -6681,7 +6671,7 @@
         </w:tc>
         <w:tc>
           <w:tcPr>
-            <w:tcW w:w="3008" w:type="dxa"/>
+            <w:tcW w:w="3009" w:type="dxa"/>
             <w:shd w:val="clear" w:color="auto" w:fill="auto"/>
             <w:tcMar>
               <w:top w:w="60" w:type="dxa"/>
@@ -6787,7 +6777,7 @@
         </w:tc>
         <w:tc>
           <w:tcPr>
-            <w:tcW w:w="3008" w:type="dxa"/>
+            <w:tcW w:w="3009" w:type="dxa"/>
             <w:shd w:val="clear" w:color="auto" w:fill="auto"/>
             <w:tcMar>
               <w:top w:w="60" w:type="dxa"/>
@@ -6829,6 +6819,36 @@
             </w:r>
           </w:p>
         </w:tc>
+        <w:tc>
+          <w:tcPr>
+            <w:tcW w:w="3009" w:type="dxa"/>
+            <w:shd w:val="clear" w:color="auto" w:fill="auto"/>
+            <w:tcMar>
+              <w:top w:w="60" w:type="dxa"/>
+              <w:left w:w="120" w:type="dxa"/>
+              <w:bottom w:w="60" w:type="dxa"/>
+              <w:right w:w="120" w:type="dxa"/>
+            </w:tcMar>
+          </w:tcPr>
+          <w:p>
+            <w:pPr>
+              <w:jc w:val="both"/>
+              <w:rPr>
+                <w:rFonts w:cstheme="minorHAnsi"/>
+              </w:rPr>
+            </w:pPr>
+            <w:r>
+              <w:rPr>
+                <w:rFonts w:cstheme="minorHAnsi"/>
+                <w:sz w:val="20"/>
+                <w:szCs w:val="20"/>
+              </w:rPr>
+              <w:t>igen (hivatalos)</w:t>
+            </w:r>
+          </w:p>
+        </w:tc>
+      </w:tr>
+      <w:tr>
         <w:tc>
           <w:tcPr>
             <w:tcW w:w="3008" w:type="dxa"/>
@@ -6853,7 +6873,533 @@
                 <w:sz w:val="20"/>
                 <w:szCs w:val="20"/>
               </w:rPr>
-              <w:t>igen (hivatalos)</w:t>
+              <w:t>Ó</w:t>
+            </w:r>
+            <w:r>
+              <w:rPr>
+                <w:rFonts w:cstheme="minorHAnsi"/>
+                <w:sz w:val="20"/>
+                <w:szCs w:val="20"/>
+              </w:rPr>
+              <w:t>rarend szerkeszt</w:t>
+            </w:r>
+            <w:r>
+              <w:rPr>
+                <w:rFonts w:cstheme="minorHAnsi"/>
+                <w:sz w:val="20"/>
+                <w:szCs w:val="20"/>
+              </w:rPr>
+              <w:t>é</w:t>
+            </w:r>
+            <w:r>
+              <w:rPr>
+                <w:rFonts w:cstheme="minorHAnsi"/>
+                <w:sz w:val="20"/>
+                <w:szCs w:val="20"/>
+              </w:rPr>
+              <w:t>se</w:t>
+            </w:r>
+          </w:p>
+        </w:tc>
+        <w:tc>
+          <w:tcPr>
+            <w:tcW w:w="3009" w:type="dxa"/>
+            <w:shd w:val="clear" w:color="auto" w:fill="auto"/>
+            <w:tcMar>
+              <w:top w:w="60" w:type="dxa"/>
+              <w:left w:w="120" w:type="dxa"/>
+              <w:bottom w:w="60" w:type="dxa"/>
+              <w:right w:w="120" w:type="dxa"/>
+            </w:tcMar>
+          </w:tcPr>
+          <w:p>
+            <w:pPr>
+              <w:jc w:val="both"/>
+              <w:rPr>
+                <w:rFonts w:cstheme="minorHAnsi"/>
+              </w:rPr>
+            </w:pPr>
+            <w:r>
+              <w:rPr>
+                <w:rFonts w:cstheme="minorHAnsi"/>
+                <w:sz w:val="20"/>
+                <w:szCs w:val="20"/>
+              </w:rPr>
+              <w:t>nem</w:t>
+            </w:r>
+            <w:bookmarkStart w:id="31" w:name="_GoBack"/>
+            <w:bookmarkEnd w:id="31"/>
+          </w:p>
+        </w:tc>
+        <w:tc>
+          <w:tcPr>
+            <w:tcW w:w="3009" w:type="dxa"/>
+            <w:shd w:val="clear" w:color="auto" w:fill="auto"/>
+            <w:tcMar>
+              <w:top w:w="60" w:type="dxa"/>
+              <w:left w:w="120" w:type="dxa"/>
+              <w:bottom w:w="60" w:type="dxa"/>
+              <w:right w:w="120" w:type="dxa"/>
+            </w:tcMar>
+          </w:tcPr>
+          <w:p>
+            <w:pPr>
+              <w:jc w:val="both"/>
+              <w:rPr>
+                <w:rFonts w:cstheme="minorHAnsi"/>
+              </w:rPr>
+            </w:pPr>
+            <w:r>
+              <w:rPr>
+                <w:rFonts w:cstheme="minorHAnsi"/>
+                <w:sz w:val="20"/>
+                <w:szCs w:val="20"/>
+              </w:rPr>
+              <w:t>igen</w:t>
+            </w:r>
+          </w:p>
+        </w:tc>
+      </w:tr>
+      <w:tr>
+        <w:tc>
+          <w:tcPr>
+            <w:tcW w:w="3008" w:type="dxa"/>
+            <w:shd w:val="clear" w:color="auto" w:fill="auto"/>
+            <w:tcMar>
+              <w:top w:w="60" w:type="dxa"/>
+              <w:left w:w="120" w:type="dxa"/>
+              <w:bottom w:w="60" w:type="dxa"/>
+              <w:right w:w="120" w:type="dxa"/>
+            </w:tcMar>
+          </w:tcPr>
+          <w:p>
+            <w:pPr>
+              <w:jc w:val="both"/>
+              <w:rPr>
+                <w:rFonts w:cstheme="minorHAnsi"/>
+              </w:rPr>
+            </w:pPr>
+            <w:r>
+              <w:rPr>
+                <w:rFonts w:cstheme="minorHAnsi"/>
+                <w:sz w:val="20"/>
+                <w:szCs w:val="20"/>
+              </w:rPr>
+              <w:t>Szavaz</w:t>
+            </w:r>
+            <w:r>
+              <w:rPr>
+                <w:rFonts w:cstheme="minorHAnsi"/>
+                <w:sz w:val="20"/>
+                <w:szCs w:val="20"/>
+              </w:rPr>
+              <w:t>á</w:t>
+            </w:r>
+            <w:r>
+              <w:rPr>
+                <w:rFonts w:cstheme="minorHAnsi"/>
+                <w:sz w:val="20"/>
+                <w:szCs w:val="20"/>
+              </w:rPr>
+              <w:t>s / meger</w:t>
+            </w:r>
+            <w:r>
+              <w:rPr>
+                <w:rFonts w:cstheme="minorHAnsi"/>
+                <w:sz w:val="20"/>
+                <w:szCs w:val="20"/>
+              </w:rPr>
+              <w:t>ő</w:t>
+            </w:r>
+            <w:r>
+              <w:rPr>
+                <w:rFonts w:cstheme="minorHAnsi"/>
+                <w:sz w:val="20"/>
+                <w:szCs w:val="20"/>
+              </w:rPr>
+              <w:t>s</w:t>
+            </w:r>
+            <w:r>
+              <w:rPr>
+                <w:rFonts w:cstheme="minorHAnsi"/>
+                <w:sz w:val="20"/>
+                <w:szCs w:val="20"/>
+              </w:rPr>
+              <w:t>í</w:t>
+            </w:r>
+            <w:r>
+              <w:rPr>
+                <w:rFonts w:cstheme="minorHAnsi"/>
+                <w:sz w:val="20"/>
+                <w:szCs w:val="20"/>
+              </w:rPr>
+              <w:t>t</w:t>
+            </w:r>
+            <w:r>
+              <w:rPr>
+                <w:rFonts w:cstheme="minorHAnsi"/>
+                <w:sz w:val="20"/>
+                <w:szCs w:val="20"/>
+              </w:rPr>
+              <w:t>é</w:t>
+            </w:r>
+            <w:r>
+              <w:rPr>
+                <w:rFonts w:cstheme="minorHAnsi"/>
+                <w:sz w:val="20"/>
+                <w:szCs w:val="20"/>
+              </w:rPr>
+              <w:t>s</w:t>
+            </w:r>
+          </w:p>
+        </w:tc>
+        <w:tc>
+          <w:tcPr>
+            <w:tcW w:w="3009" w:type="dxa"/>
+            <w:shd w:val="clear" w:color="auto" w:fill="auto"/>
+            <w:tcMar>
+              <w:top w:w="60" w:type="dxa"/>
+              <w:left w:w="120" w:type="dxa"/>
+              <w:bottom w:w="60" w:type="dxa"/>
+              <w:right w:w="120" w:type="dxa"/>
+            </w:tcMar>
+          </w:tcPr>
+          <w:p>
+            <w:pPr>
+              <w:jc w:val="both"/>
+              <w:rPr>
+                <w:rFonts w:cstheme="minorHAnsi"/>
+              </w:rPr>
+            </w:pPr>
+            <w:r>
+              <w:rPr>
+                <w:rFonts w:cstheme="minorHAnsi"/>
+                <w:sz w:val="20"/>
+                <w:szCs w:val="20"/>
+              </w:rPr>
+              <w:t>igen</w:t>
+            </w:r>
+          </w:p>
+        </w:tc>
+        <w:tc>
+          <w:tcPr>
+            <w:tcW w:w="3009" w:type="dxa"/>
+            <w:shd w:val="clear" w:color="auto" w:fill="auto"/>
+            <w:tcMar>
+              <w:top w:w="60" w:type="dxa"/>
+              <w:left w:w="120" w:type="dxa"/>
+              <w:bottom w:w="60" w:type="dxa"/>
+              <w:right w:w="120" w:type="dxa"/>
+            </w:tcMar>
+          </w:tcPr>
+          <w:p>
+            <w:pPr>
+              <w:jc w:val="both"/>
+              <w:rPr>
+                <w:rFonts w:cstheme="minorHAnsi"/>
+              </w:rPr>
+            </w:pPr>
+            <w:r>
+              <w:rPr>
+                <w:rFonts w:cstheme="minorHAnsi"/>
+                <w:sz w:val="20"/>
+                <w:szCs w:val="20"/>
+              </w:rPr>
+              <w:t>igen</w:t>
+            </w:r>
+          </w:p>
+        </w:tc>
+      </w:tr>
+      <w:tr>
+        <w:tc>
+          <w:tcPr>
+            <w:tcW w:w="3008" w:type="dxa"/>
+            <w:shd w:val="clear" w:color="auto" w:fill="auto"/>
+            <w:tcMar>
+              <w:top w:w="60" w:type="dxa"/>
+              <w:left w:w="120" w:type="dxa"/>
+              <w:bottom w:w="60" w:type="dxa"/>
+              <w:right w:w="120" w:type="dxa"/>
+            </w:tcMar>
+          </w:tcPr>
+          <w:p>
+            <w:pPr>
+              <w:jc w:val="both"/>
+              <w:rPr>
+                <w:rFonts w:cstheme="minorHAnsi"/>
+              </w:rPr>
+            </w:pPr>
+            <w:r>
+              <w:rPr>
+                <w:rFonts w:cstheme="minorHAnsi"/>
+                <w:sz w:val="20"/>
+                <w:szCs w:val="20"/>
+              </w:rPr>
+              <w:t>Felhaszn</w:t>
+            </w:r>
+            <w:r>
+              <w:rPr>
+                <w:rFonts w:cstheme="minorHAnsi"/>
+                <w:sz w:val="20"/>
+                <w:szCs w:val="20"/>
+              </w:rPr>
+              <w:t>á</w:t>
+            </w:r>
+            <w:r>
+              <w:rPr>
+                <w:rFonts w:cstheme="minorHAnsi"/>
+                <w:sz w:val="20"/>
+                <w:szCs w:val="20"/>
+              </w:rPr>
+              <w:t>l</w:t>
+            </w:r>
+            <w:r>
+              <w:rPr>
+                <w:rFonts w:cstheme="minorHAnsi"/>
+                <w:sz w:val="20"/>
+                <w:szCs w:val="20"/>
+              </w:rPr>
+              <w:t>ó</w:t>
+            </w:r>
+            <w:r>
+              <w:rPr>
+                <w:rFonts w:cstheme="minorHAnsi"/>
+                <w:sz w:val="20"/>
+                <w:szCs w:val="20"/>
+              </w:rPr>
+              <w:t>k kezel</w:t>
+            </w:r>
+            <w:r>
+              <w:rPr>
+                <w:rFonts w:cstheme="minorHAnsi"/>
+                <w:sz w:val="20"/>
+                <w:szCs w:val="20"/>
+              </w:rPr>
+              <w:t>é</w:t>
+            </w:r>
+            <w:r>
+              <w:rPr>
+                <w:rFonts w:cstheme="minorHAnsi"/>
+                <w:sz w:val="20"/>
+                <w:szCs w:val="20"/>
+              </w:rPr>
+              <w:t>se</w:t>
+            </w:r>
+          </w:p>
+        </w:tc>
+        <w:tc>
+          <w:tcPr>
+            <w:tcW w:w="3009" w:type="dxa"/>
+            <w:shd w:val="clear" w:color="auto" w:fill="auto"/>
+            <w:tcMar>
+              <w:top w:w="60" w:type="dxa"/>
+              <w:left w:w="120" w:type="dxa"/>
+              <w:bottom w:w="60" w:type="dxa"/>
+              <w:right w:w="120" w:type="dxa"/>
+            </w:tcMar>
+          </w:tcPr>
+          <w:p>
+            <w:pPr>
+              <w:jc w:val="both"/>
+              <w:rPr>
+                <w:rFonts w:cstheme="minorHAnsi"/>
+              </w:rPr>
+            </w:pPr>
+            <w:r>
+              <w:rPr>
+                <w:rFonts w:cstheme="minorHAnsi"/>
+                <w:sz w:val="20"/>
+                <w:szCs w:val="20"/>
+              </w:rPr>
+              <w:t>nem</w:t>
+            </w:r>
+          </w:p>
+        </w:tc>
+        <w:tc>
+          <w:tcPr>
+            <w:tcW w:w="3009" w:type="dxa"/>
+            <w:shd w:val="clear" w:color="auto" w:fill="auto"/>
+            <w:tcMar>
+              <w:top w:w="60" w:type="dxa"/>
+              <w:left w:w="120" w:type="dxa"/>
+              <w:bottom w:w="60" w:type="dxa"/>
+              <w:right w:w="120" w:type="dxa"/>
+            </w:tcMar>
+          </w:tcPr>
+          <w:p>
+            <w:pPr>
+              <w:jc w:val="both"/>
+              <w:rPr>
+                <w:rFonts w:cstheme="minorHAnsi"/>
+              </w:rPr>
+            </w:pPr>
+            <w:r>
+              <w:rPr>
+                <w:rFonts w:cstheme="minorHAnsi"/>
+                <w:sz w:val="20"/>
+                <w:szCs w:val="20"/>
+              </w:rPr>
+              <w:t xml:space="preserve">nem (csak </w:t>
+            </w:r>
+            <w:proofErr w:type="spellStart"/>
+            <w:r>
+              <w:rPr>
+                <w:rFonts w:cstheme="minorHAnsi"/>
+                <w:sz w:val="20"/>
+                <w:szCs w:val="20"/>
+              </w:rPr>
+              <w:t>admin</w:t>
+            </w:r>
+            <w:proofErr w:type="spellEnd"/>
+            <w:r>
+              <w:rPr>
+                <w:rFonts w:cstheme="minorHAnsi"/>
+                <w:sz w:val="20"/>
+                <w:szCs w:val="20"/>
+              </w:rPr>
+              <w:t>)</w:t>
+            </w:r>
+          </w:p>
+        </w:tc>
+      </w:tr>
+      <w:tr>
+        <w:tc>
+          <w:tcPr>
+            <w:tcW w:w="3008" w:type="dxa"/>
+            <w:shd w:val="clear" w:color="auto" w:fill="auto"/>
+            <w:tcMar>
+              <w:top w:w="60" w:type="dxa"/>
+              <w:left w:w="120" w:type="dxa"/>
+              <w:bottom w:w="60" w:type="dxa"/>
+              <w:right w:w="120" w:type="dxa"/>
+            </w:tcMar>
+          </w:tcPr>
+          <w:p>
+            <w:pPr>
+              <w:jc w:val="both"/>
+              <w:rPr>
+                <w:rFonts w:cstheme="minorHAnsi"/>
+              </w:rPr>
+            </w:pPr>
+            <w:r>
+              <w:rPr>
+                <w:rFonts w:cstheme="minorHAnsi"/>
+                <w:sz w:val="20"/>
+                <w:szCs w:val="20"/>
+              </w:rPr>
+              <w:t>F</w:t>
+            </w:r>
+            <w:r>
+              <w:rPr>
+                <w:rFonts w:cstheme="minorHAnsi"/>
+                <w:sz w:val="20"/>
+                <w:szCs w:val="20"/>
+              </w:rPr>
+              <w:t>ó</w:t>
+            </w:r>
+            <w:r>
+              <w:rPr>
+                <w:rFonts w:cstheme="minorHAnsi"/>
+                <w:sz w:val="20"/>
+                <w:szCs w:val="20"/>
+              </w:rPr>
+              <w:t>kusz id</w:t>
+            </w:r>
+            <w:r>
+              <w:rPr>
+                <w:rFonts w:cstheme="minorHAnsi"/>
+                <w:sz w:val="20"/>
+                <w:szCs w:val="20"/>
+              </w:rPr>
+              <w:t>ő</w:t>
+            </w:r>
+            <w:r>
+              <w:rPr>
+                <w:rFonts w:cstheme="minorHAnsi"/>
+                <w:sz w:val="20"/>
+                <w:szCs w:val="20"/>
+              </w:rPr>
+              <w:t>z</w:t>
+            </w:r>
+            <w:r>
+              <w:rPr>
+                <w:rFonts w:cstheme="minorHAnsi"/>
+                <w:sz w:val="20"/>
+                <w:szCs w:val="20"/>
+              </w:rPr>
+              <w:t>í</w:t>
+            </w:r>
+            <w:r>
+              <w:rPr>
+                <w:rFonts w:cstheme="minorHAnsi"/>
+                <w:sz w:val="20"/>
+                <w:szCs w:val="20"/>
+              </w:rPr>
+              <w:t>t</w:t>
+            </w:r>
+            <w:r>
+              <w:rPr>
+                <w:rFonts w:cstheme="minorHAnsi"/>
+                <w:sz w:val="20"/>
+                <w:szCs w:val="20"/>
+              </w:rPr>
+              <w:t>ő</w:t>
+            </w:r>
+          </w:p>
+        </w:tc>
+        <w:tc>
+          <w:tcPr>
+            <w:tcW w:w="3009" w:type="dxa"/>
+            <w:shd w:val="clear" w:color="auto" w:fill="auto"/>
+            <w:tcMar>
+              <w:top w:w="60" w:type="dxa"/>
+              <w:left w:w="120" w:type="dxa"/>
+              <w:bottom w:w="60" w:type="dxa"/>
+              <w:right w:w="120" w:type="dxa"/>
+            </w:tcMar>
+          </w:tcPr>
+          <w:p>
+            <w:pPr>
+              <w:jc w:val="both"/>
+              <w:rPr>
+                <w:rFonts w:cstheme="minorHAnsi"/>
+              </w:rPr>
+            </w:pPr>
+            <w:r>
+              <w:rPr>
+                <w:rFonts w:cstheme="minorHAnsi"/>
+                <w:sz w:val="20"/>
+                <w:szCs w:val="20"/>
+              </w:rPr>
+              <w:t>igen</w:t>
+            </w:r>
+          </w:p>
+        </w:tc>
+        <w:tc>
+          <w:tcPr>
+            <w:tcW w:w="3009" w:type="dxa"/>
+            <w:shd w:val="clear" w:color="auto" w:fill="auto"/>
+            <w:tcMar>
+              <w:top w:w="60" w:type="dxa"/>
+              <w:left w:w="120" w:type="dxa"/>
+              <w:bottom w:w="60" w:type="dxa"/>
+              <w:right w:w="120" w:type="dxa"/>
+            </w:tcMar>
+          </w:tcPr>
+          <w:p>
+            <w:pPr>
+              <w:jc w:val="both"/>
+              <w:rPr>
+                <w:rFonts w:cstheme="minorHAnsi"/>
+              </w:rPr>
+            </w:pPr>
+            <w:r>
+              <w:rPr>
+                <w:rFonts w:cstheme="minorHAnsi"/>
+                <w:sz w:val="20"/>
+                <w:szCs w:val="20"/>
+              </w:rPr>
+              <w:t>igen</w:t>
             </w:r>
           </w:p>
         </w:tc>
@@ -11241,6 +11787,7 @@
     <w:rsid w:val="007E7CBF"/>
     <w:rsid w:val="008435C4"/>
     <w:rsid w:val="00890334"/>
+    <w:rsid w:val="008F1A94"/>
     <w:rsid w:val="00A46614"/>
     <w:rsid w:val="00B207F3"/>
     <w:rsid w:val="00B66DEA"/>
@@ -12011,7 +12558,7 @@
 </file>
 
 <file path=customXml/itemProps1.xml><?xml version="1.0" encoding="utf-8"?>
-<ds:datastoreItem xmlns:ds="http://schemas.openxmlformats.org/officeDocument/2006/customXml" ds:itemID="{A6B15545-47F6-4497-99F6-85E2F35AB1F9}">
+<ds:datastoreItem xmlns:ds="http://schemas.openxmlformats.org/officeDocument/2006/customXml" ds:itemID="{A575BFFB-A1D6-450A-ADAC-B9AADEA11F7B}">
   <ds:schemaRefs>
     <ds:schemaRef ds:uri="http://schemas.openxmlformats.org/officeDocument/2006/bibliography"/>
   </ds:schemaRefs>

</xml_diff>

<commit_message>
Dokumentáció 2.7.1 Fő konfigurációs értékek.
</commit_message>
<xml_diff>
--- a/FeladatRadar_Reszletes_Funkcio_Leiras.docx
+++ b/FeladatRadar_Reszletes_Funkcio_Leiras.docx
@@ -6927,8 +6927,6 @@
               </w:rPr>
               <w:t>nem</w:t>
             </w:r>
-            <w:bookmarkStart w:id="31" w:name="_GoBack"/>
-            <w:bookmarkEnd w:id="31"/>
           </w:p>
         </w:tc>
         <w:tc>
@@ -7405,6 +7403,200 @@
         </w:tc>
       </w:tr>
     </w:tbl>
+    <w:p>
+      <w:pPr>
+        <w:spacing w:before="100" w:beforeAutospacing="1" w:after="100" w:afterAutospacing="1" w:line="240" w:lineRule="auto"/>
+        <w:jc w:val="both"/>
+        <w:rPr>
+          <w:rFonts w:eastAsia="Times New Roman" w:cstheme="minorHAnsi"/>
+          <w:sz w:val="24"/>
+          <w:szCs w:val="24"/>
+          <w:lang w:eastAsia="hu-HU"/>
+        </w:rPr>
+      </w:pPr>
+      <w:r>
+        <w:rPr>
+          <w:rFonts w:eastAsia="Times New Roman" w:cstheme="minorHAnsi"/>
+          <w:sz w:val="24"/>
+          <w:szCs w:val="24"/>
+          <w:lang w:eastAsia="hu-HU"/>
+        </w:rPr>
+        <w:t xml:space="preserve">Az </w:t>
+      </w:r>
+      <w:proofErr w:type="spellStart"/>
+      <w:r>
+        <w:rPr>
+          <w:rFonts w:eastAsia="Times New Roman" w:cstheme="minorHAnsi"/>
+          <w:sz w:val="24"/>
+          <w:szCs w:val="24"/>
+          <w:lang w:eastAsia="hu-HU"/>
+        </w:rPr>
+        <w:t>admin</w:t>
+      </w:r>
+      <w:proofErr w:type="spellEnd"/>
+      <w:r>
+        <w:rPr>
+          <w:rFonts w:eastAsia="Times New Roman" w:cstheme="minorHAnsi"/>
+          <w:sz w:val="24"/>
+          <w:szCs w:val="24"/>
+          <w:lang w:eastAsia="hu-HU"/>
+        </w:rPr>
+        <w:t xml:space="preserve"> szerepkör manuálisan adható a </w:t>
+      </w:r>
+      <w:proofErr w:type="spellStart"/>
+      <w:r>
+        <w:rPr>
+          <w:rFonts w:eastAsia="Times New Roman" w:cstheme="minorHAnsi"/>
+          <w:sz w:val="24"/>
+          <w:szCs w:val="24"/>
+          <w:lang w:eastAsia="hu-HU"/>
+        </w:rPr>
+        <w:t>Users</w:t>
+      </w:r>
+      <w:proofErr w:type="spellEnd"/>
+      <w:r>
+        <w:rPr>
+          <w:rFonts w:eastAsia="Times New Roman" w:cstheme="minorHAnsi"/>
+          <w:sz w:val="24"/>
+          <w:szCs w:val="24"/>
+          <w:lang w:eastAsia="hu-HU"/>
+        </w:rPr>
+        <w:t xml:space="preserve"> tábla </w:t>
+      </w:r>
+      <w:proofErr w:type="spellStart"/>
+      <w:r>
+        <w:rPr>
+          <w:rFonts w:eastAsia="Times New Roman" w:cstheme="minorHAnsi"/>
+          <w:sz w:val="24"/>
+          <w:szCs w:val="24"/>
+          <w:lang w:eastAsia="hu-HU"/>
+        </w:rPr>
+        <w:t>Role</w:t>
+      </w:r>
+      <w:proofErr w:type="spellEnd"/>
+      <w:r>
+        <w:rPr>
+          <w:rFonts w:eastAsia="Times New Roman" w:cstheme="minorHAnsi"/>
+          <w:sz w:val="24"/>
+          <w:szCs w:val="24"/>
+          <w:lang w:eastAsia="hu-HU"/>
+        </w:rPr>
+        <w:t xml:space="preserve"> mezőjének módosításával. </w:t>
+      </w:r>
+      <w:proofErr w:type="spellStart"/>
+      <w:r>
+        <w:rPr>
+          <w:rFonts w:eastAsia="Times New Roman" w:cstheme="minorHAnsi"/>
+          <w:sz w:val="24"/>
+          <w:szCs w:val="24"/>
+          <w:lang w:eastAsia="hu-HU"/>
+        </w:rPr>
+        <w:t>Bannolt</w:t>
+      </w:r>
+      <w:proofErr w:type="spellEnd"/>
+      <w:r>
+        <w:rPr>
+          <w:rFonts w:eastAsia="Times New Roman" w:cstheme="minorHAnsi"/>
+          <w:sz w:val="24"/>
+          <w:szCs w:val="24"/>
+          <w:lang w:eastAsia="hu-HU"/>
+        </w:rPr>
+        <w:t xml:space="preserve"> fiók esetén (</w:t>
+      </w:r>
+      <w:proofErr w:type="spellStart"/>
+      <w:r>
+        <w:rPr>
+          <w:rFonts w:eastAsia="Times New Roman" w:cstheme="minorHAnsi"/>
+          <w:sz w:val="24"/>
+          <w:szCs w:val="24"/>
+          <w:lang w:eastAsia="hu-HU"/>
+        </w:rPr>
+        <w:t>IsActive</w:t>
+      </w:r>
+      <w:proofErr w:type="spellEnd"/>
+      <w:r>
+        <w:rPr>
+          <w:rFonts w:eastAsia="Times New Roman" w:cstheme="minorHAnsi"/>
+          <w:sz w:val="24"/>
+          <w:szCs w:val="24"/>
+          <w:lang w:eastAsia="hu-HU"/>
+        </w:rPr>
+        <w:t>=0) a bejelentkezési kísérlet során a rendszer hibaüzenetet ad vissza, és a felhasználó nem léphet be.</w:t>
+      </w:r>
+    </w:p>
+    <w:p>
+      <w:pPr>
+        <w:pStyle w:val="Cmsor3"/>
+        <w:jc w:val="both"/>
+        <w:rPr>
+          <w:rFonts w:eastAsia="Times New Roman"/>
+          <w:sz w:val="24"/>
+          <w:szCs w:val="24"/>
+          <w:lang w:eastAsia="hu-HU"/>
+        </w:rPr>
+      </w:pPr>
+      <w:bookmarkStart w:id="31" w:name="_Toc223536934"/>
+      <w:r>
+        <w:rPr>
+          <w:rFonts w:eastAsia="Times New Roman"/>
+          <w:lang w:eastAsia="hu-HU"/>
+        </w:rPr>
+        <w:t>2.7.1</w:t>
+      </w:r>
+      <w:r>
+        <w:rPr>
+          <w:rFonts w:eastAsia="Times New Roman"/>
+          <w:lang w:eastAsia="hu-HU"/>
+        </w:rPr>
+        <w:t xml:space="preserve"> Fő konfigurációs értékek</w:t>
+      </w:r>
+      <w:bookmarkEnd w:id="31"/>
+    </w:p>
+    <w:p>
+      <w:pPr>
+        <w:spacing w:before="100" w:beforeAutospacing="1" w:after="100" w:afterAutospacing="1" w:line="240" w:lineRule="auto"/>
+        <w:jc w:val="both"/>
+        <w:rPr>
+          <w:rFonts w:eastAsia="Times New Roman" w:cstheme="minorHAnsi"/>
+          <w:sz w:val="24"/>
+          <w:szCs w:val="24"/>
+          <w:lang w:eastAsia="hu-HU"/>
+        </w:rPr>
+      </w:pPr>
+      <w:r>
+        <w:rPr>
+          <w:rFonts w:eastAsia="Times New Roman" w:cstheme="minorHAnsi"/>
+          <w:sz w:val="24"/>
+          <w:szCs w:val="24"/>
+          <w:lang w:eastAsia="hu-HU"/>
+        </w:rPr>
+        <w:t xml:space="preserve">Az alkalmazás futásához szükséges konfigurációs értékek az </w:t>
+      </w:r>
+      <w:proofErr w:type="spellStart"/>
+      <w:proofErr w:type="gramStart"/>
+      <w:r>
+        <w:rPr>
+          <w:rFonts w:eastAsia="Times New Roman" w:cstheme="minorHAnsi"/>
+          <w:sz w:val="24"/>
+          <w:szCs w:val="24"/>
+          <w:lang w:eastAsia="hu-HU"/>
+        </w:rPr>
+        <w:t>appsettings.json</w:t>
+      </w:r>
+      <w:proofErr w:type="spellEnd"/>
+      <w:proofErr w:type="gramEnd"/>
+      <w:r>
+        <w:rPr>
+          <w:rFonts w:eastAsia="Times New Roman" w:cstheme="minorHAnsi"/>
+          <w:sz w:val="24"/>
+          <w:szCs w:val="24"/>
+          <w:lang w:eastAsia="hu-HU"/>
+        </w:rPr>
+        <w:t xml:space="preserve"> fájlban találhatók.</w:t>
+      </w:r>
+      <w:bookmarkStart w:id="32" w:name="_GoBack"/>
+      <w:bookmarkEnd w:id="32"/>
+    </w:p>
     <w:p>
       <w:pPr>
         <w:pStyle w:val="NormlWeb"/>
@@ -11792,6 +11984,7 @@
     <w:rsid w:val="00B207F3"/>
     <w:rsid w:val="00B66DEA"/>
     <w:rsid w:val="00BB1830"/>
+    <w:rsid w:val="00C001EB"/>
     <w:rsid w:val="00CC2121"/>
     <w:rsid w:val="00D229FD"/>
     <w:rsid w:val="00D609F3"/>
@@ -12558,7 +12751,7 @@
 </file>
 
 <file path=customXml/itemProps1.xml><?xml version="1.0" encoding="utf-8"?>
-<ds:datastoreItem xmlns:ds="http://schemas.openxmlformats.org/officeDocument/2006/customXml" ds:itemID="{A575BFFB-A1D6-450A-ADAC-B9AADEA11F7B}">
+<ds:datastoreItem xmlns:ds="http://schemas.openxmlformats.org/officeDocument/2006/customXml" ds:itemID="{44EBBA12-EF48-4E76-A4B7-EAAFCDEA2881}">
   <ds:schemaRefs>
     <ds:schemaRef ds:uri="http://schemas.openxmlformats.org/officeDocument/2006/bibliography"/>
   </ds:schemaRefs>

</xml_diff>

<commit_message>
DOkumentáció 2.7.1, Fő konfigurációs értékek kiegészítése.
</commit_message>
<xml_diff>
--- a/FeladatRadar_Reszletes_Funkcio_Leiras.docx
+++ b/FeladatRadar_Reszletes_Funkcio_Leiras.docx
@@ -10,7 +10,7 @@
           <w:rFonts w:cstheme="minorHAnsi"/>
         </w:rPr>
       </w:pPr>
-      <w:bookmarkStart w:id="0" w:name="_Toc223984708"/>
+      <w:bookmarkStart w:id="0" w:name="_Toc224136675"/>
       <w:r>
         <w:rPr>
           <w:rFonts w:cstheme="minorHAnsi"/>
@@ -86,7 +86,7 @@
             </w:rPr>
             <w:fldChar w:fldCharType="separate"/>
           </w:r>
-          <w:hyperlink w:anchor="_Toc223984708" w:history="1">
+          <w:hyperlink w:anchor="_Toc224136675" w:history="1">
             <w:r>
               <w:rPr>
                 <w:rStyle w:val="Hiperhivatkozs"/>
@@ -114,7 +114,7 @@
                 <w:noProof/>
                 <w:webHidden/>
               </w:rPr>
-              <w:instrText xml:space="preserve"> PAGEREF _Toc223984708 \h </w:instrText>
+              <w:instrText xml:space="preserve"> PAGEREF _Toc224136675 \h </w:instrText>
             </w:r>
             <w:r>
               <w:rPr>
@@ -157,7 +157,7 @@
               <w:lang w:eastAsia="hu-HU"/>
             </w:rPr>
           </w:pPr>
-          <w:hyperlink w:anchor="_Toc223984709" w:history="1">
+          <w:hyperlink w:anchor="_Toc224136676" w:history="1">
             <w:r>
               <w:rPr>
                 <w:rStyle w:val="Hiperhivatkozs"/>
@@ -185,7 +185,7 @@
                 <w:noProof/>
                 <w:webHidden/>
               </w:rPr>
-              <w:instrText xml:space="preserve"> PAGEREF _Toc223984709 \h </w:instrText>
+              <w:instrText xml:space="preserve"> PAGEREF _Toc224136676 \h </w:instrText>
             </w:r>
             <w:r>
               <w:rPr>
@@ -228,7 +228,7 @@
               <w:lang w:eastAsia="hu-HU"/>
             </w:rPr>
           </w:pPr>
-          <w:hyperlink w:anchor="_Toc223984710" w:history="1">
+          <w:hyperlink w:anchor="_Toc224136677" w:history="1">
             <w:r>
               <w:rPr>
                 <w:rStyle w:val="Hiperhivatkozs"/>
@@ -255,7 +255,7 @@
                 <w:noProof/>
                 <w:webHidden/>
               </w:rPr>
-              <w:instrText xml:space="preserve"> PAGEREF _Toc223984710 \h </w:instrText>
+              <w:instrText xml:space="preserve"> PAGEREF _Toc224136677 \h </w:instrText>
             </w:r>
             <w:r>
               <w:rPr>
@@ -298,7 +298,7 @@
               <w:lang w:eastAsia="hu-HU"/>
             </w:rPr>
           </w:pPr>
-          <w:hyperlink w:anchor="_Toc223984711" w:history="1">
+          <w:hyperlink w:anchor="_Toc224136678" w:history="1">
             <w:r>
               <w:rPr>
                 <w:rStyle w:val="Hiperhivatkozs"/>
@@ -325,7 +325,7 @@
                 <w:noProof/>
                 <w:webHidden/>
               </w:rPr>
-              <w:instrText xml:space="preserve"> PAGEREF _Toc223984711 \h </w:instrText>
+              <w:instrText xml:space="preserve"> PAGEREF _Toc224136678 \h </w:instrText>
             </w:r>
             <w:r>
               <w:rPr>
@@ -368,7 +368,7 @@
               <w:lang w:eastAsia="hu-HU"/>
             </w:rPr>
           </w:pPr>
-          <w:hyperlink w:anchor="_Toc223984712" w:history="1">
+          <w:hyperlink w:anchor="_Toc224136679" w:history="1">
             <w:r>
               <w:rPr>
                 <w:rStyle w:val="Hiperhivatkozs"/>
@@ -395,7 +395,7 @@
                 <w:noProof/>
                 <w:webHidden/>
               </w:rPr>
-              <w:instrText xml:space="preserve"> PAGEREF _Toc223984712 \h </w:instrText>
+              <w:instrText xml:space="preserve"> PAGEREF _Toc224136679 \h </w:instrText>
             </w:r>
             <w:r>
               <w:rPr>
@@ -438,7 +438,7 @@
               <w:lang w:eastAsia="hu-HU"/>
             </w:rPr>
           </w:pPr>
-          <w:hyperlink w:anchor="_Toc223984713" w:history="1">
+          <w:hyperlink w:anchor="_Toc224136680" w:history="1">
             <w:r>
               <w:rPr>
                 <w:rStyle w:val="Hiperhivatkozs"/>
@@ -465,7 +465,7 @@
                 <w:noProof/>
                 <w:webHidden/>
               </w:rPr>
-              <w:instrText xml:space="preserve"> PAGEREF _Toc223984713 \h </w:instrText>
+              <w:instrText xml:space="preserve"> PAGEREF _Toc224136680 \h </w:instrText>
             </w:r>
             <w:r>
               <w:rPr>
@@ -508,7 +508,7 @@
               <w:lang w:eastAsia="hu-HU"/>
             </w:rPr>
           </w:pPr>
-          <w:hyperlink w:anchor="_Toc223984714" w:history="1">
+          <w:hyperlink w:anchor="_Toc224136681" w:history="1">
             <w:r>
               <w:rPr>
                 <w:rStyle w:val="Hiperhivatkozs"/>
@@ -535,7 +535,7 @@
                 <w:noProof/>
                 <w:webHidden/>
               </w:rPr>
-              <w:instrText xml:space="preserve"> PAGEREF _Toc223984714 \h </w:instrText>
+              <w:instrText xml:space="preserve"> PAGEREF _Toc224136681 \h </w:instrText>
             </w:r>
             <w:r>
               <w:rPr>
@@ -578,7 +578,7 @@
               <w:lang w:eastAsia="hu-HU"/>
             </w:rPr>
           </w:pPr>
-          <w:hyperlink w:anchor="_Toc223984715" w:history="1">
+          <w:hyperlink w:anchor="_Toc224136682" w:history="1">
             <w:r>
               <w:rPr>
                 <w:rStyle w:val="Hiperhivatkozs"/>
@@ -605,7 +605,7 @@
                 <w:noProof/>
                 <w:webHidden/>
               </w:rPr>
-              <w:instrText xml:space="preserve"> PAGEREF _Toc223984715 \h </w:instrText>
+              <w:instrText xml:space="preserve"> PAGEREF _Toc224136682 \h </w:instrText>
             </w:r>
             <w:r>
               <w:rPr>
@@ -648,7 +648,7 @@
               <w:lang w:eastAsia="hu-HU"/>
             </w:rPr>
           </w:pPr>
-          <w:hyperlink w:anchor="_Toc223984716" w:history="1">
+          <w:hyperlink w:anchor="_Toc224136683" w:history="1">
             <w:r>
               <w:rPr>
                 <w:rStyle w:val="Hiperhivatkozs"/>
@@ -675,7 +675,7 @@
                 <w:noProof/>
                 <w:webHidden/>
               </w:rPr>
-              <w:instrText xml:space="preserve"> PAGEREF _Toc223984716 \h </w:instrText>
+              <w:instrText xml:space="preserve"> PAGEREF _Toc224136683 \h </w:instrText>
             </w:r>
             <w:r>
               <w:rPr>
@@ -718,7 +718,7 @@
               <w:lang w:eastAsia="hu-HU"/>
             </w:rPr>
           </w:pPr>
-          <w:hyperlink w:anchor="_Toc223984717" w:history="1">
+          <w:hyperlink w:anchor="_Toc224136684" w:history="1">
             <w:r>
               <w:rPr>
                 <w:rStyle w:val="Hiperhivatkozs"/>
@@ -745,7 +745,7 @@
                 <w:noProof/>
                 <w:webHidden/>
               </w:rPr>
-              <w:instrText xml:space="preserve"> PAGEREF _Toc223984717 \h </w:instrText>
+              <w:instrText xml:space="preserve"> PAGEREF _Toc224136684 \h </w:instrText>
             </w:r>
             <w:r>
               <w:rPr>
@@ -788,7 +788,7 @@
               <w:lang w:eastAsia="hu-HU"/>
             </w:rPr>
           </w:pPr>
-          <w:hyperlink w:anchor="_Toc223984718" w:history="1">
+          <w:hyperlink w:anchor="_Toc224136685" w:history="1">
             <w:r>
               <w:rPr>
                 <w:rStyle w:val="Hiperhivatkozs"/>
@@ -815,7 +815,7 @@
                 <w:noProof/>
                 <w:webHidden/>
               </w:rPr>
-              <w:instrText xml:space="preserve"> PAGEREF _Toc223984718 \h </w:instrText>
+              <w:instrText xml:space="preserve"> PAGEREF _Toc224136685 \h </w:instrText>
             </w:r>
             <w:r>
               <w:rPr>
@@ -858,7 +858,7 @@
               <w:lang w:eastAsia="hu-HU"/>
             </w:rPr>
           </w:pPr>
-          <w:hyperlink w:anchor="_Toc223984719" w:history="1">
+          <w:hyperlink w:anchor="_Toc224136686" w:history="1">
             <w:r>
               <w:rPr>
                 <w:rStyle w:val="Hiperhivatkozs"/>
@@ -887,7 +887,7 @@
                 <w:noProof/>
                 <w:webHidden/>
               </w:rPr>
-              <w:instrText xml:space="preserve"> PAGEREF _Toc223984719 \h </w:instrText>
+              <w:instrText xml:space="preserve"> PAGEREF _Toc224136686 \h </w:instrText>
             </w:r>
             <w:r>
               <w:rPr>
@@ -930,7 +930,7 @@
               <w:lang w:eastAsia="hu-HU"/>
             </w:rPr>
           </w:pPr>
-          <w:hyperlink w:anchor="_Toc223984720" w:history="1">
+          <w:hyperlink w:anchor="_Toc224136687" w:history="1">
             <w:r>
               <w:rPr>
                 <w:rStyle w:val="Hiperhivatkozs"/>
@@ -957,7 +957,7 @@
                 <w:noProof/>
                 <w:webHidden/>
               </w:rPr>
-              <w:instrText xml:space="preserve"> PAGEREF _Toc223984720 \h </w:instrText>
+              <w:instrText xml:space="preserve"> PAGEREF _Toc224136687 \h </w:instrText>
             </w:r>
             <w:r>
               <w:rPr>
@@ -1000,7 +1000,7 @@
               <w:lang w:eastAsia="hu-HU"/>
             </w:rPr>
           </w:pPr>
-          <w:hyperlink w:anchor="_Toc223984721" w:history="1">
+          <w:hyperlink w:anchor="_Toc224136688" w:history="1">
             <w:r>
               <w:rPr>
                 <w:rStyle w:val="Hiperhivatkozs"/>
@@ -1027,7 +1027,7 @@
                 <w:noProof/>
                 <w:webHidden/>
               </w:rPr>
-              <w:instrText xml:space="preserve"> PAGEREF _Toc223984721 \h </w:instrText>
+              <w:instrText xml:space="preserve"> PAGEREF _Toc224136688 \h </w:instrText>
             </w:r>
             <w:r>
               <w:rPr>
@@ -1070,7 +1070,7 @@
               <w:lang w:eastAsia="hu-HU"/>
             </w:rPr>
           </w:pPr>
-          <w:hyperlink w:anchor="_Toc223984722" w:history="1">
+          <w:hyperlink w:anchor="_Toc224136689" w:history="1">
             <w:r>
               <w:rPr>
                 <w:rStyle w:val="Hiperhivatkozs"/>
@@ -1097,7 +1097,7 @@
                 <w:noProof/>
                 <w:webHidden/>
               </w:rPr>
-              <w:instrText xml:space="preserve"> PAGEREF _Toc223984722 \h </w:instrText>
+              <w:instrText xml:space="preserve"> PAGEREF _Toc224136689 \h </w:instrText>
             </w:r>
             <w:r>
               <w:rPr>
@@ -1140,7 +1140,7 @@
               <w:lang w:eastAsia="hu-HU"/>
             </w:rPr>
           </w:pPr>
-          <w:hyperlink w:anchor="_Toc223984723" w:history="1">
+          <w:hyperlink w:anchor="_Toc224136690" w:history="1">
             <w:r>
               <w:rPr>
                 <w:rStyle w:val="Hiperhivatkozs"/>
@@ -1167,7 +1167,7 @@
                 <w:noProof/>
                 <w:webHidden/>
               </w:rPr>
-              <w:instrText xml:space="preserve"> PAGEREF _Toc223984723 \h </w:instrText>
+              <w:instrText xml:space="preserve"> PAGEREF _Toc224136690 \h </w:instrText>
             </w:r>
             <w:r>
               <w:rPr>
@@ -1210,7 +1210,7 @@
               <w:lang w:eastAsia="hu-HU"/>
             </w:rPr>
           </w:pPr>
-          <w:hyperlink w:anchor="_Toc223984724" w:history="1">
+          <w:hyperlink w:anchor="_Toc224136691" w:history="1">
             <w:r>
               <w:rPr>
                 <w:rStyle w:val="Hiperhivatkozs"/>
@@ -1238,7 +1238,7 @@
                 <w:noProof/>
                 <w:webHidden/>
               </w:rPr>
-              <w:instrText xml:space="preserve"> PAGEREF _Toc223984724 \h </w:instrText>
+              <w:instrText xml:space="preserve"> PAGEREF _Toc224136691 \h </w:instrText>
             </w:r>
             <w:r>
               <w:rPr>
@@ -1281,7 +1281,7 @@
               <w:lang w:eastAsia="hu-HU"/>
             </w:rPr>
           </w:pPr>
-          <w:hyperlink w:anchor="_Toc223984725" w:history="1">
+          <w:hyperlink w:anchor="_Toc224136692" w:history="1">
             <w:r>
               <w:rPr>
                 <w:rStyle w:val="Hiperhivatkozs"/>
@@ -1309,7 +1309,7 @@
                 <w:noProof/>
                 <w:webHidden/>
               </w:rPr>
-              <w:instrText xml:space="preserve"> PAGEREF _Toc223984725 \h </w:instrText>
+              <w:instrText xml:space="preserve"> PAGEREF _Toc224136692 \h </w:instrText>
             </w:r>
             <w:r>
               <w:rPr>
@@ -1352,7 +1352,7 @@
               <w:lang w:eastAsia="hu-HU"/>
             </w:rPr>
           </w:pPr>
-          <w:hyperlink w:anchor="_Toc223984726" w:history="1">
+          <w:hyperlink w:anchor="_Toc224136693" w:history="1">
             <w:r>
               <w:rPr>
                 <w:rStyle w:val="Hiperhivatkozs"/>
@@ -1379,7 +1379,7 @@
                 <w:noProof/>
                 <w:webHidden/>
               </w:rPr>
-              <w:instrText xml:space="preserve"> PAGEREF _Toc223984726 \h </w:instrText>
+              <w:instrText xml:space="preserve"> PAGEREF _Toc224136693 \h </w:instrText>
             </w:r>
             <w:r>
               <w:rPr>
@@ -1422,7 +1422,7 @@
               <w:lang w:eastAsia="hu-HU"/>
             </w:rPr>
           </w:pPr>
-          <w:hyperlink w:anchor="_Toc223984727" w:history="1">
+          <w:hyperlink w:anchor="_Toc224136694" w:history="1">
             <w:r>
               <w:rPr>
                 <w:rStyle w:val="Hiperhivatkozs"/>
@@ -1449,7 +1449,7 @@
                 <w:noProof/>
                 <w:webHidden/>
               </w:rPr>
-              <w:instrText xml:space="preserve"> PAGEREF _Toc223984727 \h </w:instrText>
+              <w:instrText xml:space="preserve"> PAGEREF _Toc224136694 \h </w:instrText>
             </w:r>
             <w:r>
               <w:rPr>
@@ -1492,7 +1492,7 @@
               <w:lang w:eastAsia="hu-HU"/>
             </w:rPr>
           </w:pPr>
-          <w:hyperlink w:anchor="_Toc223984728" w:history="1">
+          <w:hyperlink w:anchor="_Toc224136695" w:history="1">
             <w:r>
               <w:rPr>
                 <w:rStyle w:val="Hiperhivatkozs"/>
@@ -1519,7 +1519,7 @@
                 <w:noProof/>
                 <w:webHidden/>
               </w:rPr>
-              <w:instrText xml:space="preserve"> PAGEREF _Toc223984728 \h </w:instrText>
+              <w:instrText xml:space="preserve"> PAGEREF _Toc224136695 \h </w:instrText>
             </w:r>
             <w:r>
               <w:rPr>
@@ -1562,7 +1562,7 @@
               <w:lang w:eastAsia="hu-HU"/>
             </w:rPr>
           </w:pPr>
-          <w:hyperlink w:anchor="_Toc223984729" w:history="1">
+          <w:hyperlink w:anchor="_Toc224136696" w:history="1">
             <w:r>
               <w:rPr>
                 <w:rStyle w:val="Hiperhivatkozs"/>
@@ -1597,7 +1597,7 @@
                 <w:noProof/>
                 <w:webHidden/>
               </w:rPr>
-              <w:instrText xml:space="preserve"> PAGEREF _Toc223984729 \h </w:instrText>
+              <w:instrText xml:space="preserve"> PAGEREF _Toc224136696 \h </w:instrText>
             </w:r>
             <w:r>
               <w:rPr>
@@ -1640,7 +1640,7 @@
               <w:lang w:eastAsia="hu-HU"/>
             </w:rPr>
           </w:pPr>
-          <w:hyperlink w:anchor="_Toc223984730" w:history="1">
+          <w:hyperlink w:anchor="_Toc224136697" w:history="1">
             <w:r>
               <w:rPr>
                 <w:rStyle w:val="Hiperhivatkozs"/>
@@ -1667,7 +1667,79 @@
                 <w:noProof/>
                 <w:webHidden/>
               </w:rPr>
-              <w:instrText xml:space="preserve"> PAGEREF _Toc223984730 \h </w:instrText>
+              <w:instrText xml:space="preserve"> PAGEREF _Toc224136697 \h </w:instrText>
+            </w:r>
+            <w:r>
+              <w:rPr>
+                <w:noProof/>
+                <w:webHidden/>
+              </w:rPr>
+            </w:r>
+            <w:r>
+              <w:rPr>
+                <w:noProof/>
+                <w:webHidden/>
+              </w:rPr>
+              <w:fldChar w:fldCharType="separate"/>
+            </w:r>
+            <w:r>
+              <w:rPr>
+                <w:noProof/>
+                <w:webHidden/>
+              </w:rPr>
+              <w:t>8</w:t>
+            </w:r>
+            <w:r>
+              <w:rPr>
+                <w:noProof/>
+                <w:webHidden/>
+              </w:rPr>
+              <w:fldChar w:fldCharType="end"/>
+            </w:r>
+          </w:hyperlink>
+        </w:p>
+        <w:p>
+          <w:pPr>
+            <w:pStyle w:val="TJ3"/>
+            <w:tabs>
+              <w:tab w:val="right" w:leader="dot" w:pos="9062"/>
+            </w:tabs>
+            <w:rPr>
+              <w:rFonts w:eastAsiaTheme="minorEastAsia"/>
+              <w:noProof/>
+              <w:lang w:eastAsia="hu-HU"/>
+            </w:rPr>
+          </w:pPr>
+          <w:hyperlink w:anchor="_Toc224136698" w:history="1">
+            <w:r>
+              <w:rPr>
+                <w:rStyle w:val="Hiperhivatkozs"/>
+                <w:rFonts w:eastAsia="Times New Roman"/>
+                <w:noProof/>
+                <w:lang w:eastAsia="hu-HU"/>
+              </w:rPr>
+              <w:t>2.7.1 Fő konfigurációs értékek</w:t>
+            </w:r>
+            <w:r>
+              <w:rPr>
+                <w:noProof/>
+                <w:webHidden/>
+              </w:rPr>
+              <w:tab/>
+            </w:r>
+            <w:r>
+              <w:rPr>
+                <w:noProof/>
+                <w:webHidden/>
+              </w:rPr>
+              <w:fldChar w:fldCharType="begin"/>
+            </w:r>
+            <w:r>
+              <w:rPr>
+                <w:noProof/>
+                <w:webHidden/>
+              </w:rPr>
+              <w:instrText xml:space="preserve"> PAGEREF _Toc224136698 \h </w:instrText>
             </w:r>
             <w:r>
               <w:rPr>
@@ -1738,7 +1810,7 @@
           <w:rFonts w:cstheme="minorHAnsi"/>
         </w:rPr>
       </w:pPr>
-      <w:bookmarkStart w:id="1" w:name="_Toc223984709"/>
+      <w:bookmarkStart w:id="1" w:name="_Toc224136676"/>
       <w:r>
         <w:rPr>
           <w:rFonts w:cstheme="minorHAnsi"/>
@@ -1758,7 +1830,7 @@
           <w:rFonts w:asciiTheme="minorHAnsi" w:hAnsiTheme="minorHAnsi"/>
         </w:rPr>
       </w:pPr>
-      <w:bookmarkStart w:id="2" w:name="_Toc223984710"/>
+      <w:bookmarkStart w:id="2" w:name="_Toc224136677"/>
       <w:r>
         <w:rPr>
           <w:rStyle w:val="Cmsor2Char"/>
@@ -1814,7 +1886,7 @@
         <w:pStyle w:val="Cmsor2"/>
         <w:jc w:val="both"/>
       </w:pPr>
-      <w:bookmarkStart w:id="3" w:name="_Toc223984711"/>
+      <w:bookmarkStart w:id="3" w:name="_Toc224136678"/>
       <w:r>
         <w:rPr>
           <w:rStyle w:val="Kiemels2"/>
@@ -1900,7 +1972,7 @@
         <w:pStyle w:val="Cmsor2"/>
         <w:jc w:val="both"/>
       </w:pPr>
-      <w:bookmarkStart w:id="4" w:name="_Toc223984712"/>
+      <w:bookmarkStart w:id="4" w:name="_Toc224136679"/>
       <w:r>
         <w:rPr>
           <w:rStyle w:val="Kiemels2"/>
@@ -1934,7 +2006,7 @@
           <w:rFonts w:cstheme="minorHAnsi"/>
         </w:rPr>
       </w:pPr>
-      <w:bookmarkStart w:id="5" w:name="_Toc223984713"/>
+      <w:bookmarkStart w:id="5" w:name="_Toc224136680"/>
       <w:r>
         <w:rPr>
           <w:rStyle w:val="Cmsor2Char"/>
@@ -1965,7 +2037,7 @@
         <w:pStyle w:val="Cmsor3"/>
         <w:jc w:val="both"/>
       </w:pPr>
-      <w:bookmarkStart w:id="6" w:name="_Toc223984714"/>
+      <w:bookmarkStart w:id="6" w:name="_Toc224136681"/>
       <w:r>
         <w:t>1.4.1 Tarcsányi Csongor Márk feladatai</w:t>
       </w:r>
@@ -2109,7 +2181,7 @@
         <w:pStyle w:val="Cmsor3"/>
         <w:jc w:val="both"/>
       </w:pPr>
-      <w:bookmarkStart w:id="7" w:name="_Toc223984715"/>
+      <w:bookmarkStart w:id="7" w:name="_Toc224136682"/>
       <w:r>
         <w:t>1.4.2 Lőrincz Antal feladatai</w:t>
       </w:r>
@@ -2184,7 +2256,7 @@
         <w:pStyle w:val="Cmsor3"/>
         <w:jc w:val="both"/>
       </w:pPr>
-      <w:bookmarkStart w:id="8" w:name="_Toc223984716"/>
+      <w:bookmarkStart w:id="8" w:name="_Toc224136683"/>
       <w:r>
         <w:lastRenderedPageBreak/>
         <w:t>1.4.3 Le Tuan Anh (Róbert) feladatai</w:t>
@@ -2290,7 +2362,7 @@
         <w:pStyle w:val="Cmsor3"/>
         <w:jc w:val="both"/>
       </w:pPr>
-      <w:bookmarkStart w:id="9" w:name="_Toc223984717"/>
+      <w:bookmarkStart w:id="9" w:name="_Toc224136684"/>
       <w:r>
         <w:t>1.4.4 Közös fejlesztések</w:t>
       </w:r>
@@ -2366,7 +2438,7 @@
         <w:pStyle w:val="Cmsor2"/>
         <w:jc w:val="both"/>
       </w:pPr>
-      <w:bookmarkStart w:id="10" w:name="_Toc223984718"/>
+      <w:bookmarkStart w:id="10" w:name="_Toc224136685"/>
       <w:r>
         <w:t>1.5 Szükséges adatok a megvalósításhoz</w:t>
       </w:r>
@@ -2505,7 +2577,7 @@
         </w:rPr>
       </w:pPr>
       <w:bookmarkStart w:id="11" w:name="_Toc223536920"/>
-      <w:bookmarkStart w:id="12" w:name="_Toc223984719"/>
+      <w:bookmarkStart w:id="12" w:name="_Toc224136686"/>
       <w:r>
         <w:rPr>
           <w:rFonts w:cstheme="minorHAnsi"/>
@@ -2523,7 +2595,7 @@
         <w:jc w:val="both"/>
       </w:pPr>
       <w:bookmarkStart w:id="13" w:name="_Toc223536921"/>
-      <w:bookmarkStart w:id="14" w:name="_Toc223984720"/>
+      <w:bookmarkStart w:id="14" w:name="_Toc224136687"/>
       <w:r>
         <w:t>2.1 Alkalmazás áttekintés</w:t>
       </w:r>
@@ -2571,7 +2643,7 @@
         <w:jc w:val="both"/>
       </w:pPr>
       <w:bookmarkStart w:id="15" w:name="_Toc223536922"/>
-      <w:bookmarkStart w:id="16" w:name="_Toc223984721"/>
+      <w:bookmarkStart w:id="16" w:name="_Toc224136688"/>
       <w:r>
         <w:t>2.2 Felhasznált szoftverek</w:t>
       </w:r>
@@ -2818,7 +2890,7 @@
         <w:jc w:val="both"/>
       </w:pPr>
       <w:bookmarkStart w:id="17" w:name="_Toc223536923"/>
-      <w:bookmarkStart w:id="18" w:name="_Toc223984722"/>
+      <w:bookmarkStart w:id="18" w:name="_Toc224136689"/>
       <w:r>
         <w:t>2.3 Github</w:t>
       </w:r>
@@ -2849,7 +2921,7 @@
         <w:jc w:val="both"/>
       </w:pPr>
       <w:bookmarkStart w:id="19" w:name="_Toc223536924"/>
-      <w:bookmarkStart w:id="20" w:name="_Toc223984723"/>
+      <w:bookmarkStart w:id="20" w:name="_Toc224136690"/>
       <w:r>
         <w:t>2.4 Fő funkciók</w:t>
       </w:r>
@@ -3017,7 +3089,7 @@
         </w:rPr>
       </w:pPr>
       <w:bookmarkStart w:id="21" w:name="_Toc223536925"/>
-      <w:bookmarkStart w:id="22" w:name="_Toc223984724"/>
+      <w:bookmarkStart w:id="22" w:name="_Toc224136691"/>
       <w:r>
         <w:rPr>
           <w:rFonts w:eastAsia="Arial"/>
@@ -3055,7 +3127,7 @@
         </w:rPr>
       </w:pPr>
       <w:bookmarkStart w:id="23" w:name="_Toc223536926"/>
-      <w:bookmarkStart w:id="24" w:name="_Toc223984725"/>
+      <w:bookmarkStart w:id="24" w:name="_Toc224136692"/>
       <w:r>
         <w:rPr>
           <w:rFonts w:eastAsia="Arial"/>
@@ -3987,7 +4059,7 @@
       <w:pPr>
         <w:pStyle w:val="Cmsor3"/>
       </w:pPr>
-      <w:bookmarkStart w:id="25" w:name="_Toc223984726"/>
+      <w:bookmarkStart w:id="25" w:name="_Toc224136693"/>
       <w:r>
         <w:t>2.5.2 Enrollments tábla (Beiratkozások)</w:t>
       </w:r>
@@ -4350,7 +4422,7 @@
       <w:pPr>
         <w:pStyle w:val="Cmsor3"/>
       </w:pPr>
-      <w:bookmarkStart w:id="26" w:name="_Toc223984727"/>
+      <w:bookmarkStart w:id="26" w:name="_Toc224136694"/>
       <w:r>
         <w:lastRenderedPageBreak/>
         <w:t>2.5.3 Subjects tábla (Tantárgyak)</w:t>
@@ -4902,7 +4974,7 @@
       <w:pPr>
         <w:pStyle w:val="Cmsor3"/>
       </w:pPr>
-      <w:bookmarkStart w:id="27" w:name="_Toc223984728"/>
+      <w:bookmarkStart w:id="27" w:name="_Toc224136695"/>
       <w:r>
         <w:t>2.5.4 ScheduleEntries tábla (Órarend)</w:t>
       </w:r>
@@ -5807,7 +5879,7 @@
       <w:pPr>
         <w:pStyle w:val="Cmsor3"/>
       </w:pPr>
-      <w:bookmarkStart w:id="28" w:name="_Toc223984729"/>
+      <w:bookmarkStart w:id="28" w:name="_Toc224136696"/>
       <w:r>
         <w:t xml:space="preserve">2.5.5 </w:t>
       </w:r>
@@ -6215,7 +6287,7 @@
         <w:jc w:val="both"/>
       </w:pPr>
       <w:bookmarkStart w:id="29" w:name="_Toc223536933"/>
-      <w:bookmarkStart w:id="30" w:name="_Toc223984730"/>
+      <w:bookmarkStart w:id="30" w:name="_Toc224136697"/>
       <w:r>
         <w:t>2</w:t>
       </w:r>
@@ -7536,6 +7608,7 @@
         </w:rPr>
       </w:pPr>
       <w:bookmarkStart w:id="31" w:name="_Toc223536934"/>
+      <w:bookmarkStart w:id="32" w:name="_Toc224136698"/>
       <w:r>
         <w:rPr>
           <w:rFonts w:eastAsia="Times New Roman"/>
@@ -7550,7 +7623,10 @@
         </w:rPr>
         <w:t xml:space="preserve"> Fő konfigurációs értékek</w:t>
       </w:r>
+      <w:bookmarkStart w:id="33" w:name="_GoBack"/>
       <w:bookmarkEnd w:id="31"/>
+      <w:bookmarkEnd w:id="32"/>
+      <w:bookmarkEnd w:id="33"/>
     </w:p>
     <w:p>
       <w:pPr>
@@ -7594,17 +7670,266 @@
         </w:rPr>
         <w:t xml:space="preserve"> fájlban találhatók.</w:t>
       </w:r>
-      <w:bookmarkStart w:id="32" w:name="_GoBack"/>
-      <w:bookmarkEnd w:id="32"/>
     </w:p>
     <w:p>
       <w:pPr>
-        <w:pStyle w:val="NormlWeb"/>
+        <w:numPr>
+          <w:ilvl w:val="0"/>
+          <w:numId w:val="25"/>
+        </w:numPr>
+        <w:spacing w:before="100" w:beforeAutospacing="1" w:after="100" w:afterAutospacing="1" w:line="240" w:lineRule="auto"/>
         <w:jc w:val="both"/>
         <w:rPr>
-          <w:rFonts w:asciiTheme="minorHAnsi" w:hAnsiTheme="minorHAnsi" w:cstheme="minorHAnsi"/>
-        </w:rPr>
-      </w:pPr>
+          <w:rFonts w:eastAsia="Times New Roman" w:cstheme="minorHAnsi"/>
+          <w:sz w:val="24"/>
+          <w:szCs w:val="24"/>
+          <w:lang w:eastAsia="hu-HU"/>
+        </w:rPr>
+      </w:pPr>
+      <w:proofErr w:type="spellStart"/>
+      <w:proofErr w:type="gramStart"/>
+      <w:r>
+        <w:rPr>
+          <w:rFonts w:eastAsia="Times New Roman" w:cstheme="minorHAnsi"/>
+          <w:sz w:val="24"/>
+          <w:szCs w:val="24"/>
+          <w:lang w:eastAsia="hu-HU"/>
+        </w:rPr>
+        <w:t>ConnectionStrings:DefaultConnection</w:t>
+      </w:r>
+      <w:proofErr w:type="spellEnd"/>
+      <w:proofErr w:type="gramEnd"/>
+      <w:r>
+        <w:rPr>
+          <w:rFonts w:eastAsia="Times New Roman" w:cstheme="minorHAnsi"/>
+          <w:sz w:val="24"/>
+          <w:szCs w:val="24"/>
+          <w:lang w:eastAsia="hu-HU"/>
+        </w:rPr>
+        <w:t xml:space="preserve"> – SQL Server kapcsolati </w:t>
+      </w:r>
+      <w:proofErr w:type="spellStart"/>
+      <w:r>
+        <w:rPr>
+          <w:rFonts w:eastAsia="Times New Roman" w:cstheme="minorHAnsi"/>
+          <w:sz w:val="24"/>
+          <w:szCs w:val="24"/>
+          <w:lang w:eastAsia="hu-HU"/>
+        </w:rPr>
+        <w:t>sztring</w:t>
+      </w:r>
+      <w:proofErr w:type="spellEnd"/>
+    </w:p>
+    <w:p>
+      <w:pPr>
+        <w:numPr>
+          <w:ilvl w:val="0"/>
+          <w:numId w:val="25"/>
+        </w:numPr>
+        <w:spacing w:before="100" w:beforeAutospacing="1" w:after="100" w:afterAutospacing="1" w:line="240" w:lineRule="auto"/>
+        <w:jc w:val="both"/>
+        <w:rPr>
+          <w:rFonts w:eastAsia="Times New Roman" w:cstheme="minorHAnsi"/>
+          <w:sz w:val="24"/>
+          <w:szCs w:val="24"/>
+          <w:lang w:eastAsia="hu-HU"/>
+        </w:rPr>
+      </w:pPr>
+      <w:proofErr w:type="spellStart"/>
+      <w:proofErr w:type="gramStart"/>
+      <w:r>
+        <w:rPr>
+          <w:rFonts w:eastAsia="Times New Roman" w:cstheme="minorHAnsi"/>
+          <w:sz w:val="24"/>
+          <w:szCs w:val="24"/>
+          <w:lang w:eastAsia="hu-HU"/>
+        </w:rPr>
+        <w:t>Jwt:Key</w:t>
+      </w:r>
+      <w:proofErr w:type="spellEnd"/>
+      <w:proofErr w:type="gramEnd"/>
+      <w:r>
+        <w:rPr>
+          <w:rFonts w:eastAsia="Times New Roman" w:cstheme="minorHAnsi"/>
+          <w:sz w:val="24"/>
+          <w:szCs w:val="24"/>
+          <w:lang w:eastAsia="hu-HU"/>
+        </w:rPr>
+        <w:t xml:space="preserve"> – JWT aláíráshoz használt titkos kulcs (minimum 32 karakter)</w:t>
+      </w:r>
+    </w:p>
+    <w:p>
+      <w:pPr>
+        <w:numPr>
+          <w:ilvl w:val="0"/>
+          <w:numId w:val="25"/>
+        </w:numPr>
+        <w:spacing w:before="100" w:beforeAutospacing="1" w:after="100" w:afterAutospacing="1" w:line="240" w:lineRule="auto"/>
+        <w:jc w:val="both"/>
+        <w:rPr>
+          <w:rFonts w:eastAsia="Times New Roman" w:cstheme="minorHAnsi"/>
+          <w:sz w:val="24"/>
+          <w:szCs w:val="24"/>
+          <w:lang w:eastAsia="hu-HU"/>
+        </w:rPr>
+      </w:pPr>
+      <w:proofErr w:type="spellStart"/>
+      <w:proofErr w:type="gramStart"/>
+      <w:r>
+        <w:rPr>
+          <w:rFonts w:eastAsia="Times New Roman" w:cstheme="minorHAnsi"/>
+          <w:sz w:val="24"/>
+          <w:szCs w:val="24"/>
+          <w:lang w:eastAsia="hu-HU"/>
+        </w:rPr>
+        <w:t>Jwt:Issuer</w:t>
+      </w:r>
+      <w:proofErr w:type="spellEnd"/>
+      <w:proofErr w:type="gramEnd"/>
+      <w:r>
+        <w:rPr>
+          <w:rFonts w:eastAsia="Times New Roman" w:cstheme="minorHAnsi"/>
+          <w:sz w:val="24"/>
+          <w:szCs w:val="24"/>
+          <w:lang w:eastAsia="hu-HU"/>
+        </w:rPr>
+        <w:t xml:space="preserve"> – A </w:t>
+      </w:r>
+      <w:proofErr w:type="spellStart"/>
+      <w:r>
+        <w:rPr>
+          <w:rFonts w:eastAsia="Times New Roman" w:cstheme="minorHAnsi"/>
+          <w:sz w:val="24"/>
+          <w:szCs w:val="24"/>
+          <w:lang w:eastAsia="hu-HU"/>
+        </w:rPr>
+        <w:t>token</w:t>
+      </w:r>
+      <w:proofErr w:type="spellEnd"/>
+      <w:r>
+        <w:rPr>
+          <w:rFonts w:eastAsia="Times New Roman" w:cstheme="minorHAnsi"/>
+          <w:sz w:val="24"/>
+          <w:szCs w:val="24"/>
+          <w:lang w:eastAsia="hu-HU"/>
+        </w:rPr>
+        <w:t xml:space="preserve"> kibocsátójának neve</w:t>
+      </w:r>
+    </w:p>
+    <w:p>
+      <w:pPr>
+        <w:numPr>
+          <w:ilvl w:val="0"/>
+          <w:numId w:val="25"/>
+        </w:numPr>
+        <w:spacing w:before="100" w:beforeAutospacing="1" w:after="100" w:afterAutospacing="1" w:line="240" w:lineRule="auto"/>
+        <w:jc w:val="both"/>
+        <w:rPr>
+          <w:rFonts w:eastAsia="Times New Roman" w:cstheme="minorHAnsi"/>
+          <w:sz w:val="24"/>
+          <w:szCs w:val="24"/>
+          <w:lang w:eastAsia="hu-HU"/>
+        </w:rPr>
+      </w:pPr>
+      <w:proofErr w:type="spellStart"/>
+      <w:proofErr w:type="gramStart"/>
+      <w:r>
+        <w:rPr>
+          <w:rFonts w:eastAsia="Times New Roman" w:cstheme="minorHAnsi"/>
+          <w:sz w:val="24"/>
+          <w:szCs w:val="24"/>
+          <w:lang w:eastAsia="hu-HU"/>
+        </w:rPr>
+        <w:lastRenderedPageBreak/>
+        <w:t>Jwt:ExpiryInMinutes</w:t>
+      </w:r>
+      <w:proofErr w:type="spellEnd"/>
+      <w:proofErr w:type="gramEnd"/>
+      <w:r>
+        <w:rPr>
+          <w:rFonts w:eastAsia="Times New Roman" w:cstheme="minorHAnsi"/>
+          <w:sz w:val="24"/>
+          <w:szCs w:val="24"/>
+          <w:lang w:eastAsia="hu-HU"/>
+        </w:rPr>
+        <w:t xml:space="preserve"> – </w:t>
+      </w:r>
+      <w:proofErr w:type="spellStart"/>
+      <w:r>
+        <w:rPr>
+          <w:rFonts w:eastAsia="Times New Roman" w:cstheme="minorHAnsi"/>
+          <w:sz w:val="24"/>
+          <w:szCs w:val="24"/>
+          <w:lang w:eastAsia="hu-HU"/>
+        </w:rPr>
+        <w:t>Token</w:t>
+      </w:r>
+      <w:proofErr w:type="spellEnd"/>
+      <w:r>
+        <w:rPr>
+          <w:rFonts w:eastAsia="Times New Roman" w:cstheme="minorHAnsi"/>
+          <w:sz w:val="24"/>
+          <w:szCs w:val="24"/>
+          <w:lang w:eastAsia="hu-HU"/>
+        </w:rPr>
+        <w:t xml:space="preserve"> lejárati ideje percben</w:t>
+      </w:r>
+    </w:p>
+    <w:p>
+      <w:pPr>
+        <w:numPr>
+          <w:ilvl w:val="0"/>
+          <w:numId w:val="25"/>
+        </w:numPr>
+        <w:spacing w:before="100" w:beforeAutospacing="1" w:after="100" w:afterAutospacing="1" w:line="240" w:lineRule="auto"/>
+        <w:jc w:val="both"/>
+        <w:rPr>
+          <w:rFonts w:eastAsia="Times New Roman" w:cstheme="minorHAnsi"/>
+          <w:sz w:val="24"/>
+          <w:szCs w:val="24"/>
+          <w:lang w:eastAsia="hu-HU"/>
+        </w:rPr>
+      </w:pPr>
+      <w:proofErr w:type="spellStart"/>
+      <w:r>
+        <w:rPr>
+          <w:rFonts w:eastAsia="Times New Roman" w:cstheme="minorHAnsi"/>
+          <w:sz w:val="24"/>
+          <w:szCs w:val="24"/>
+          <w:lang w:eastAsia="hu-HU"/>
+        </w:rPr>
+        <w:t>AllowedHosts</w:t>
+      </w:r>
+      <w:proofErr w:type="spellEnd"/>
+      <w:r>
+        <w:rPr>
+          <w:rFonts w:eastAsia="Times New Roman" w:cstheme="minorHAnsi"/>
+          <w:sz w:val="24"/>
+          <w:szCs w:val="24"/>
+          <w:lang w:eastAsia="hu-HU"/>
+        </w:rPr>
+        <w:t xml:space="preserve"> – Engedélyezett </w:t>
+      </w:r>
+      <w:proofErr w:type="spellStart"/>
+      <w:r>
+        <w:rPr>
+          <w:rFonts w:eastAsia="Times New Roman" w:cstheme="minorHAnsi"/>
+          <w:sz w:val="24"/>
+          <w:szCs w:val="24"/>
+          <w:lang w:eastAsia="hu-HU"/>
+        </w:rPr>
+        <w:t>host</w:t>
+      </w:r>
+      <w:proofErr w:type="spellEnd"/>
+      <w:r>
+        <w:rPr>
+          <w:rFonts w:eastAsia="Times New Roman" w:cstheme="minorHAnsi"/>
+          <w:sz w:val="24"/>
+          <w:szCs w:val="24"/>
+          <w:lang w:eastAsia="hu-HU"/>
+        </w:rPr>
+        <w:t xml:space="preserve"> nevek</w:t>
+      </w:r>
     </w:p>
     <w:sectPr>
       <w:headerReference w:type="default" r:id="rId8"/>
@@ -8031,6 +8356,155 @@
     </w:lvl>
   </w:abstractNum>
   <w:abstractNum w:abstractNumId="2" w15:restartNumberingAfterBreak="0">
+    <w:nsid w:val="234829CD"/>
+    <w:multiLevelType w:val="multilevel"/>
+    <w:tmpl w:val="94202478"/>
+    <w:lvl w:ilvl="0">
+      <w:start w:val="1"/>
+      <w:numFmt w:val="bullet"/>
+      <w:lvlText w:val=""/>
+      <w:lvlJc w:val="left"/>
+      <w:pPr>
+        <w:tabs>
+          <w:tab w:val="num" w:pos="720"/>
+        </w:tabs>
+        <w:ind w:left="720" w:hanging="360"/>
+      </w:pPr>
+      <w:rPr>
+        <w:rFonts w:ascii="Symbol" w:hAnsi="Symbol" w:hint="default"/>
+        <w:sz w:val="20"/>
+      </w:rPr>
+    </w:lvl>
+    <w:lvl w:ilvl="1" w:tentative="1">
+      <w:start w:val="1"/>
+      <w:numFmt w:val="bullet"/>
+      <w:lvlText w:val="o"/>
+      <w:lvlJc w:val="left"/>
+      <w:pPr>
+        <w:tabs>
+          <w:tab w:val="num" w:pos="1440"/>
+        </w:tabs>
+        <w:ind w:left="1440" w:hanging="360"/>
+      </w:pPr>
+      <w:rPr>
+        <w:rFonts w:ascii="Courier New" w:hAnsi="Courier New" w:hint="default"/>
+        <w:sz w:val="20"/>
+      </w:rPr>
+    </w:lvl>
+    <w:lvl w:ilvl="2" w:tentative="1">
+      <w:start w:val="1"/>
+      <w:numFmt w:val="bullet"/>
+      <w:lvlText w:val=""/>
+      <w:lvlJc w:val="left"/>
+      <w:pPr>
+        <w:tabs>
+          <w:tab w:val="num" w:pos="2160"/>
+        </w:tabs>
+        <w:ind w:left="2160" w:hanging="360"/>
+      </w:pPr>
+      <w:rPr>
+        <w:rFonts w:ascii="Wingdings" w:hAnsi="Wingdings" w:hint="default"/>
+        <w:sz w:val="20"/>
+      </w:rPr>
+    </w:lvl>
+    <w:lvl w:ilvl="3" w:tentative="1">
+      <w:start w:val="1"/>
+      <w:numFmt w:val="bullet"/>
+      <w:lvlText w:val=""/>
+      <w:lvlJc w:val="left"/>
+      <w:pPr>
+        <w:tabs>
+          <w:tab w:val="num" w:pos="2880"/>
+        </w:tabs>
+        <w:ind w:left="2880" w:hanging="360"/>
+      </w:pPr>
+      <w:rPr>
+        <w:rFonts w:ascii="Wingdings" w:hAnsi="Wingdings" w:hint="default"/>
+        <w:sz w:val="20"/>
+      </w:rPr>
+    </w:lvl>
+    <w:lvl w:ilvl="4" w:tentative="1">
+      <w:start w:val="1"/>
+      <w:numFmt w:val="bullet"/>
+      <w:lvlText w:val=""/>
+      <w:lvlJc w:val="left"/>
+      <w:pPr>
+        <w:tabs>
+          <w:tab w:val="num" w:pos="3600"/>
+        </w:tabs>
+        <w:ind w:left="3600" w:hanging="360"/>
+      </w:pPr>
+      <w:rPr>
+        <w:rFonts w:ascii="Wingdings" w:hAnsi="Wingdings" w:hint="default"/>
+        <w:sz w:val="20"/>
+      </w:rPr>
+    </w:lvl>
+    <w:lvl w:ilvl="5" w:tentative="1">
+      <w:start w:val="1"/>
+      <w:numFmt w:val="bullet"/>
+      <w:lvlText w:val=""/>
+      <w:lvlJc w:val="left"/>
+      <w:pPr>
+        <w:tabs>
+          <w:tab w:val="num" w:pos="4320"/>
+        </w:tabs>
+        <w:ind w:left="4320" w:hanging="360"/>
+      </w:pPr>
+      <w:rPr>
+        <w:rFonts w:ascii="Wingdings" w:hAnsi="Wingdings" w:hint="default"/>
+        <w:sz w:val="20"/>
+      </w:rPr>
+    </w:lvl>
+    <w:lvl w:ilvl="6" w:tentative="1">
+      <w:start w:val="1"/>
+      <w:numFmt w:val="bullet"/>
+      <w:lvlText w:val=""/>
+      <w:lvlJc w:val="left"/>
+      <w:pPr>
+        <w:tabs>
+          <w:tab w:val="num" w:pos="5040"/>
+        </w:tabs>
+        <w:ind w:left="5040" w:hanging="360"/>
+      </w:pPr>
+      <w:rPr>
+        <w:rFonts w:ascii="Wingdings" w:hAnsi="Wingdings" w:hint="default"/>
+        <w:sz w:val="20"/>
+      </w:rPr>
+    </w:lvl>
+    <w:lvl w:ilvl="7" w:tentative="1">
+      <w:start w:val="1"/>
+      <w:numFmt w:val="bullet"/>
+      <w:lvlText w:val=""/>
+      <w:lvlJc w:val="left"/>
+      <w:pPr>
+        <w:tabs>
+          <w:tab w:val="num" w:pos="5760"/>
+        </w:tabs>
+        <w:ind w:left="5760" w:hanging="360"/>
+      </w:pPr>
+      <w:rPr>
+        <w:rFonts w:ascii="Wingdings" w:hAnsi="Wingdings" w:hint="default"/>
+        <w:sz w:val="20"/>
+      </w:rPr>
+    </w:lvl>
+    <w:lvl w:ilvl="8" w:tentative="1">
+      <w:start w:val="1"/>
+      <w:numFmt w:val="bullet"/>
+      <w:lvlText w:val=""/>
+      <w:lvlJc w:val="left"/>
+      <w:pPr>
+        <w:tabs>
+          <w:tab w:val="num" w:pos="6480"/>
+        </w:tabs>
+        <w:ind w:left="6480" w:hanging="360"/>
+      </w:pPr>
+      <w:rPr>
+        <w:rFonts w:ascii="Wingdings" w:hAnsi="Wingdings" w:hint="default"/>
+        <w:sz w:val="20"/>
+      </w:rPr>
+    </w:lvl>
+  </w:abstractNum>
+  <w:abstractNum w:abstractNumId="3" w15:restartNumberingAfterBreak="0">
     <w:nsid w:val="24AD2811"/>
     <w:multiLevelType w:val="multilevel"/>
     <w:tmpl w:val="99B8CB94"/>
@@ -8179,7 +8653,7 @@
       </w:rPr>
     </w:lvl>
   </w:abstractNum>
-  <w:abstractNum w:abstractNumId="3" w15:restartNumberingAfterBreak="0">
+  <w:abstractNum w:abstractNumId="4" w15:restartNumberingAfterBreak="0">
     <w:nsid w:val="276D2882"/>
     <w:multiLevelType w:val="hybridMultilevel"/>
     <w:tmpl w:val="5936DB9A"/>
@@ -8292,7 +8766,7 @@
       </w:rPr>
     </w:lvl>
   </w:abstractNum>
-  <w:abstractNum w:abstractNumId="4" w15:restartNumberingAfterBreak="0">
+  <w:abstractNum w:abstractNumId="5" w15:restartNumberingAfterBreak="0">
     <w:nsid w:val="2FBE3652"/>
     <w:multiLevelType w:val="hybridMultilevel"/>
     <w:tmpl w:val="6CAC7AA8"/>
@@ -8405,7 +8879,7 @@
       </w:rPr>
     </w:lvl>
   </w:abstractNum>
-  <w:abstractNum w:abstractNumId="5" w15:restartNumberingAfterBreak="0">
+  <w:abstractNum w:abstractNumId="6" w15:restartNumberingAfterBreak="0">
     <w:nsid w:val="339E7D8A"/>
     <w:multiLevelType w:val="multilevel"/>
     <w:tmpl w:val="0C7C55C0"/>
@@ -8549,7 +9023,7 @@
       </w:rPr>
     </w:lvl>
   </w:abstractNum>
-  <w:abstractNum w:abstractNumId="6" w15:restartNumberingAfterBreak="0">
+  <w:abstractNum w:abstractNumId="7" w15:restartNumberingAfterBreak="0">
     <w:nsid w:val="33E46D80"/>
     <w:multiLevelType w:val="multilevel"/>
     <w:tmpl w:val="237CCB3C"/>
@@ -8698,7 +9172,7 @@
       </w:rPr>
     </w:lvl>
   </w:abstractNum>
-  <w:abstractNum w:abstractNumId="7" w15:restartNumberingAfterBreak="0">
+  <w:abstractNum w:abstractNumId="8" w15:restartNumberingAfterBreak="0">
     <w:nsid w:val="3D7E3E61"/>
     <w:multiLevelType w:val="multilevel"/>
     <w:tmpl w:val="80687D62"/>
@@ -8847,7 +9321,7 @@
       </w:rPr>
     </w:lvl>
   </w:abstractNum>
-  <w:abstractNum w:abstractNumId="8" w15:restartNumberingAfterBreak="0">
+  <w:abstractNum w:abstractNumId="9" w15:restartNumberingAfterBreak="0">
     <w:nsid w:val="41D84FB3"/>
     <w:multiLevelType w:val="multilevel"/>
     <w:tmpl w:val="B8E0DE96"/>
@@ -8996,7 +9470,7 @@
       </w:rPr>
     </w:lvl>
   </w:abstractNum>
-  <w:abstractNum w:abstractNumId="9" w15:restartNumberingAfterBreak="0">
+  <w:abstractNum w:abstractNumId="10" w15:restartNumberingAfterBreak="0">
     <w:nsid w:val="45697FE6"/>
     <w:multiLevelType w:val="multilevel"/>
     <w:tmpl w:val="C8087F1A"/>
@@ -9145,7 +9619,7 @@
       </w:rPr>
     </w:lvl>
   </w:abstractNum>
-  <w:abstractNum w:abstractNumId="10" w15:restartNumberingAfterBreak="0">
+  <w:abstractNum w:abstractNumId="11" w15:restartNumberingAfterBreak="0">
     <w:nsid w:val="45DC415F"/>
     <w:multiLevelType w:val="multilevel"/>
     <w:tmpl w:val="6D80672A"/>
@@ -9294,7 +9768,7 @@
       </w:rPr>
     </w:lvl>
   </w:abstractNum>
-  <w:abstractNum w:abstractNumId="11" w15:restartNumberingAfterBreak="0">
+  <w:abstractNum w:abstractNumId="12" w15:restartNumberingAfterBreak="0">
     <w:nsid w:val="492B3058"/>
     <w:multiLevelType w:val="hybridMultilevel"/>
     <w:tmpl w:val="BC78F1C6"/>
@@ -9407,7 +9881,7 @@
       </w:rPr>
     </w:lvl>
   </w:abstractNum>
-  <w:abstractNum w:abstractNumId="12" w15:restartNumberingAfterBreak="0">
+  <w:abstractNum w:abstractNumId="13" w15:restartNumberingAfterBreak="0">
     <w:nsid w:val="4AD1090B"/>
     <w:multiLevelType w:val="multilevel"/>
     <w:tmpl w:val="3C5C03A8"/>
@@ -9520,7 +9994,7 @@
       </w:pPr>
     </w:lvl>
   </w:abstractNum>
-  <w:abstractNum w:abstractNumId="13" w15:restartNumberingAfterBreak="0">
+  <w:abstractNum w:abstractNumId="14" w15:restartNumberingAfterBreak="0">
     <w:nsid w:val="4C7206C0"/>
     <w:multiLevelType w:val="multilevel"/>
     <w:tmpl w:val="56E85BDC"/>
@@ -9669,7 +10143,7 @@
       </w:rPr>
     </w:lvl>
   </w:abstractNum>
-  <w:abstractNum w:abstractNumId="14" w15:restartNumberingAfterBreak="0">
+  <w:abstractNum w:abstractNumId="15" w15:restartNumberingAfterBreak="0">
     <w:nsid w:val="568036E5"/>
     <w:multiLevelType w:val="hybridMultilevel"/>
     <w:tmpl w:val="441EBD9E"/>
@@ -9782,7 +10256,7 @@
       </w:rPr>
     </w:lvl>
   </w:abstractNum>
-  <w:abstractNum w:abstractNumId="15" w15:restartNumberingAfterBreak="0">
+  <w:abstractNum w:abstractNumId="16" w15:restartNumberingAfterBreak="0">
     <w:nsid w:val="574E1AC7"/>
     <w:multiLevelType w:val="multilevel"/>
     <w:tmpl w:val="1B0CE38E"/>
@@ -9931,7 +10405,7 @@
       </w:rPr>
     </w:lvl>
   </w:abstractNum>
-  <w:abstractNum w:abstractNumId="16" w15:restartNumberingAfterBreak="0">
+  <w:abstractNum w:abstractNumId="17" w15:restartNumberingAfterBreak="0">
     <w:nsid w:val="58805E15"/>
     <w:multiLevelType w:val="multilevel"/>
     <w:tmpl w:val="4B9AB750"/>
@@ -10080,7 +10554,7 @@
       </w:rPr>
     </w:lvl>
   </w:abstractNum>
-  <w:abstractNum w:abstractNumId="17" w15:restartNumberingAfterBreak="0">
+  <w:abstractNum w:abstractNumId="18" w15:restartNumberingAfterBreak="0">
     <w:nsid w:val="5CAA1D03"/>
     <w:multiLevelType w:val="hybridMultilevel"/>
     <w:tmpl w:val="6F2EA4CA"/>
@@ -10193,7 +10667,7 @@
       </w:rPr>
     </w:lvl>
   </w:abstractNum>
-  <w:abstractNum w:abstractNumId="18" w15:restartNumberingAfterBreak="0">
+  <w:abstractNum w:abstractNumId="19" w15:restartNumberingAfterBreak="0">
     <w:nsid w:val="5E303001"/>
     <w:multiLevelType w:val="multilevel"/>
     <w:tmpl w:val="CBBEF68E"/>
@@ -10342,7 +10816,7 @@
       </w:rPr>
     </w:lvl>
   </w:abstractNum>
-  <w:abstractNum w:abstractNumId="19" w15:restartNumberingAfterBreak="0">
+  <w:abstractNum w:abstractNumId="20" w15:restartNumberingAfterBreak="0">
     <w:nsid w:val="639B7CF0"/>
     <w:multiLevelType w:val="multilevel"/>
     <w:tmpl w:val="D15AF8DC"/>
@@ -10491,7 +10965,7 @@
       </w:rPr>
     </w:lvl>
   </w:abstractNum>
-  <w:abstractNum w:abstractNumId="20" w15:restartNumberingAfterBreak="0">
+  <w:abstractNum w:abstractNumId="21" w15:restartNumberingAfterBreak="0">
     <w:nsid w:val="68387B9B"/>
     <w:multiLevelType w:val="hybridMultilevel"/>
     <w:tmpl w:val="888CD8EC"/>
@@ -10604,7 +11078,7 @@
       </w:rPr>
     </w:lvl>
   </w:abstractNum>
-  <w:abstractNum w:abstractNumId="21" w15:restartNumberingAfterBreak="0">
+  <w:abstractNum w:abstractNumId="22" w15:restartNumberingAfterBreak="0">
     <w:nsid w:val="68694670"/>
     <w:multiLevelType w:val="multilevel"/>
     <w:tmpl w:val="F2261E2C"/>
@@ -10753,7 +11227,7 @@
       </w:rPr>
     </w:lvl>
   </w:abstractNum>
-  <w:abstractNum w:abstractNumId="22" w15:restartNumberingAfterBreak="0">
+  <w:abstractNum w:abstractNumId="23" w15:restartNumberingAfterBreak="0">
     <w:nsid w:val="740E15C0"/>
     <w:multiLevelType w:val="hybridMultilevel"/>
     <w:tmpl w:val="C39AA4DE"/>
@@ -10866,7 +11340,7 @@
       </w:rPr>
     </w:lvl>
   </w:abstractNum>
-  <w:abstractNum w:abstractNumId="23" w15:restartNumberingAfterBreak="0">
+  <w:abstractNum w:abstractNumId="24" w15:restartNumberingAfterBreak="0">
     <w:nsid w:val="76410018"/>
     <w:multiLevelType w:val="hybridMultilevel"/>
     <w:tmpl w:val="B310E846"/>
@@ -10980,76 +11454,79 @@
     </w:lvl>
   </w:abstractNum>
   <w:num w:numId="1">
+    <w:abstractNumId w:val="11"/>
+  </w:num>
+  <w:num w:numId="2">
+    <w:abstractNumId w:val="12"/>
+  </w:num>
+  <w:num w:numId="3">
+    <w:abstractNumId w:val="15"/>
+  </w:num>
+  <w:num w:numId="4">
+    <w:abstractNumId w:val="21"/>
+  </w:num>
+  <w:num w:numId="5">
+    <w:abstractNumId w:val="4"/>
+  </w:num>
+  <w:num w:numId="6">
+    <w:abstractNumId w:val="8"/>
+  </w:num>
+  <w:num w:numId="7">
+    <w:abstractNumId w:val="6"/>
+  </w:num>
+  <w:num w:numId="8">
+    <w:abstractNumId w:val="7"/>
+  </w:num>
+  <w:num w:numId="9">
+    <w:abstractNumId w:val="3"/>
+  </w:num>
+  <w:num w:numId="10">
+    <w:abstractNumId w:val="13"/>
+  </w:num>
+  <w:num w:numId="11">
+    <w:abstractNumId w:val="14"/>
+  </w:num>
+  <w:num w:numId="12">
     <w:abstractNumId w:val="10"/>
   </w:num>
-  <w:num w:numId="2">
-    <w:abstractNumId w:val="11"/>
+  <w:num w:numId="13">
+    <w:abstractNumId w:val="16"/>
   </w:num>
-  <w:num w:numId="3">
-    <w:abstractNumId w:val="14"/>
+  <w:num w:numId="14">
+    <w:abstractNumId w:val="9"/>
   </w:num>
-  <w:num w:numId="4">
+  <w:num w:numId="15">
+    <w:abstractNumId w:val="22"/>
+  </w:num>
+  <w:num w:numId="16">
     <w:abstractNumId w:val="20"/>
   </w:num>
-  <w:num w:numId="5">
-    <w:abstractNumId w:val="3"/>
-  </w:num>
-  <w:num w:numId="6">
-    <w:abstractNumId w:val="7"/>
-  </w:num>
-  <w:num w:numId="7">
-    <w:abstractNumId w:val="5"/>
-  </w:num>
-  <w:num w:numId="8">
-    <w:abstractNumId w:val="6"/>
-  </w:num>
-  <w:num w:numId="9">
-    <w:abstractNumId w:val="2"/>
-  </w:num>
-  <w:num w:numId="10">
-    <w:abstractNumId w:val="12"/>
-  </w:num>
-  <w:num w:numId="11">
-    <w:abstractNumId w:val="13"/>
-  </w:num>
-  <w:num w:numId="12">
-    <w:abstractNumId w:val="9"/>
-  </w:num>
-  <w:num w:numId="13">
-    <w:abstractNumId w:val="15"/>
-  </w:num>
-  <w:num w:numId="14">
-    <w:abstractNumId w:val="8"/>
-  </w:num>
-  <w:num w:numId="15">
-    <w:abstractNumId w:val="21"/>
-  </w:num>
-  <w:num w:numId="16">
+  <w:num w:numId="17">
     <w:abstractNumId w:val="19"/>
-  </w:num>
-  <w:num w:numId="17">
-    <w:abstractNumId w:val="18"/>
   </w:num>
   <w:num w:numId="18">
     <w:abstractNumId w:val="1"/>
   </w:num>
   <w:num w:numId="19">
-    <w:abstractNumId w:val="16"/>
+    <w:abstractNumId w:val="17"/>
   </w:num>
   <w:num w:numId="20">
     <w:abstractNumId w:val="0"/>
   </w:num>
   <w:num w:numId="21">
-    <w:abstractNumId w:val="22"/>
+    <w:abstractNumId w:val="23"/>
   </w:num>
   <w:num w:numId="22">
-    <w:abstractNumId w:val="4"/>
+    <w:abstractNumId w:val="5"/>
   </w:num>
   <w:num w:numId="23">
-    <w:abstractNumId w:val="17"/>
+    <w:abstractNumId w:val="18"/>
   </w:num>
   <w:num w:numId="24">
-    <w:abstractNumId w:val="23"/>
+    <w:abstractNumId w:val="24"/>
+  </w:num>
+  <w:num w:numId="25">
+    <w:abstractNumId w:val="2"/>
   </w:num>
 </w:numbering>
 </file>
@@ -11985,6 +12462,7 @@
     <w:rsid w:val="00B66DEA"/>
     <w:rsid w:val="00BB1830"/>
     <w:rsid w:val="00C001EB"/>
+    <w:rsid w:val="00C75435"/>
     <w:rsid w:val="00CC2121"/>
     <w:rsid w:val="00D229FD"/>
     <w:rsid w:val="00D609F3"/>
@@ -12751,7 +13229,7 @@
 </file>
 
 <file path=customXml/itemProps1.xml><?xml version="1.0" encoding="utf-8"?>
-<ds:datastoreItem xmlns:ds="http://schemas.openxmlformats.org/officeDocument/2006/customXml" ds:itemID="{44EBBA12-EF48-4E76-A4B7-EAAFCDEA2881}">
+<ds:datastoreItem xmlns:ds="http://schemas.openxmlformats.org/officeDocument/2006/customXml" ds:itemID="{A739A0CA-5232-4062-A76F-7239CFBA3A62}">
   <ds:schemaRefs>
     <ds:schemaRef ds:uri="http://schemas.openxmlformats.org/officeDocument/2006/bibliography"/>
   </ds:schemaRefs>

</xml_diff>